<commit_message>
Diretrizes V21.3 + correcao auditoria callout
</commit_message>
<xml_diff>
--- a/notebooks/quarto_pdf/relatorio_investidores.docx
+++ b/notebooks/quarto_pdf/relatorio_investidores.docx
@@ -8238,7 +8238,7 @@
       </w:r>
     </w:p>
     <w:bookmarkEnd w:id="181"/>
-    <w:bookmarkStart w:id="255" w:name="pagina3"/>
+    <w:bookmarkStart w:id="258" w:name="pagina3"/>
     <w:bookmarkStart w:id="183" w:name="pagina3-1"/>
     <w:bookmarkStart w:id="182" w:name="página-3-análise-financeira-1"/>
     <w:p>
@@ -9701,8 +9701,169 @@
       </w:tr>
     </w:tbl>
     <w:bookmarkEnd w:id="199"/>
-    <w:bookmarkStart w:id="201" w:name="pagina3-12"/>
-    <w:bookmarkStart w:id="200" w:name="decomposição-da-dre-m36"/>
+    <w:bookmarkStart w:id="202" w:name="pagina3-12"/>
+    <w:tbl>
+      <w:tblPr>
+        <w:tblStyle w:val="Table"/>
+        <w:tblLook w:firstRow="0" w:lastRow="0" w:firstColumn="0" w:lastColumn="0" w:noHBand="0" w:noVBand="0" w:val="0000"/>
+        <w:tblBorders>
+          <w:top w:val="single" w:sz="4" w:space="0" w:color="0758E5"/>
+          <w:left w:val="single" w:sz="24" w:space="0" w:color="0758E5"/>
+          <w:bottom w:val="single" w:sz="4" w:space="0" w:color="0758E5"/>
+          <w:right w:val="single" w:sz="4" w:space="0" w:color="0758E5"/>
+        </w:tblBorders>
+        <w:tblCellMar>
+          <w:left w:w="144" w:type="dxa"/>
+          <w:right w:w="144" w:type="dxa"/>
+        </w:tblCellMar>
+        <w:tblLook w:firstRow="0" w:lastRow="0" w:firstColumn="0" w:lastColumn="0" w:noHBand="0" w:noVBand="0" w:val="0000"/>
+      </w:tblPr>
+      <w:tr>
+        <w:trPr>
+          <w:cantSplit/>
+        </w:trPr>
+        <w:tc>
+          <w:tcPr>
+            <w:shd w:color="auto" w:fill="dae6fb" w:val="clear"/>
+            <w:tcMar>
+              <w:top w:w="92" w:type="dxa"/>
+              <w:bottom w:w="92" w:type="dxa"/>
+            </w:tcMar>
+          </w:tcPr>
+          <w:p>
+            <w:pPr>
+              <w:pStyle w:val="FirstParagraph"/>
+            </w:pPr>
+            <w:pPr>
+              <w:spacing w:before="0" w:after="0"/>
+              <w:textAlignment w:val="center"/>
+            </w:pPr>
+            <w:r>
+              <w:drawing>
+                <wp:inline>
+                  <wp:extent cx="152400" cy="152400"/>
+                  <wp:effectExtent b="0" l="0" r="0" t="0"/>
+                  <wp:docPr descr="" title="" id="200" name="Picture"/>
+                  <a:graphic>
+                    <a:graphicData uri="http://schemas.openxmlformats.org/drawingml/2006/picture">
+                      <pic:pic>
+                        <pic:nvPicPr>
+                          <pic:cNvPr descr="C:\Users\User\AppData\Local\Programs\Quarto\share\formats\docx\note.png" id="201" name="Picture"/>
+                          <pic:cNvPicPr>
+                            <a:picLocks noChangeArrowheads="1" noChangeAspect="1"/>
+                          </pic:cNvPicPr>
+                        </pic:nvPicPr>
+                        <pic:blipFill>
+                          <a:blip r:embed="rId64"/>
+                          <a:stretch>
+                            <a:fillRect/>
+                          </a:stretch>
+                        </pic:blipFill>
+                        <pic:spPr bwMode="auto">
+                          <a:xfrm>
+                            <a:off x="0" y="0"/>
+                            <a:ext cx="152400" cy="152400"/>
+                          </a:xfrm>
+                          <a:prstGeom prst="rect">
+                            <a:avLst/>
+                          </a:prstGeom>
+                          <a:noFill/>
+                          <a:ln w="9525">
+                            <a:noFill/>
+                            <a:headEnd/>
+                            <a:tailEnd/>
+                          </a:ln>
+                        </pic:spPr>
+                      </pic:pic>
+                    </a:graphicData>
+                  </a:graphic>
+                </wp:inline>
+              </w:drawing>
+            </w:r>
+            <w:r>
+              <w:t xml:space="preserve"> </w:t>
+            </w:r>
+            <w:r>
+              <w:t xml:space="preserve"> </w:t>
+            </w:r>
+            <w:r>
+              <w:t xml:space="preserve">Auditoria VIZ 3.1</w:t>
+            </w:r>
+          </w:p>
+        </w:tc>
+      </w:tr>
+      <w:tr>
+        <w:trPr>
+          <w:cantSplit/>
+        </w:trPr>
+        <w:tc>
+          <w:tcPr>
+            <w:tcMar>
+              <w:top w:w="108" w:type="dxa"/>
+              <w:bottom w:w="108" w:type="dxa"/>
+            </w:tcMar>
+          </w:tcPr>
+          <w:p>
+            <w:pPr>
+              <w:pStyle w:val="BodyText"/>
+            </w:pPr>
+            <w:pPr>
+              <w:spacing w:before="16"/>
+            </w:pPr>
+            <w:r>
+              <w:rPr>
+                <w:b/>
+                <w:bCs/>
+              </w:rPr>
+              <w:t xml:space="preserve">Fonte:</w:t>
+            </w:r>
+            <w:r>
+              <w:t xml:space="preserve"> </w:t>
+            </w:r>
+            <w:r>
+              <w:t xml:space="preserve">df_real_m (Celula 5A), df_ideal_m (Celula 5B)</w:t>
+            </w:r>
+          </w:p>
+          <w:p>
+            <w:pPr>
+              <w:pStyle w:val="BodyText"/>
+            </w:pPr>
+            <w:pPr>
+              <w:spacing w:after="16"/>
+            </w:pPr>
+            <w:r>
+              <w:rPr>
+                <w:b/>
+                <w:bCs/>
+              </w:rPr>
+              <w:t xml:space="preserve">Formulas:</w:t>
+            </w:r>
+            <w:r>
+              <w:t xml:space="preserve"> </w:t>
+            </w:r>
+            <w:r>
+              <w:t xml:space="preserve">- Break-even = Primeiro mes onde EBITDA maior que 0</w:t>
+            </w:r>
+            <w:r>
+              <w:t xml:space="preserve"> </w:t>
+            </w:r>
+            <w:r>
+              <w:t xml:space="preserve">- Gap = Mes break-even Real - Mes break-even Ideal</w:t>
+            </w:r>
+            <w:r>
+              <w:t xml:space="preserve"> </w:t>
+            </w:r>
+            <w:r>
+              <w:t xml:space="preserve">- Reducao Burn = (Burn M1 - Burn M36) / Burn M1 x 100</w:t>
+            </w:r>
+          </w:p>
+          <w:p/>
+        </w:tc>
+      </w:tr>
+    </w:tbl>
+    <w:bookmarkEnd w:id="202"/>
+    <w:bookmarkStart w:id="204" w:name="pagina3-13"/>
+    <w:bookmarkStart w:id="203" w:name="decomposição-da-dre-m36"/>
     <w:p>
       <w:pPr>
         <w:pStyle w:val="Heading3"/>
@@ -9711,9 +9872,9 @@
         <w:t xml:space="preserve">📊 DECOMPOSIÇÃO DA DRE (M36)</w:t>
       </w:r>
     </w:p>
-    <w:bookmarkEnd w:id="200"/>
-    <w:bookmarkEnd w:id="201"/>
-    <w:bookmarkStart w:id="202" w:name="pagina3-13"/>
+    <w:bookmarkEnd w:id="203"/>
+    <w:bookmarkEnd w:id="204"/>
+    <w:bookmarkStart w:id="205" w:name="pagina3-14"/>
     <w:tbl>
       <w:tblPr>
         <w:tblStyle w:val="Table"/>
@@ -10130,31 +10291,31 @@
         </w:tc>
       </w:tr>
     </w:tbl>
-    <w:bookmarkEnd w:id="202"/>
-    <w:bookmarkStart w:id="203" w:name="pagina3-14"/>
-    <w:bookmarkEnd w:id="203"/>
+    <w:bookmarkEnd w:id="205"/>
+    <w:bookmarkStart w:id="206" w:name="pagina3-15"/>
+    <w:bookmarkEnd w:id="206"/>
     <w:p>
       <w:pPr>
         <w:pStyle w:val="BodyText"/>
       </w:pPr>
-      <w:bookmarkStart w:id="207" w:name="pagina3-15"/>
+      <w:bookmarkStart w:id="210" w:name="pagina3-16"/>
       <w:r>
         <w:drawing>
           <wp:inline>
             <wp:extent cx="5334000" cy="2755002"/>
             <wp:effectExtent b="0" l="0" r="0" t="0"/>
-            <wp:docPr descr="" title="" id="205" name="Picture"/>
+            <wp:docPr descr="" title="" id="208" name="Picture"/>
             <a:graphic>
               <a:graphicData uri="http://schemas.openxmlformats.org/drawingml/2006/picture">
                 <pic:pic>
                   <pic:nvPicPr>
-                    <pic:cNvPr descr="relatorio_investidores_files/figure-docx/pagina3-output-15.png" id="206" name="Picture"/>
+                    <pic:cNvPr descr="relatorio_investidores_files/figure-docx/pagina3-output-16.png" id="209" name="Picture"/>
                     <pic:cNvPicPr>
                       <a:picLocks noChangeArrowheads="1" noChangeAspect="1"/>
                     </pic:cNvPicPr>
                   </pic:nvPicPr>
                   <pic:blipFill>
-                    <a:blip r:embed="rId204"/>
+                    <a:blip r:embed="rId207"/>
                     <a:stretch>
                       <a:fillRect/>
                     </a:stretch>
@@ -10180,9 +10341,9 @@
           </wp:inline>
         </w:drawing>
       </w:r>
-      <w:bookmarkEnd w:id="207"/>
+      <w:bookmarkEnd w:id="210"/>
     </w:p>
-    <w:bookmarkStart w:id="208" w:name="pagina3-16"/>
+    <w:bookmarkStart w:id="211" w:name="pagina3-17"/>
     <w:p>
       <w:pPr>
         <w:pStyle w:val="BodyText"/>
@@ -10283,9 +10444,9 @@
         <w:t xml:space="preserve">Barra final deve ser verde e representar &gt;20% da receita</w:t>
       </w:r>
     </w:p>
-    <w:bookmarkEnd w:id="208"/>
-    <w:bookmarkStart w:id="210" w:name="pagina3-17"/>
-    <w:bookmarkStart w:id="209" w:name="breakdown-detalhado-de-custos-m36"/>
+    <w:bookmarkEnd w:id="211"/>
+    <w:bookmarkStart w:id="213" w:name="pagina3-18"/>
+    <w:bookmarkStart w:id="212" w:name="breakdown-detalhado-de-custos-m36"/>
     <w:p>
       <w:pPr>
         <w:pStyle w:val="Heading3"/>
@@ -10294,9 +10455,9 @@
         <w:t xml:space="preserve">💰 BREAKDOWN DETALHADO DE CUSTOS (M36)</w:t>
       </w:r>
     </w:p>
-    <w:bookmarkEnd w:id="209"/>
-    <w:bookmarkEnd w:id="210"/>
-    <w:bookmarkStart w:id="211" w:name="pagina3-18"/>
+    <w:bookmarkEnd w:id="212"/>
+    <w:bookmarkEnd w:id="213"/>
+    <w:bookmarkStart w:id="214" w:name="pagina3-19"/>
     <w:p>
       <w:pPr>
         <w:pStyle w:val="FirstParagraph"/>
@@ -10309,8 +10470,8 @@
         <w:t xml:space="preserve">Decomposição completa de COGS e OPEX por canal/categoria.</w:t>
       </w:r>
     </w:p>
-    <w:bookmarkEnd w:id="211"/>
-    <w:bookmarkStart w:id="212" w:name="pagina3-19"/>
+    <w:bookmarkEnd w:id="214"/>
+    <w:bookmarkStart w:id="215" w:name="pagina3-20"/>
     <w:tbl>
       <w:tblPr>
         <w:tblStyle w:val="Table"/>
@@ -11125,31 +11286,31 @@
         </w:tc>
       </w:tr>
     </w:tbl>
-    <w:bookmarkEnd w:id="212"/>
-    <w:bookmarkStart w:id="213" w:name="pagina3-20"/>
-    <w:bookmarkEnd w:id="213"/>
+    <w:bookmarkEnd w:id="215"/>
+    <w:bookmarkStart w:id="216" w:name="pagina3-21"/>
+    <w:bookmarkEnd w:id="216"/>
     <w:p>
       <w:pPr>
         <w:pStyle w:val="BodyText"/>
       </w:pPr>
-      <w:bookmarkStart w:id="217" w:name="pagina3-21"/>
+      <w:bookmarkStart w:id="220" w:name="pagina3-22"/>
       <w:r>
         <w:drawing>
           <wp:inline>
             <wp:extent cx="5334000" cy="2845295"/>
             <wp:effectExtent b="0" l="0" r="0" t="0"/>
-            <wp:docPr descr="" title="" id="215" name="Picture"/>
+            <wp:docPr descr="" title="" id="218" name="Picture"/>
             <a:graphic>
               <a:graphicData uri="http://schemas.openxmlformats.org/drawingml/2006/picture">
                 <pic:pic>
                   <pic:nvPicPr>
-                    <pic:cNvPr descr="relatorio_investidores_files/figure-docx/pagina3-output-21.png" id="216" name="Picture"/>
+                    <pic:cNvPr descr="relatorio_investidores_files/figure-docx/pagina3-output-22.png" id="219" name="Picture"/>
                     <pic:cNvPicPr>
                       <a:picLocks noChangeArrowheads="1" noChangeAspect="1"/>
                     </pic:cNvPicPr>
                   </pic:nvPicPr>
                   <pic:blipFill>
-                    <a:blip r:embed="rId214"/>
+                    <a:blip r:embed="rId217"/>
                     <a:stretch>
                       <a:fillRect/>
                     </a:stretch>
@@ -11175,11 +11336,11 @@
           </wp:inline>
         </w:drawing>
       </w:r>
-      <w:bookmarkEnd w:id="217"/>
+      <w:bookmarkEnd w:id="220"/>
     </w:p>
-    <w:bookmarkStart w:id="218" w:name="pagina3-22"/>
-    <w:bookmarkEnd w:id="218"/>
     <w:bookmarkStart w:id="221" w:name="pagina3-23"/>
+    <w:bookmarkEnd w:id="221"/>
+    <w:bookmarkStart w:id="224" w:name="pagina3-24"/>
     <w:tbl>
       <w:tblPr>
         <w:tblStyle w:val="Table"/>
@@ -11221,12 +11382,12 @@
                 <wp:inline>
                   <wp:extent cx="152400" cy="152400"/>
                   <wp:effectExtent b="0" l="0" r="0" t="0"/>
-                  <wp:docPr descr="" title="" id="219" name="Picture"/>
+                  <wp:docPr descr="" title="" id="222" name="Picture"/>
                   <a:graphic>
                     <a:graphicData uri="http://schemas.openxmlformats.org/drawingml/2006/picture">
                       <pic:pic>
                         <pic:nvPicPr>
-                          <pic:cNvPr descr="C:\Users\User\AppData\Local\Programs\Quarto\share\formats\docx\tip.png" id="220" name="Picture"/>
+                          <pic:cNvPr descr="C:\Users\User\AppData\Local\Programs\Quarto\share\formats\docx\tip.png" id="223" name="Picture"/>
                           <pic:cNvPicPr>
                             <a:picLocks noChangeArrowheads="1" noChangeAspect="1"/>
                           </pic:cNvPicPr>
@@ -11373,29 +11534,29 @@
         </w:tc>
       </w:tr>
     </w:tbl>
-    <w:bookmarkEnd w:id="221"/>
+    <w:bookmarkEnd w:id="224"/>
     <w:p>
       <w:pPr>
         <w:pStyle w:val="FirstParagraph"/>
       </w:pPr>
-      <w:bookmarkStart w:id="225" w:name="pagina3-24"/>
+      <w:bookmarkStart w:id="228" w:name="pagina3-25"/>
       <w:r>
         <w:drawing>
           <wp:inline>
             <wp:extent cx="5334000" cy="2755002"/>
             <wp:effectExtent b="0" l="0" r="0" t="0"/>
-            <wp:docPr descr="" title="" id="223" name="Picture"/>
+            <wp:docPr descr="" title="" id="226" name="Picture"/>
             <a:graphic>
               <a:graphicData uri="http://schemas.openxmlformats.org/drawingml/2006/picture">
                 <pic:pic>
                   <pic:nvPicPr>
-                    <pic:cNvPr descr="relatorio_investidores_files/figure-docx/pagina3-output-24.png" id="224" name="Picture"/>
+                    <pic:cNvPr descr="relatorio_investidores_files/figure-docx/pagina3-output-25.png" id="227" name="Picture"/>
                     <pic:cNvPicPr>
                       <a:picLocks noChangeArrowheads="1" noChangeAspect="1"/>
                     </pic:cNvPicPr>
                   </pic:nvPicPr>
                   <pic:blipFill>
-                    <a:blip r:embed="rId222"/>
+                    <a:blip r:embed="rId225"/>
                     <a:stretch>
                       <a:fillRect/>
                     </a:stretch>
@@ -11421,9 +11582,9 @@
           </wp:inline>
         </w:drawing>
       </w:r>
-      <w:bookmarkEnd w:id="225"/>
+      <w:bookmarkEnd w:id="228"/>
     </w:p>
-    <w:bookmarkStart w:id="226" w:name="pagina3-25"/>
+    <w:bookmarkStart w:id="229" w:name="pagina3-26"/>
     <w:p>
       <w:pPr>
         <w:pStyle w:val="BodyText"/>
@@ -11568,8 +11729,8 @@
         <w:t xml:space="preserve">Manter caixa sempre acima da linha vermelha</w:t>
       </w:r>
     </w:p>
-    <w:bookmarkEnd w:id="226"/>
-    <w:bookmarkStart w:id="227" w:name="pagina3-26"/>
+    <w:bookmarkEnd w:id="229"/>
+    <w:bookmarkStart w:id="230" w:name="pagina3-27"/>
     <w:tbl>
       <w:tblPr>
         <w:tblStyle w:val="Table"/>
@@ -12106,8 +12267,8 @@
         </w:tc>
       </w:tr>
     </w:tbl>
-    <w:bookmarkEnd w:id="227"/>
-    <w:bookmarkStart w:id="228" w:name="pagina3-27"/>
+    <w:bookmarkEnd w:id="230"/>
+    <w:bookmarkStart w:id="231" w:name="pagina3-28"/>
     <w:p>
       <w:pPr>
         <w:pStyle w:val="BodyText"/>
@@ -12120,12 +12281,12 @@
         <w:t xml:space="preserve">Fonte: Celulas 5A/5B | df_real_m interpolado para granularidade semanal</w:t>
       </w:r>
     </w:p>
-    <w:bookmarkEnd w:id="228"/>
-    <w:bookmarkStart w:id="229" w:name="pagina3-28"/>
-    <w:bookmarkEnd w:id="229"/>
-    <w:bookmarkStart w:id="230" w:name="pagina3-29"/>
-    <w:bookmarkEnd w:id="230"/>
+    <w:bookmarkEnd w:id="231"/>
+    <w:bookmarkStart w:id="232" w:name="pagina3-29"/>
+    <w:bookmarkEnd w:id="232"/>
     <w:bookmarkStart w:id="233" w:name="pagina3-30"/>
+    <w:bookmarkEnd w:id="233"/>
+    <w:bookmarkStart w:id="236" w:name="pagina3-31"/>
     <w:tbl>
       <w:tblPr>
         <w:tblStyle w:val="Table"/>
@@ -12167,12 +12328,12 @@
                 <wp:inline>
                   <wp:extent cx="152400" cy="152400"/>
                   <wp:effectExtent b="0" l="0" r="0" t="0"/>
-                  <wp:docPr descr="" title="" id="231" name="Picture"/>
+                  <wp:docPr descr="" title="" id="234" name="Picture"/>
                   <a:graphic>
                     <a:graphicData uri="http://schemas.openxmlformats.org/drawingml/2006/picture">
                       <pic:pic>
                         <pic:nvPicPr>
-                          <pic:cNvPr descr="C:\Users\User\AppData\Local\Programs\Quarto\share\formats\docx\warning.png" id="232" name="Picture"/>
+                          <pic:cNvPr descr="C:\Users\User\AppData\Local\Programs\Quarto\share\formats\docx\warning.png" id="235" name="Picture"/>
                           <pic:cNvPicPr>
                             <a:picLocks noChangeArrowheads="1" noChangeAspect="1"/>
                           </pic:cNvPicPr>
@@ -12319,29 +12480,29 @@
         </w:tc>
       </w:tr>
     </w:tbl>
-    <w:bookmarkEnd w:id="233"/>
+    <w:bookmarkEnd w:id="236"/>
     <w:p>
       <w:pPr>
         <w:pStyle w:val="FirstParagraph"/>
       </w:pPr>
-      <w:bookmarkStart w:id="237" w:name="pagina3-31"/>
+      <w:bookmarkStart w:id="240" w:name="pagina3-32"/>
       <w:r>
         <w:drawing>
           <wp:inline>
             <wp:extent cx="5334000" cy="2968924"/>
             <wp:effectExtent b="0" l="0" r="0" t="0"/>
-            <wp:docPr descr="" title="" id="235" name="Picture"/>
+            <wp:docPr descr="" title="" id="238" name="Picture"/>
             <a:graphic>
               <a:graphicData uri="http://schemas.openxmlformats.org/drawingml/2006/picture">
                 <pic:pic>
                   <pic:nvPicPr>
-                    <pic:cNvPr descr="relatorio_investidores_files/figure-docx/pagina3-output-31.png" id="236" name="Picture"/>
+                    <pic:cNvPr descr="relatorio_investidores_files/figure-docx/pagina3-output-32.png" id="239" name="Picture"/>
                     <pic:cNvPicPr>
                       <a:picLocks noChangeArrowheads="1" noChangeAspect="1"/>
                     </pic:cNvPicPr>
                   </pic:nvPicPr>
                   <pic:blipFill>
-                    <a:blip r:embed="rId234"/>
+                    <a:blip r:embed="rId237"/>
                     <a:stretch>
                       <a:fillRect/>
                     </a:stretch>
@@ -12367,9 +12528,9 @@
           </wp:inline>
         </w:drawing>
       </w:r>
-      <w:bookmarkEnd w:id="237"/>
+      <w:bookmarkEnd w:id="240"/>
     </w:p>
-    <w:bookmarkStart w:id="238" w:name="pagina3-32"/>
+    <w:bookmarkStart w:id="241" w:name="pagina3-33"/>
     <w:p>
       <w:pPr>
         <w:pStyle w:val="BodyText"/>
@@ -12536,10 +12697,10 @@
         <w:t xml:space="preserve">Pontos devem subir e entrar na zona verde</w:t>
       </w:r>
     </w:p>
-    <w:bookmarkEnd w:id="238"/>
-    <w:bookmarkStart w:id="239" w:name="pagina3-33"/>
-    <w:bookmarkEnd w:id="239"/>
+    <w:bookmarkEnd w:id="241"/>
     <w:bookmarkStart w:id="242" w:name="pagina3-34"/>
+    <w:bookmarkEnd w:id="242"/>
+    <w:bookmarkStart w:id="245" w:name="pagina3-35"/>
     <w:tbl>
       <w:tblPr>
         <w:tblStyle w:val="Table"/>
@@ -12581,12 +12742,12 @@
                 <wp:inline>
                   <wp:extent cx="152400" cy="152400"/>
                   <wp:effectExtent b="0" l="0" r="0" t="0"/>
-                  <wp:docPr descr="" title="" id="240" name="Picture"/>
+                  <wp:docPr descr="" title="" id="243" name="Picture"/>
                   <a:graphic>
                     <a:graphicData uri="http://schemas.openxmlformats.org/drawingml/2006/picture">
                       <pic:pic>
                         <pic:nvPicPr>
-                          <pic:cNvPr descr="C:\Users\User\AppData\Local\Programs\Quarto\share\formats\docx\tip.png" id="241" name="Picture"/>
+                          <pic:cNvPr descr="C:\Users\User\AppData\Local\Programs\Quarto\share\formats\docx\tip.png" id="244" name="Picture"/>
                           <pic:cNvPicPr>
                             <a:picLocks noChangeArrowheads="1" noChangeAspect="1"/>
                           </pic:cNvPicPr>
@@ -12733,29 +12894,29 @@
         </w:tc>
       </w:tr>
     </w:tbl>
-    <w:bookmarkEnd w:id="242"/>
+    <w:bookmarkEnd w:id="245"/>
     <w:p>
       <w:pPr>
         <w:pStyle w:val="FirstParagraph"/>
       </w:pPr>
-      <w:bookmarkStart w:id="246" w:name="pagina3-35"/>
+      <w:bookmarkStart w:id="249" w:name="pagina3-36"/>
       <w:r>
         <w:drawing>
           <wp:inline>
             <wp:extent cx="5334000" cy="2282594"/>
             <wp:effectExtent b="0" l="0" r="0" t="0"/>
-            <wp:docPr descr="" title="" id="244" name="Picture"/>
+            <wp:docPr descr="" title="" id="247" name="Picture"/>
             <a:graphic>
               <a:graphicData uri="http://schemas.openxmlformats.org/drawingml/2006/picture">
                 <pic:pic>
                   <pic:nvPicPr>
-                    <pic:cNvPr descr="relatorio_investidores_files/figure-docx/pagina3-output-35.png" id="245" name="Picture"/>
+                    <pic:cNvPr descr="relatorio_investidores_files/figure-docx/pagina3-output-36.png" id="248" name="Picture"/>
                     <pic:cNvPicPr>
                       <a:picLocks noChangeArrowheads="1" noChangeAspect="1"/>
                     </pic:cNvPicPr>
                   </pic:nvPicPr>
                   <pic:blipFill>
-                    <a:blip r:embed="rId243"/>
+                    <a:blip r:embed="rId246"/>
                     <a:stretch>
                       <a:fillRect/>
                     </a:stretch>
@@ -12781,9 +12942,9 @@
           </wp:inline>
         </w:drawing>
       </w:r>
-      <w:bookmarkEnd w:id="246"/>
+      <w:bookmarkEnd w:id="249"/>
     </w:p>
-    <w:bookmarkStart w:id="247" w:name="pagina3-36"/>
+    <w:bookmarkStart w:id="250" w:name="pagina3-37"/>
     <w:p>
       <w:pPr>
         <w:pStyle w:val="BodyText"/>
@@ -12984,10 +13145,10 @@
         <w:t xml:space="preserve">.</w:t>
       </w:r>
     </w:p>
-    <w:bookmarkEnd w:id="247"/>
-    <w:bookmarkStart w:id="248" w:name="pagina3-37"/>
-    <w:bookmarkEnd w:id="248"/>
+    <w:bookmarkEnd w:id="250"/>
     <w:bookmarkStart w:id="251" w:name="pagina3-38"/>
+    <w:bookmarkEnd w:id="251"/>
+    <w:bookmarkStart w:id="254" w:name="pagina3-39"/>
     <w:tbl>
       <w:tblPr>
         <w:tblStyle w:val="Table"/>
@@ -13029,12 +13190,12 @@
                 <wp:inline>
                   <wp:extent cx="152400" cy="152400"/>
                   <wp:effectExtent b="0" l="0" r="0" t="0"/>
-                  <wp:docPr descr="" title="" id="249" name="Picture"/>
+                  <wp:docPr descr="" title="" id="252" name="Picture"/>
                   <a:graphic>
                     <a:graphicData uri="http://schemas.openxmlformats.org/drawingml/2006/picture">
                       <pic:pic>
                         <pic:nvPicPr>
-                          <pic:cNvPr descr="C:\Users\User\AppData\Local\Programs\Quarto\share\formats\docx\note.png" id="250" name="Picture"/>
+                          <pic:cNvPr descr="C:\Users\User\AppData\Local\Programs\Quarto\share\formats\docx\note.png" id="253" name="Picture"/>
                           <pic:cNvPicPr>
                             <a:picLocks noChangeArrowheads="1" noChangeAspect="1"/>
                           </pic:cNvPicPr>
@@ -13181,8 +13342,8 @@
         </w:tc>
       </w:tr>
     </w:tbl>
-    <w:bookmarkEnd w:id="251"/>
-    <w:bookmarkStart w:id="254" w:name="pagina3-39"/>
+    <w:bookmarkEnd w:id="254"/>
+    <w:bookmarkStart w:id="257" w:name="pagina3-40"/>
     <w:tbl>
       <w:tblPr>
         <w:tblStyle w:val="Table"/>
@@ -13224,12 +13385,12 @@
                 <wp:inline>
                   <wp:extent cx="152400" cy="152400"/>
                   <wp:effectExtent b="0" l="0" r="0" t="0"/>
-                  <wp:docPr descr="" title="" id="252" name="Picture"/>
+                  <wp:docPr descr="" title="" id="255" name="Picture"/>
                   <a:graphic>
                     <a:graphicData uri="http://schemas.openxmlformats.org/drawingml/2006/picture">
                       <pic:pic>
                         <pic:nvPicPr>
-                          <pic:cNvPr descr="C:\Users\User\AppData\Local\Programs\Quarto\share\formats\docx\important.png" id="253" name="Picture"/>
+                          <pic:cNvPr descr="C:\Users\User\AppData\Local\Programs\Quarto\share\formats\docx\important.png" id="256" name="Picture"/>
                           <pic:cNvPicPr>
                             <a:picLocks noChangeArrowheads="1" noChangeAspect="1"/>
                           </pic:cNvPicPr>
@@ -13450,8 +13611,8 @@
         </w:tc>
       </w:tr>
     </w:tbl>
-    <w:bookmarkEnd w:id="254"/>
-    <w:bookmarkEnd w:id="255"/>
+    <w:bookmarkEnd w:id="257"/>
+    <w:bookmarkEnd w:id="258"/>
     <w:sectPr>
       <w:footnotePr>
         <w:numRestart w:val="eachSect"/>

</xml_diff>

<commit_message>
Corrigido callouts VIZ 3.2-3.5 + checklist de verificacao
</commit_message>
<xml_diff>
--- a/notebooks/quarto_pdf/relatorio_investidores.docx
+++ b/notebooks/quarto_pdf/relatorio_investidores.docx
@@ -8238,7 +8238,7 @@
       </w:r>
     </w:p>
     <w:bookmarkEnd w:id="181"/>
-    <w:bookmarkStart w:id="258" w:name="pagina3"/>
+    <w:bookmarkStart w:id="270" w:name="pagina3"/>
     <w:bookmarkStart w:id="183" w:name="pagina3-1"/>
     <w:bookmarkStart w:id="182" w:name="página-3-análise-financeira-1"/>
     <w:p>
@@ -11535,28 +11535,189 @@
       </w:tr>
     </w:tbl>
     <w:bookmarkEnd w:id="224"/>
+    <w:bookmarkStart w:id="227" w:name="pagina3-25"/>
+    <w:tbl>
+      <w:tblPr>
+        <w:tblStyle w:val="Table"/>
+        <w:tblLook w:firstRow="0" w:lastRow="0" w:firstColumn="0" w:lastColumn="0" w:noHBand="0" w:noVBand="0" w:val="0000"/>
+        <w:tblBorders>
+          <w:top w:val="single" w:sz="4" w:space="0" w:color="0758E5"/>
+          <w:left w:val="single" w:sz="24" w:space="0" w:color="0758E5"/>
+          <w:bottom w:val="single" w:sz="4" w:space="0" w:color="0758E5"/>
+          <w:right w:val="single" w:sz="4" w:space="0" w:color="0758E5"/>
+        </w:tblBorders>
+        <w:tblCellMar>
+          <w:left w:w="144" w:type="dxa"/>
+          <w:right w:w="144" w:type="dxa"/>
+        </w:tblCellMar>
+        <w:tblLook w:firstRow="0" w:lastRow="0" w:firstColumn="0" w:lastColumn="0" w:noHBand="0" w:noVBand="0" w:val="0000"/>
+      </w:tblPr>
+      <w:tr>
+        <w:trPr>
+          <w:cantSplit/>
+        </w:trPr>
+        <w:tc>
+          <w:tcPr>
+            <w:shd w:color="auto" w:fill="dae6fb" w:val="clear"/>
+            <w:tcMar>
+              <w:top w:w="92" w:type="dxa"/>
+              <w:bottom w:w="92" w:type="dxa"/>
+            </w:tcMar>
+          </w:tcPr>
+          <w:p>
+            <w:pPr>
+              <w:pStyle w:val="FirstParagraph"/>
+            </w:pPr>
+            <w:pPr>
+              <w:spacing w:before="0" w:after="0"/>
+              <w:textAlignment w:val="center"/>
+            </w:pPr>
+            <w:r>
+              <w:drawing>
+                <wp:inline>
+                  <wp:extent cx="152400" cy="152400"/>
+                  <wp:effectExtent b="0" l="0" r="0" t="0"/>
+                  <wp:docPr descr="" title="" id="225" name="Picture"/>
+                  <a:graphic>
+                    <a:graphicData uri="http://schemas.openxmlformats.org/drawingml/2006/picture">
+                      <pic:pic>
+                        <pic:nvPicPr>
+                          <pic:cNvPr descr="C:\Users\User\AppData\Local\Programs\Quarto\share\formats\docx\note.png" id="226" name="Picture"/>
+                          <pic:cNvPicPr>
+                            <a:picLocks noChangeArrowheads="1" noChangeAspect="1"/>
+                          </pic:cNvPicPr>
+                        </pic:nvPicPr>
+                        <pic:blipFill>
+                          <a:blip r:embed="rId64"/>
+                          <a:stretch>
+                            <a:fillRect/>
+                          </a:stretch>
+                        </pic:blipFill>
+                        <pic:spPr bwMode="auto">
+                          <a:xfrm>
+                            <a:off x="0" y="0"/>
+                            <a:ext cx="152400" cy="152400"/>
+                          </a:xfrm>
+                          <a:prstGeom prst="rect">
+                            <a:avLst/>
+                          </a:prstGeom>
+                          <a:noFill/>
+                          <a:ln w="9525">
+                            <a:noFill/>
+                            <a:headEnd/>
+                            <a:tailEnd/>
+                          </a:ln>
+                        </pic:spPr>
+                      </pic:pic>
+                    </a:graphicData>
+                  </a:graphic>
+                </wp:inline>
+              </w:drawing>
+            </w:r>
+            <w:r>
+              <w:t xml:space="preserve"> </w:t>
+            </w:r>
+            <w:r>
+              <w:t xml:space="preserve"> </w:t>
+            </w:r>
+            <w:r>
+              <w:t xml:space="preserve">Auditoria VIZ 3.2</w:t>
+            </w:r>
+          </w:p>
+        </w:tc>
+      </w:tr>
+      <w:tr>
+        <w:trPr>
+          <w:cantSplit/>
+        </w:trPr>
+        <w:tc>
+          <w:tcPr>
+            <w:tcMar>
+              <w:top w:w="108" w:type="dxa"/>
+              <w:bottom w:w="108" w:type="dxa"/>
+            </w:tcMar>
+          </w:tcPr>
+          <w:p>
+            <w:pPr>
+              <w:pStyle w:val="BodyText"/>
+            </w:pPr>
+            <w:pPr>
+              <w:spacing w:before="16"/>
+            </w:pPr>
+            <w:r>
+              <w:rPr>
+                <w:b/>
+                <w:bCs/>
+              </w:rPr>
+              <w:t xml:space="preserve">Fonte:</w:t>
+            </w:r>
+            <w:r>
+              <w:t xml:space="preserve"> </w:t>
+            </w:r>
+            <w:r>
+              <w:t xml:space="preserve">df_real_m.iloc[-1] (M36 da Celula 5A)</w:t>
+            </w:r>
+          </w:p>
+          <w:p>
+            <w:pPr>
+              <w:pStyle w:val="BodyText"/>
+            </w:pPr>
+            <w:pPr>
+              <w:spacing w:after="16"/>
+            </w:pPr>
+            <w:r>
+              <w:rPr>
+                <w:b/>
+                <w:bCs/>
+              </w:rPr>
+              <w:t xml:space="preserve">Formulas:</w:t>
+            </w:r>
+            <w:r>
+              <w:t xml:space="preserve"> </w:t>
+            </w:r>
+            <w:r>
+              <w:t xml:space="preserve">- Margem Bruta = (Receita Liquida - COGS) / Receita Bruta x 100</w:t>
+            </w:r>
+            <w:r>
+              <w:t xml:space="preserve"> </w:t>
+            </w:r>
+            <w:r>
+              <w:t xml:space="preserve">- OPEX pct = Total OPEX / Receita Bruta x 100</w:t>
+            </w:r>
+            <w:r>
+              <w:t xml:space="preserve"> </w:t>
+            </w:r>
+            <w:r>
+              <w:t xml:space="preserve">- Benchmarks: Margem maior 80%, OPEX menor 50%, EBITDA maior 20%</w:t>
+            </w:r>
+          </w:p>
+          <w:p/>
+        </w:tc>
+      </w:tr>
+    </w:tbl>
+    <w:bookmarkEnd w:id="227"/>
     <w:p>
       <w:pPr>
-        <w:pStyle w:val="FirstParagraph"/>
+        <w:pStyle w:val="BodyText"/>
       </w:pPr>
-      <w:bookmarkStart w:id="228" w:name="pagina3-25"/>
+      <w:bookmarkStart w:id="231" w:name="pagina3-26"/>
       <w:r>
         <w:drawing>
           <wp:inline>
             <wp:extent cx="5334000" cy="2755002"/>
             <wp:effectExtent b="0" l="0" r="0" t="0"/>
-            <wp:docPr descr="" title="" id="226" name="Picture"/>
+            <wp:docPr descr="" title="" id="229" name="Picture"/>
             <a:graphic>
               <a:graphicData uri="http://schemas.openxmlformats.org/drawingml/2006/picture">
                 <pic:pic>
                   <pic:nvPicPr>
-                    <pic:cNvPr descr="relatorio_investidores_files/figure-docx/pagina3-output-25.png" id="227" name="Picture"/>
+                    <pic:cNvPr descr="relatorio_investidores_files/figure-docx/pagina3-output-26.png" id="230" name="Picture"/>
                     <pic:cNvPicPr>
                       <a:picLocks noChangeArrowheads="1" noChangeAspect="1"/>
                     </pic:cNvPicPr>
                   </pic:nvPicPr>
                   <pic:blipFill>
-                    <a:blip r:embed="rId225"/>
+                    <a:blip r:embed="rId228"/>
                     <a:stretch>
                       <a:fillRect/>
                     </a:stretch>
@@ -11582,9 +11743,9 @@
           </wp:inline>
         </w:drawing>
       </w:r>
-      <w:bookmarkEnd w:id="228"/>
+      <w:bookmarkEnd w:id="231"/>
     </w:p>
-    <w:bookmarkStart w:id="229" w:name="pagina3-26"/>
+    <w:bookmarkStart w:id="232" w:name="pagina3-27"/>
     <w:p>
       <w:pPr>
         <w:pStyle w:val="BodyText"/>
@@ -11729,8 +11890,8 @@
         <w:t xml:space="preserve">Manter caixa sempre acima da linha vermelha</w:t>
       </w:r>
     </w:p>
-    <w:bookmarkEnd w:id="229"/>
-    <w:bookmarkStart w:id="230" w:name="pagina3-27"/>
+    <w:bookmarkEnd w:id="232"/>
+    <w:bookmarkStart w:id="233" w:name="pagina3-28"/>
     <w:tbl>
       <w:tblPr>
         <w:tblStyle w:val="Table"/>
@@ -12267,8 +12428,8 @@
         </w:tc>
       </w:tr>
     </w:tbl>
-    <w:bookmarkEnd w:id="230"/>
-    <w:bookmarkStart w:id="231" w:name="pagina3-28"/>
+    <w:bookmarkEnd w:id="233"/>
+    <w:bookmarkStart w:id="234" w:name="pagina3-29"/>
     <w:p>
       <w:pPr>
         <w:pStyle w:val="BodyText"/>
@@ -12281,12 +12442,12 @@
         <w:t xml:space="preserve">Fonte: Celulas 5A/5B | df_real_m interpolado para granularidade semanal</w:t>
       </w:r>
     </w:p>
-    <w:bookmarkEnd w:id="231"/>
-    <w:bookmarkStart w:id="232" w:name="pagina3-29"/>
-    <w:bookmarkEnd w:id="232"/>
-    <w:bookmarkStart w:id="233" w:name="pagina3-30"/>
-    <w:bookmarkEnd w:id="233"/>
+    <w:bookmarkEnd w:id="234"/>
+    <w:bookmarkStart w:id="235" w:name="pagina3-30"/>
+    <w:bookmarkEnd w:id="235"/>
     <w:bookmarkStart w:id="236" w:name="pagina3-31"/>
+    <w:bookmarkEnd w:id="236"/>
+    <w:bookmarkStart w:id="239" w:name="pagina3-32"/>
     <w:tbl>
       <w:tblPr>
         <w:tblStyle w:val="Table"/>
@@ -12328,12 +12489,12 @@
                 <wp:inline>
                   <wp:extent cx="152400" cy="152400"/>
                   <wp:effectExtent b="0" l="0" r="0" t="0"/>
-                  <wp:docPr descr="" title="" id="234" name="Picture"/>
+                  <wp:docPr descr="" title="" id="237" name="Picture"/>
                   <a:graphic>
                     <a:graphicData uri="http://schemas.openxmlformats.org/drawingml/2006/picture">
                       <pic:pic>
                         <pic:nvPicPr>
-                          <pic:cNvPr descr="C:\Users\User\AppData\Local\Programs\Quarto\share\formats\docx\warning.png" id="235" name="Picture"/>
+                          <pic:cNvPr descr="C:\Users\User\AppData\Local\Programs\Quarto\share\formats\docx\warning.png" id="238" name="Picture"/>
                           <pic:cNvPicPr>
                             <a:picLocks noChangeArrowheads="1" noChangeAspect="1"/>
                           </pic:cNvPicPr>
@@ -12480,29 +12641,190 @@
         </w:tc>
       </w:tr>
     </w:tbl>
-    <w:bookmarkEnd w:id="236"/>
+    <w:bookmarkEnd w:id="239"/>
+    <w:bookmarkStart w:id="242" w:name="pagina3-33"/>
+    <w:tbl>
+      <w:tblPr>
+        <w:tblStyle w:val="Table"/>
+        <w:tblLook w:firstRow="0" w:lastRow="0" w:firstColumn="0" w:lastColumn="0" w:noHBand="0" w:noVBand="0" w:val="0000"/>
+        <w:tblBorders>
+          <w:top w:val="single" w:sz="4" w:space="0" w:color="0758E5"/>
+          <w:left w:val="single" w:sz="24" w:space="0" w:color="0758E5"/>
+          <w:bottom w:val="single" w:sz="4" w:space="0" w:color="0758E5"/>
+          <w:right w:val="single" w:sz="4" w:space="0" w:color="0758E5"/>
+        </w:tblBorders>
+        <w:tblCellMar>
+          <w:left w:w="144" w:type="dxa"/>
+          <w:right w:w="144" w:type="dxa"/>
+        </w:tblCellMar>
+        <w:tblLook w:firstRow="0" w:lastRow="0" w:firstColumn="0" w:lastColumn="0" w:noHBand="0" w:noVBand="0" w:val="0000"/>
+      </w:tblPr>
+      <w:tr>
+        <w:trPr>
+          <w:cantSplit/>
+        </w:trPr>
+        <w:tc>
+          <w:tcPr>
+            <w:shd w:color="auto" w:fill="dae6fb" w:val="clear"/>
+            <w:tcMar>
+              <w:top w:w="92" w:type="dxa"/>
+              <w:bottom w:w="92" w:type="dxa"/>
+            </w:tcMar>
+          </w:tcPr>
+          <w:p>
+            <w:pPr>
+              <w:pStyle w:val="FirstParagraph"/>
+            </w:pPr>
+            <w:pPr>
+              <w:spacing w:before="0" w:after="0"/>
+              <w:textAlignment w:val="center"/>
+            </w:pPr>
+            <w:r>
+              <w:drawing>
+                <wp:inline>
+                  <wp:extent cx="152400" cy="152400"/>
+                  <wp:effectExtent b="0" l="0" r="0" t="0"/>
+                  <wp:docPr descr="" title="" id="240" name="Picture"/>
+                  <a:graphic>
+                    <a:graphicData uri="http://schemas.openxmlformats.org/drawingml/2006/picture">
+                      <pic:pic>
+                        <pic:nvPicPr>
+                          <pic:cNvPr descr="C:\Users\User\AppData\Local\Programs\Quarto\share\formats\docx\note.png" id="241" name="Picture"/>
+                          <pic:cNvPicPr>
+                            <a:picLocks noChangeArrowheads="1" noChangeAspect="1"/>
+                          </pic:cNvPicPr>
+                        </pic:nvPicPr>
+                        <pic:blipFill>
+                          <a:blip r:embed="rId64"/>
+                          <a:stretch>
+                            <a:fillRect/>
+                          </a:stretch>
+                        </pic:blipFill>
+                        <pic:spPr bwMode="auto">
+                          <a:xfrm>
+                            <a:off x="0" y="0"/>
+                            <a:ext cx="152400" cy="152400"/>
+                          </a:xfrm>
+                          <a:prstGeom prst="rect">
+                            <a:avLst/>
+                          </a:prstGeom>
+                          <a:noFill/>
+                          <a:ln w="9525">
+                            <a:noFill/>
+                            <a:headEnd/>
+                            <a:tailEnd/>
+                          </a:ln>
+                        </pic:spPr>
+                      </pic:pic>
+                    </a:graphicData>
+                  </a:graphic>
+                </wp:inline>
+              </w:drawing>
+            </w:r>
+            <w:r>
+              <w:t xml:space="preserve"> </w:t>
+            </w:r>
+            <w:r>
+              <w:t xml:space="preserve"> </w:t>
+            </w:r>
+            <w:r>
+              <w:t xml:space="preserve">Auditoria VIZ 3.3</w:t>
+            </w:r>
+          </w:p>
+        </w:tc>
+      </w:tr>
+      <w:tr>
+        <w:trPr>
+          <w:cantSplit/>
+        </w:trPr>
+        <w:tc>
+          <w:tcPr>
+            <w:tcMar>
+              <w:top w:w="108" w:type="dxa"/>
+              <w:bottom w:w="108" w:type="dxa"/>
+            </w:tcMar>
+          </w:tcPr>
+          <w:p>
+            <w:pPr>
+              <w:pStyle w:val="BodyText"/>
+            </w:pPr>
+            <w:pPr>
+              <w:spacing w:before="16"/>
+            </w:pPr>
+            <w:r>
+              <w:rPr>
+                <w:b/>
+                <w:bCs/>
+              </w:rPr>
+              <w:t xml:space="preserve">Fonte:</w:t>
+            </w:r>
+            <w:r>
+              <w:t xml:space="preserve"> </w:t>
+            </w:r>
+            <w:r>
+              <w:t xml:space="preserve">df_real_s (granularidade semanal, Celula 5A)</w:t>
+            </w:r>
+          </w:p>
+          <w:p>
+            <w:pPr>
+              <w:pStyle w:val="BodyText"/>
+            </w:pPr>
+            <w:pPr>
+              <w:spacing w:after="16"/>
+            </w:pPr>
+            <w:r>
+              <w:rPr>
+                <w:b/>
+                <w:bCs/>
+              </w:rPr>
+              <w:t xml:space="preserve">Formulas:</w:t>
+            </w:r>
+            <w:r>
+              <w:t xml:space="preserve"> </w:t>
+            </w:r>
+            <w:r>
+              <w:t xml:space="preserve">- Runway = Caixa / Despesas Semanais</w:t>
+            </w:r>
+            <w:r>
+              <w:t xml:space="preserve"> </w:t>
+            </w:r>
+            <w:r>
+              <w:t xml:space="preserve">- Vale de Caixa = min(Caixa) nas 24 semanas</w:t>
+            </w:r>
+            <w:r>
+              <w:t xml:space="preserve"> </w:t>
+            </w:r>
+            <w:r>
+              <w:t xml:space="preserve">- Reserva = Media Saidas x 4 semanas</w:t>
+            </w:r>
+          </w:p>
+          <w:p/>
+        </w:tc>
+      </w:tr>
+    </w:tbl>
+    <w:bookmarkEnd w:id="242"/>
     <w:p>
       <w:pPr>
-        <w:pStyle w:val="FirstParagraph"/>
+        <w:pStyle w:val="BodyText"/>
       </w:pPr>
-      <w:bookmarkStart w:id="240" w:name="pagina3-32"/>
+      <w:bookmarkStart w:id="246" w:name="pagina3-34"/>
       <w:r>
         <w:drawing>
           <wp:inline>
             <wp:extent cx="5334000" cy="2968924"/>
             <wp:effectExtent b="0" l="0" r="0" t="0"/>
-            <wp:docPr descr="" title="" id="238" name="Picture"/>
+            <wp:docPr descr="" title="" id="244" name="Picture"/>
             <a:graphic>
               <a:graphicData uri="http://schemas.openxmlformats.org/drawingml/2006/picture">
                 <pic:pic>
                   <pic:nvPicPr>
-                    <pic:cNvPr descr="relatorio_investidores_files/figure-docx/pagina3-output-32.png" id="239" name="Picture"/>
+                    <pic:cNvPr descr="relatorio_investidores_files/figure-docx/pagina3-output-34.png" id="245" name="Picture"/>
                     <pic:cNvPicPr>
                       <a:picLocks noChangeArrowheads="1" noChangeAspect="1"/>
                     </pic:cNvPicPr>
                   </pic:nvPicPr>
                   <pic:blipFill>
-                    <a:blip r:embed="rId237"/>
+                    <a:blip r:embed="rId243"/>
                     <a:stretch>
                       <a:fillRect/>
                     </a:stretch>
@@ -12528,9 +12850,9 @@
           </wp:inline>
         </w:drawing>
       </w:r>
-      <w:bookmarkEnd w:id="240"/>
+      <w:bookmarkEnd w:id="246"/>
     </w:p>
-    <w:bookmarkStart w:id="241" w:name="pagina3-33"/>
+    <w:bookmarkStart w:id="247" w:name="pagina3-35"/>
     <w:p>
       <w:pPr>
         <w:pStyle w:val="BodyText"/>
@@ -12697,10 +13019,10 @@
         <w:t xml:space="preserve">Pontos devem subir e entrar na zona verde</w:t>
       </w:r>
     </w:p>
-    <w:bookmarkEnd w:id="241"/>
-    <w:bookmarkStart w:id="242" w:name="pagina3-34"/>
-    <w:bookmarkEnd w:id="242"/>
-    <w:bookmarkStart w:id="245" w:name="pagina3-35"/>
+    <w:bookmarkEnd w:id="247"/>
+    <w:bookmarkStart w:id="248" w:name="pagina3-36"/>
+    <w:bookmarkEnd w:id="248"/>
+    <w:bookmarkStart w:id="251" w:name="pagina3-37"/>
     <w:tbl>
       <w:tblPr>
         <w:tblStyle w:val="Table"/>
@@ -12742,12 +13064,12 @@
                 <wp:inline>
                   <wp:extent cx="152400" cy="152400"/>
                   <wp:effectExtent b="0" l="0" r="0" t="0"/>
-                  <wp:docPr descr="" title="" id="243" name="Picture"/>
+                  <wp:docPr descr="" title="" id="249" name="Picture"/>
                   <a:graphic>
                     <a:graphicData uri="http://schemas.openxmlformats.org/drawingml/2006/picture">
                       <pic:pic>
                         <pic:nvPicPr>
-                          <pic:cNvPr descr="C:\Users\User\AppData\Local\Programs\Quarto\share\formats\docx\tip.png" id="244" name="Picture"/>
+                          <pic:cNvPr descr="C:\Users\User\AppData\Local\Programs\Quarto\share\formats\docx\tip.png" id="250" name="Picture"/>
                           <pic:cNvPicPr>
                             <a:picLocks noChangeArrowheads="1" noChangeAspect="1"/>
                           </pic:cNvPicPr>
@@ -12894,261 +13216,8 @@
         </w:tc>
       </w:tr>
     </w:tbl>
-    <w:bookmarkEnd w:id="245"/>
-    <w:p>
-      <w:pPr>
-        <w:pStyle w:val="FirstParagraph"/>
-      </w:pPr>
-      <w:bookmarkStart w:id="249" w:name="pagina3-36"/>
-      <w:r>
-        <w:drawing>
-          <wp:inline>
-            <wp:extent cx="5334000" cy="2282594"/>
-            <wp:effectExtent b="0" l="0" r="0" t="0"/>
-            <wp:docPr descr="" title="" id="247" name="Picture"/>
-            <a:graphic>
-              <a:graphicData uri="http://schemas.openxmlformats.org/drawingml/2006/picture">
-                <pic:pic>
-                  <pic:nvPicPr>
-                    <pic:cNvPr descr="relatorio_investidores_files/figure-docx/pagina3-output-36.png" id="248" name="Picture"/>
-                    <pic:cNvPicPr>
-                      <a:picLocks noChangeArrowheads="1" noChangeAspect="1"/>
-                    </pic:cNvPicPr>
-                  </pic:nvPicPr>
-                  <pic:blipFill>
-                    <a:blip r:embed="rId246"/>
-                    <a:stretch>
-                      <a:fillRect/>
-                    </a:stretch>
-                  </pic:blipFill>
-                  <pic:spPr bwMode="auto">
-                    <a:xfrm>
-                      <a:off x="0" y="0"/>
-                      <a:ext cx="5334000" cy="2282594"/>
-                    </a:xfrm>
-                    <a:prstGeom prst="rect">
-                      <a:avLst/>
-                    </a:prstGeom>
-                    <a:noFill/>
-                    <a:ln w="9525">
-                      <a:noFill/>
-                      <a:headEnd/>
-                      <a:tailEnd/>
-                    </a:ln>
-                  </pic:spPr>
-                </pic:pic>
-              </a:graphicData>
-            </a:graphic>
-          </wp:inline>
-        </w:drawing>
-      </w:r>
-      <w:bookmarkEnd w:id="249"/>
-    </w:p>
-    <w:bookmarkStart w:id="250" w:name="pagina3-37"/>
-    <w:p>
-      <w:pPr>
-        <w:pStyle w:val="BodyText"/>
-      </w:pPr>
-      <w:r>
-        <w:rPr>
-          <w:b/>
-          <w:bCs/>
-        </w:rPr>
-        <w:t xml:space="preserve">📖 COMO LER ESTE GRÁFICO:</w:t>
-      </w:r>
-    </w:p>
-    <w:p>
-      <w:pPr>
-        <w:pStyle w:val="BodyText"/>
-      </w:pPr>
-      <w:r>
-        <w:rPr>
-          <w:b/>
-          <w:bCs/>
-        </w:rPr>
-        <w:t xml:space="preserve">HEATMAP (ESQUERDA) - O Delta (Δ):</w:t>
-      </w:r>
-      <w:r>
-        <w:t xml:space="preserve"> </w:t>
-      </w:r>
-      <w:r>
-        <w:t xml:space="preserve">- Mostra a</w:t>
-      </w:r>
-      <w:r>
-        <w:t xml:space="preserve"> </w:t>
-      </w:r>
-      <w:r>
-        <w:rPr>
-          <w:b/>
-          <w:bCs/>
-        </w:rPr>
-        <w:t xml:space="preserve">diferença percentual</w:t>
-      </w:r>
-      <w:r>
-        <w:t xml:space="preserve"> </w:t>
-      </w:r>
-      <w:r>
-        <w:t xml:space="preserve">entre Real e Ideal, NÃO os valores absolutos.</w:t>
-      </w:r>
-      <w:r>
-        <w:t xml:space="preserve"> </w:t>
-      </w:r>
-      <w:r>
-        <w:t xml:space="preserve">-</w:t>
-      </w:r>
-      <w:r>
-        <w:t xml:space="preserve"> </w:t>
-      </w:r>
-      <w:r>
-        <w:rPr>
-          <w:b/>
-          <w:bCs/>
-        </w:rPr>
-        <w:t xml:space="preserve">Verde</w:t>
-      </w:r>
-      <w:r>
-        <w:t xml:space="preserve"> </w:t>
-      </w:r>
-      <w:r>
-        <w:t xml:space="preserve">= Real superando Ideal |</w:t>
-      </w:r>
-      <w:r>
-        <w:t xml:space="preserve"> </w:t>
-      </w:r>
-      <w:r>
-        <w:rPr>
-          <w:b/>
-          <w:bCs/>
-        </w:rPr>
-        <w:t xml:space="preserve">Vermelho</w:t>
-      </w:r>
-      <w:r>
-        <w:t xml:space="preserve"> </w:t>
-      </w:r>
-      <w:r>
-        <w:t xml:space="preserve">= Real abaixo do Ideal</w:t>
-      </w:r>
-      <w:r>
-        <w:t xml:space="preserve"> </w:t>
-      </w:r>
-      <w:r>
-        <w:t xml:space="preserve">- Ex: Se Receita Real = R$ 749 e Ideal = R$ 2.135, Delta = -65% (vermelho)</w:t>
-      </w:r>
-      <w:r>
-        <w:t xml:space="preserve"> </w:t>
-      </w:r>
-      <w:r>
-        <w:t xml:space="preserve">-</w:t>
-      </w:r>
-      <w:r>
-        <w:t xml:space="preserve"> </w:t>
-      </w:r>
-      <w:r>
-        <w:rPr>
-          <w:b/>
-          <w:bCs/>
-        </w:rPr>
-        <w:t xml:space="preserve">OPEX %:</w:t>
-      </w:r>
-      <w:r>
-        <w:t xml:space="preserve"> </w:t>
-      </w:r>
-      <w:r>
-        <w:t xml:space="preserve">Vermelho = OPEX maior que benchmark (ruim); Verde = menor (bom)</w:t>
-      </w:r>
-      <w:r>
-        <w:t xml:space="preserve"> </w:t>
-      </w:r>
-      <w:r>
-        <w:t xml:space="preserve">-</w:t>
-      </w:r>
-      <w:r>
-        <w:t xml:space="preserve"> </w:t>
-      </w:r>
-      <w:r>
-        <w:rPr>
-          <w:b/>
-          <w:bCs/>
-        </w:rPr>
-        <w:t xml:space="preserve">EBITDA %:</w:t>
-      </w:r>
-      <w:r>
-        <w:t xml:space="preserve"> </w:t>
-      </w:r>
-      <w:r>
-        <w:t xml:space="preserve">Valores negativos no Delta = margem ABAIXO do ideal</w:t>
-      </w:r>
-    </w:p>
-    <w:p>
-      <w:pPr>
-        <w:pStyle w:val="BodyText"/>
-      </w:pPr>
-      <w:r>
-        <w:rPr>
-          <w:b/>
-          <w:bCs/>
-        </w:rPr>
-        <w:t xml:space="preserve">TABELA (DIREITA) - Valores Absolutos:</w:t>
-      </w:r>
-      <w:r>
-        <w:t xml:space="preserve"> </w:t>
-      </w:r>
-      <w:r>
-        <w:t xml:space="preserve">- Mostra os valores REAIS da simulação, em R$ ou %.</w:t>
-      </w:r>
-      <w:r>
-        <w:t xml:space="preserve"> </w:t>
-      </w:r>
-      <w:r>
-        <w:t xml:space="preserve">- EBITDA de -234.8% = prejuízo 2.3x maior que receita naquele mês.</w:t>
-      </w:r>
-      <w:r>
-        <w:t xml:space="preserve"> </w:t>
-      </w:r>
-      <w:r>
-        <w:t xml:space="preserve">- Negativos são normais no início e devem ficar positivos com maturidade.</w:t>
-      </w:r>
-    </w:p>
-    <w:p>
-      <w:pPr>
-        <w:pStyle w:val="BodyText"/>
-      </w:pPr>
-      <w:r>
-        <w:rPr>
-          <w:b/>
-          <w:bCs/>
-        </w:rPr>
-        <w:t xml:space="preserve">RECONCILIAÇÃO:</w:t>
-      </w:r>
-      <w:r>
-        <w:t xml:space="preserve"> </w:t>
-      </w:r>
-      <w:r>
-        <w:t xml:space="preserve">Heatmap =</w:t>
-      </w:r>
-      <w:r>
-        <w:t xml:space="preserve"> </w:t>
-      </w:r>
-      <w:r>
-        <w:t xml:space="preserve">“quanto longe da meta”</w:t>
-      </w:r>
-      <w:r>
-        <w:t xml:space="preserve">, Tabela =</w:t>
-      </w:r>
-      <w:r>
-        <w:t xml:space="preserve"> </w:t>
-      </w:r>
-      <w:r>
-        <w:t xml:space="preserve">“onde estou de fato”</w:t>
-      </w:r>
-      <w:r>
-        <w:t xml:space="preserve">.</w:t>
-      </w:r>
-    </w:p>
-    <w:bookmarkEnd w:id="250"/>
-    <w:bookmarkStart w:id="251" w:name="pagina3-38"/>
     <w:bookmarkEnd w:id="251"/>
-    <w:bookmarkStart w:id="254" w:name="pagina3-39"/>
+    <w:bookmarkStart w:id="254" w:name="pagina3-38"/>
     <w:tbl>
       <w:tblPr>
         <w:tblStyle w:val="Table"/>
@@ -13179,7 +13248,7 @@
           </w:tcPr>
           <w:p>
             <w:pPr>
-              <w:pStyle w:val="BodyText"/>
+              <w:pStyle w:val="FirstParagraph"/>
             </w:pPr>
             <w:pPr>
               <w:spacing w:before="0" w:after="0"/>
@@ -13234,7 +13303,7 @@
               <w:t xml:space="preserve"> </w:t>
             </w:r>
             <w:r>
-              <w:t xml:space="preserve">💡 INSIGHT: Convergência ao Ideal</w:t>
+              <w:t xml:space="preserve">Auditoria VIZ 3.4</w:t>
             </w:r>
           </w:p>
         </w:tc>
@@ -13252,6 +13321,420 @@
           </w:tcPr>
           <w:p>
             <w:pPr>
+              <w:pStyle w:val="BodyText"/>
+            </w:pPr>
+            <w:pPr>
+              <w:spacing w:before="16"/>
+            </w:pPr>
+            <w:r>
+              <w:rPr>
+                <w:b/>
+                <w:bCs/>
+              </w:rPr>
+              <w:t xml:space="preserve">Fonte:</w:t>
+            </w:r>
+            <w:r>
+              <w:t xml:space="preserve"> </w:t>
+            </w:r>
+            <w:r>
+              <w:t xml:space="preserve">df_real_m, df_ideal_m (Celulas 5A/5B)</w:t>
+            </w:r>
+          </w:p>
+          <w:p>
+            <w:pPr>
+              <w:pStyle w:val="BodyText"/>
+            </w:pPr>
+            <w:pPr>
+              <w:spacing w:after="16"/>
+            </w:pPr>
+            <w:r>
+              <w:rPr>
+                <w:b/>
+                <w:bCs/>
+              </w:rPr>
+              <w:t xml:space="preserve">Formulas:</w:t>
+            </w:r>
+            <w:r>
+              <w:t xml:space="preserve"> </w:t>
+            </w:r>
+            <w:r>
+              <w:t xml:space="preserve">- Alavancagem = Delta EBITDA / Delta Receita</w:t>
+            </w:r>
+            <w:r>
+              <w:t xml:space="preserve"> </w:t>
+            </w:r>
+            <w:r>
+              <w:t xml:space="preserve">- Delta = (Valor M36 - Valor M12) / Valor M12 x 100</w:t>
+            </w:r>
+            <w:r>
+              <w:t xml:space="preserve"> </w:t>
+            </w:r>
+            <w:r>
+              <w:t xml:space="preserve">- Interpretacao: Alavancagem maior que 1 = Modelo escalavel</w:t>
+            </w:r>
+          </w:p>
+          <w:p/>
+        </w:tc>
+      </w:tr>
+    </w:tbl>
+    <w:bookmarkEnd w:id="254"/>
+    <w:p>
+      <w:pPr>
+        <w:pStyle w:val="BodyText"/>
+      </w:pPr>
+      <w:bookmarkStart w:id="258" w:name="pagina3-39"/>
+      <w:r>
+        <w:drawing>
+          <wp:inline>
+            <wp:extent cx="5334000" cy="2282594"/>
+            <wp:effectExtent b="0" l="0" r="0" t="0"/>
+            <wp:docPr descr="" title="" id="256" name="Picture"/>
+            <a:graphic>
+              <a:graphicData uri="http://schemas.openxmlformats.org/drawingml/2006/picture">
+                <pic:pic>
+                  <pic:nvPicPr>
+                    <pic:cNvPr descr="relatorio_investidores_files/figure-docx/pagina3-output-39.png" id="257" name="Picture"/>
+                    <pic:cNvPicPr>
+                      <a:picLocks noChangeArrowheads="1" noChangeAspect="1"/>
+                    </pic:cNvPicPr>
+                  </pic:nvPicPr>
+                  <pic:blipFill>
+                    <a:blip r:embed="rId255"/>
+                    <a:stretch>
+                      <a:fillRect/>
+                    </a:stretch>
+                  </pic:blipFill>
+                  <pic:spPr bwMode="auto">
+                    <a:xfrm>
+                      <a:off x="0" y="0"/>
+                      <a:ext cx="5334000" cy="2282594"/>
+                    </a:xfrm>
+                    <a:prstGeom prst="rect">
+                      <a:avLst/>
+                    </a:prstGeom>
+                    <a:noFill/>
+                    <a:ln w="9525">
+                      <a:noFill/>
+                      <a:headEnd/>
+                      <a:tailEnd/>
+                    </a:ln>
+                  </pic:spPr>
+                </pic:pic>
+              </a:graphicData>
+            </a:graphic>
+          </wp:inline>
+        </w:drawing>
+      </w:r>
+      <w:bookmarkEnd w:id="258"/>
+    </w:p>
+    <w:bookmarkStart w:id="259" w:name="pagina3-40"/>
+    <w:p>
+      <w:pPr>
+        <w:pStyle w:val="BodyText"/>
+      </w:pPr>
+      <w:r>
+        <w:rPr>
+          <w:b/>
+          <w:bCs/>
+        </w:rPr>
+        <w:t xml:space="preserve">📖 COMO LER ESTE GRÁFICO:</w:t>
+      </w:r>
+    </w:p>
+    <w:p>
+      <w:pPr>
+        <w:pStyle w:val="BodyText"/>
+      </w:pPr>
+      <w:r>
+        <w:rPr>
+          <w:b/>
+          <w:bCs/>
+        </w:rPr>
+        <w:t xml:space="preserve">HEATMAP (ESQUERDA) - O Delta (Δ):</w:t>
+      </w:r>
+      <w:r>
+        <w:t xml:space="preserve"> </w:t>
+      </w:r>
+      <w:r>
+        <w:t xml:space="preserve">- Mostra a</w:t>
+      </w:r>
+      <w:r>
+        <w:t xml:space="preserve"> </w:t>
+      </w:r>
+      <w:r>
+        <w:rPr>
+          <w:b/>
+          <w:bCs/>
+        </w:rPr>
+        <w:t xml:space="preserve">diferença percentual</w:t>
+      </w:r>
+      <w:r>
+        <w:t xml:space="preserve"> </w:t>
+      </w:r>
+      <w:r>
+        <w:t xml:space="preserve">entre Real e Ideal, NÃO os valores absolutos.</w:t>
+      </w:r>
+      <w:r>
+        <w:t xml:space="preserve"> </w:t>
+      </w:r>
+      <w:r>
+        <w:t xml:space="preserve">-</w:t>
+      </w:r>
+      <w:r>
+        <w:t xml:space="preserve"> </w:t>
+      </w:r>
+      <w:r>
+        <w:rPr>
+          <w:b/>
+          <w:bCs/>
+        </w:rPr>
+        <w:t xml:space="preserve">Verde</w:t>
+      </w:r>
+      <w:r>
+        <w:t xml:space="preserve"> </w:t>
+      </w:r>
+      <w:r>
+        <w:t xml:space="preserve">= Real superando Ideal |</w:t>
+      </w:r>
+      <w:r>
+        <w:t xml:space="preserve"> </w:t>
+      </w:r>
+      <w:r>
+        <w:rPr>
+          <w:b/>
+          <w:bCs/>
+        </w:rPr>
+        <w:t xml:space="preserve">Vermelho</w:t>
+      </w:r>
+      <w:r>
+        <w:t xml:space="preserve"> </w:t>
+      </w:r>
+      <w:r>
+        <w:t xml:space="preserve">= Real abaixo do Ideal</w:t>
+      </w:r>
+      <w:r>
+        <w:t xml:space="preserve"> </w:t>
+      </w:r>
+      <w:r>
+        <w:t xml:space="preserve">- Ex: Se Receita Real = R$ 749 e Ideal = R$ 2.135, Delta = -65% (vermelho)</w:t>
+      </w:r>
+      <w:r>
+        <w:t xml:space="preserve"> </w:t>
+      </w:r>
+      <w:r>
+        <w:t xml:space="preserve">-</w:t>
+      </w:r>
+      <w:r>
+        <w:t xml:space="preserve"> </w:t>
+      </w:r>
+      <w:r>
+        <w:rPr>
+          <w:b/>
+          <w:bCs/>
+        </w:rPr>
+        <w:t xml:space="preserve">OPEX %:</w:t>
+      </w:r>
+      <w:r>
+        <w:t xml:space="preserve"> </w:t>
+      </w:r>
+      <w:r>
+        <w:t xml:space="preserve">Vermelho = OPEX maior que benchmark (ruim); Verde = menor (bom)</w:t>
+      </w:r>
+      <w:r>
+        <w:t xml:space="preserve"> </w:t>
+      </w:r>
+      <w:r>
+        <w:t xml:space="preserve">-</w:t>
+      </w:r>
+      <w:r>
+        <w:t xml:space="preserve"> </w:t>
+      </w:r>
+      <w:r>
+        <w:rPr>
+          <w:b/>
+          <w:bCs/>
+        </w:rPr>
+        <w:t xml:space="preserve">EBITDA %:</w:t>
+      </w:r>
+      <w:r>
+        <w:t xml:space="preserve"> </w:t>
+      </w:r>
+      <w:r>
+        <w:t xml:space="preserve">Valores negativos no Delta = margem ABAIXO do ideal</w:t>
+      </w:r>
+    </w:p>
+    <w:p>
+      <w:pPr>
+        <w:pStyle w:val="BodyText"/>
+      </w:pPr>
+      <w:r>
+        <w:rPr>
+          <w:b/>
+          <w:bCs/>
+        </w:rPr>
+        <w:t xml:space="preserve">TABELA (DIREITA) - Valores Absolutos:</w:t>
+      </w:r>
+      <w:r>
+        <w:t xml:space="preserve"> </w:t>
+      </w:r>
+      <w:r>
+        <w:t xml:space="preserve">- Mostra os valores REAIS da simulação, em R$ ou %.</w:t>
+      </w:r>
+      <w:r>
+        <w:t xml:space="preserve"> </w:t>
+      </w:r>
+      <w:r>
+        <w:t xml:space="preserve">- EBITDA de -234.8% = prejuízo 2.3x maior que receita naquele mês.</w:t>
+      </w:r>
+      <w:r>
+        <w:t xml:space="preserve"> </w:t>
+      </w:r>
+      <w:r>
+        <w:t xml:space="preserve">- Negativos são normais no início e devem ficar positivos com maturidade.</w:t>
+      </w:r>
+    </w:p>
+    <w:p>
+      <w:pPr>
+        <w:pStyle w:val="BodyText"/>
+      </w:pPr>
+      <w:r>
+        <w:rPr>
+          <w:b/>
+          <w:bCs/>
+        </w:rPr>
+        <w:t xml:space="preserve">RECONCILIAÇÃO:</w:t>
+      </w:r>
+      <w:r>
+        <w:t xml:space="preserve"> </w:t>
+      </w:r>
+      <w:r>
+        <w:t xml:space="preserve">Heatmap =</w:t>
+      </w:r>
+      <w:r>
+        <w:t xml:space="preserve"> </w:t>
+      </w:r>
+      <w:r>
+        <w:t xml:space="preserve">“quanto longe da meta”</w:t>
+      </w:r>
+      <w:r>
+        <w:t xml:space="preserve">, Tabela =</w:t>
+      </w:r>
+      <w:r>
+        <w:t xml:space="preserve"> </w:t>
+      </w:r>
+      <w:r>
+        <w:t xml:space="preserve">“onde estou de fato”</w:t>
+      </w:r>
+      <w:r>
+        <w:t xml:space="preserve">.</w:t>
+      </w:r>
+    </w:p>
+    <w:bookmarkEnd w:id="259"/>
+    <w:bookmarkStart w:id="260" w:name="pagina3-41"/>
+    <w:bookmarkEnd w:id="260"/>
+    <w:bookmarkStart w:id="263" w:name="pagina3-42"/>
+    <w:tbl>
+      <w:tblPr>
+        <w:tblStyle w:val="Table"/>
+        <w:tblLook w:firstRow="0" w:lastRow="0" w:firstColumn="0" w:lastColumn="0" w:noHBand="0" w:noVBand="0" w:val="0000"/>
+        <w:tblBorders>
+          <w:top w:val="single" w:sz="4" w:space="0" w:color="0758E5"/>
+          <w:left w:val="single" w:sz="24" w:space="0" w:color="0758E5"/>
+          <w:bottom w:val="single" w:sz="4" w:space="0" w:color="0758E5"/>
+          <w:right w:val="single" w:sz="4" w:space="0" w:color="0758E5"/>
+        </w:tblBorders>
+        <w:tblCellMar>
+          <w:left w:w="144" w:type="dxa"/>
+          <w:right w:w="144" w:type="dxa"/>
+        </w:tblCellMar>
+        <w:tblLook w:firstRow="0" w:lastRow="0" w:firstColumn="0" w:lastColumn="0" w:noHBand="0" w:noVBand="0" w:val="0000"/>
+      </w:tblPr>
+      <w:tr>
+        <w:trPr>
+          <w:cantSplit/>
+        </w:trPr>
+        <w:tc>
+          <w:tcPr>
+            <w:shd w:color="auto" w:fill="dae6fb" w:val="clear"/>
+            <w:tcMar>
+              <w:top w:w="92" w:type="dxa"/>
+              <w:bottom w:w="92" w:type="dxa"/>
+            </w:tcMar>
+          </w:tcPr>
+          <w:p>
+            <w:pPr>
+              <w:pStyle w:val="BodyText"/>
+            </w:pPr>
+            <w:pPr>
+              <w:spacing w:before="0" w:after="0"/>
+              <w:textAlignment w:val="center"/>
+            </w:pPr>
+            <w:r>
+              <w:drawing>
+                <wp:inline>
+                  <wp:extent cx="152400" cy="152400"/>
+                  <wp:effectExtent b="0" l="0" r="0" t="0"/>
+                  <wp:docPr descr="" title="" id="261" name="Picture"/>
+                  <a:graphic>
+                    <a:graphicData uri="http://schemas.openxmlformats.org/drawingml/2006/picture">
+                      <pic:pic>
+                        <pic:nvPicPr>
+                          <pic:cNvPr descr="C:\Users\User\AppData\Local\Programs\Quarto\share\formats\docx\note.png" id="262" name="Picture"/>
+                          <pic:cNvPicPr>
+                            <a:picLocks noChangeArrowheads="1" noChangeAspect="1"/>
+                          </pic:cNvPicPr>
+                        </pic:nvPicPr>
+                        <pic:blipFill>
+                          <a:blip r:embed="rId64"/>
+                          <a:stretch>
+                            <a:fillRect/>
+                          </a:stretch>
+                        </pic:blipFill>
+                        <pic:spPr bwMode="auto">
+                          <a:xfrm>
+                            <a:off x="0" y="0"/>
+                            <a:ext cx="152400" cy="152400"/>
+                          </a:xfrm>
+                          <a:prstGeom prst="rect">
+                            <a:avLst/>
+                          </a:prstGeom>
+                          <a:noFill/>
+                          <a:ln w="9525">
+                            <a:noFill/>
+                            <a:headEnd/>
+                            <a:tailEnd/>
+                          </a:ln>
+                        </pic:spPr>
+                      </pic:pic>
+                    </a:graphicData>
+                  </a:graphic>
+                </wp:inline>
+              </w:drawing>
+            </w:r>
+            <w:r>
+              <w:t xml:space="preserve"> </w:t>
+            </w:r>
+            <w:r>
+              <w:t xml:space="preserve"> </w:t>
+            </w:r>
+            <w:r>
+              <w:t xml:space="preserve">💡 INSIGHT: Convergência ao Ideal</w:t>
+            </w:r>
+          </w:p>
+        </w:tc>
+      </w:tr>
+      <w:tr>
+        <w:trPr>
+          <w:cantSplit/>
+        </w:trPr>
+        <w:tc>
+          <w:tcPr>
+            <w:tcMar>
+              <w:top w:w="108" w:type="dxa"/>
+              <w:bottom w:w="108" w:type="dxa"/>
+            </w:tcMar>
+          </w:tcPr>
+          <w:p>
+            <w:pPr>
               <w:pStyle w:val="Compact"/>
               <w:numPr>
                 <w:ilvl w:val="0"/>
@@ -13342,8 +13825,169 @@
         </w:tc>
       </w:tr>
     </w:tbl>
-    <w:bookmarkEnd w:id="254"/>
-    <w:bookmarkStart w:id="257" w:name="pagina3-40"/>
+    <w:bookmarkEnd w:id="263"/>
+    <w:bookmarkStart w:id="266" w:name="pagina3-43"/>
+    <w:tbl>
+      <w:tblPr>
+        <w:tblStyle w:val="Table"/>
+        <w:tblLook w:firstRow="0" w:lastRow="0" w:firstColumn="0" w:lastColumn="0" w:noHBand="0" w:noVBand="0" w:val="0000"/>
+        <w:tblBorders>
+          <w:top w:val="single" w:sz="4" w:space="0" w:color="0758E5"/>
+          <w:left w:val="single" w:sz="24" w:space="0" w:color="0758E5"/>
+          <w:bottom w:val="single" w:sz="4" w:space="0" w:color="0758E5"/>
+          <w:right w:val="single" w:sz="4" w:space="0" w:color="0758E5"/>
+        </w:tblBorders>
+        <w:tblCellMar>
+          <w:left w:w="144" w:type="dxa"/>
+          <w:right w:w="144" w:type="dxa"/>
+        </w:tblCellMar>
+        <w:tblLook w:firstRow="0" w:lastRow="0" w:firstColumn="0" w:lastColumn="0" w:noHBand="0" w:noVBand="0" w:val="0000"/>
+      </w:tblPr>
+      <w:tr>
+        <w:trPr>
+          <w:cantSplit/>
+        </w:trPr>
+        <w:tc>
+          <w:tcPr>
+            <w:shd w:color="auto" w:fill="dae6fb" w:val="clear"/>
+            <w:tcMar>
+              <w:top w:w="92" w:type="dxa"/>
+              <w:bottom w:w="92" w:type="dxa"/>
+            </w:tcMar>
+          </w:tcPr>
+          <w:p>
+            <w:pPr>
+              <w:pStyle w:val="FirstParagraph"/>
+            </w:pPr>
+            <w:pPr>
+              <w:spacing w:before="0" w:after="0"/>
+              <w:textAlignment w:val="center"/>
+            </w:pPr>
+            <w:r>
+              <w:drawing>
+                <wp:inline>
+                  <wp:extent cx="152400" cy="152400"/>
+                  <wp:effectExtent b="0" l="0" r="0" t="0"/>
+                  <wp:docPr descr="" title="" id="264" name="Picture"/>
+                  <a:graphic>
+                    <a:graphicData uri="http://schemas.openxmlformats.org/drawingml/2006/picture">
+                      <pic:pic>
+                        <pic:nvPicPr>
+                          <pic:cNvPr descr="C:\Users\User\AppData\Local\Programs\Quarto\share\formats\docx\note.png" id="265" name="Picture"/>
+                          <pic:cNvPicPr>
+                            <a:picLocks noChangeArrowheads="1" noChangeAspect="1"/>
+                          </pic:cNvPicPr>
+                        </pic:nvPicPr>
+                        <pic:blipFill>
+                          <a:blip r:embed="rId64"/>
+                          <a:stretch>
+                            <a:fillRect/>
+                          </a:stretch>
+                        </pic:blipFill>
+                        <pic:spPr bwMode="auto">
+                          <a:xfrm>
+                            <a:off x="0" y="0"/>
+                            <a:ext cx="152400" cy="152400"/>
+                          </a:xfrm>
+                          <a:prstGeom prst="rect">
+                            <a:avLst/>
+                          </a:prstGeom>
+                          <a:noFill/>
+                          <a:ln w="9525">
+                            <a:noFill/>
+                            <a:headEnd/>
+                            <a:tailEnd/>
+                          </a:ln>
+                        </pic:spPr>
+                      </pic:pic>
+                    </a:graphicData>
+                  </a:graphic>
+                </wp:inline>
+              </w:drawing>
+            </w:r>
+            <w:r>
+              <w:t xml:space="preserve"> </w:t>
+            </w:r>
+            <w:r>
+              <w:t xml:space="preserve"> </w:t>
+            </w:r>
+            <w:r>
+              <w:t xml:space="preserve">Auditoria VIZ 3.5</w:t>
+            </w:r>
+          </w:p>
+        </w:tc>
+      </w:tr>
+      <w:tr>
+        <w:trPr>
+          <w:cantSplit/>
+        </w:trPr>
+        <w:tc>
+          <w:tcPr>
+            <w:tcMar>
+              <w:top w:w="108" w:type="dxa"/>
+              <w:bottom w:w="108" w:type="dxa"/>
+            </w:tcMar>
+          </w:tcPr>
+          <w:p>
+            <w:pPr>
+              <w:pStyle w:val="BodyText"/>
+            </w:pPr>
+            <w:pPr>
+              <w:spacing w:before="16"/>
+            </w:pPr>
+            <w:r>
+              <w:rPr>
+                <w:b/>
+                <w:bCs/>
+              </w:rPr>
+              <w:t xml:space="preserve">Fonte:</w:t>
+            </w:r>
+            <w:r>
+              <w:t xml:space="preserve"> </w:t>
+            </w:r>
+            <w:r>
+              <w:t xml:space="preserve">df_real_m vs df_ideal_m (Celulas 5A e 5B)</w:t>
+            </w:r>
+          </w:p>
+          <w:p>
+            <w:pPr>
+              <w:pStyle w:val="BodyText"/>
+            </w:pPr>
+            <w:pPr>
+              <w:spacing w:after="16"/>
+            </w:pPr>
+            <w:r>
+              <w:rPr>
+                <w:b/>
+                <w:bCs/>
+              </w:rPr>
+              <w:t xml:space="preserve">Formulas:</w:t>
+            </w:r>
+            <w:r>
+              <w:t xml:space="preserve"> </w:t>
+            </w:r>
+            <w:r>
+              <w:t xml:space="preserve">- Delta = (Real - Ideal) / |Ideal| x 100</w:t>
+            </w:r>
+            <w:r>
+              <w:t xml:space="preserve"> </w:t>
+            </w:r>
+            <w:r>
+              <w:t xml:space="preserve">- Verde = Real superando Ideal</w:t>
+            </w:r>
+            <w:r>
+              <w:t xml:space="preserve"> </w:t>
+            </w:r>
+            <w:r>
+              <w:t xml:space="preserve">- Vermelho = Real abaixo do Ideal</w:t>
+            </w:r>
+          </w:p>
+          <w:p/>
+        </w:tc>
+      </w:tr>
+    </w:tbl>
+    <w:bookmarkEnd w:id="266"/>
+    <w:bookmarkStart w:id="269" w:name="pagina3-44"/>
     <w:tbl>
       <w:tblPr>
         <w:tblStyle w:val="Table"/>
@@ -13374,7 +14018,7 @@
           </w:tcPr>
           <w:p>
             <w:pPr>
-              <w:pStyle w:val="FirstParagraph"/>
+              <w:pStyle w:val="BodyText"/>
             </w:pPr>
             <w:pPr>
               <w:spacing w:before="0" w:after="0"/>
@@ -13385,12 +14029,12 @@
                 <wp:inline>
                   <wp:extent cx="152400" cy="152400"/>
                   <wp:effectExtent b="0" l="0" r="0" t="0"/>
-                  <wp:docPr descr="" title="" id="255" name="Picture"/>
+                  <wp:docPr descr="" title="" id="267" name="Picture"/>
                   <a:graphic>
                     <a:graphicData uri="http://schemas.openxmlformats.org/drawingml/2006/picture">
                       <pic:pic>
                         <pic:nvPicPr>
-                          <pic:cNvPr descr="C:\Users\User\AppData\Local\Programs\Quarto\share\formats\docx\important.png" id="256" name="Picture"/>
+                          <pic:cNvPr descr="C:\Users\User\AppData\Local\Programs\Quarto\share\formats\docx\important.png" id="268" name="Picture"/>
                           <pic:cNvPicPr>
                             <a:picLocks noChangeArrowheads="1" noChangeAspect="1"/>
                           </pic:cNvPicPr>
@@ -13611,8 +14255,8 @@
         </w:tc>
       </w:tr>
     </w:tbl>
-    <w:bookmarkEnd w:id="257"/>
-    <w:bookmarkEnd w:id="258"/>
+    <w:bookmarkEnd w:id="269"/>
+    <w:bookmarkEnd w:id="270"/>
     <w:sectPr>
       <w:footnotePr>
         <w:numRestart w:val="eachSect"/>

</xml_diff>

<commit_message>
COMO LER melhorado todos VIZ + mockup atualizado
</commit_message>
<xml_diff>
--- a/notebooks/quarto_pdf/relatorio_investidores.docx
+++ b/notebooks/quarto_pdf/relatorio_investidores.docx
@@ -36,20 +36,7 @@
         </w:p>
       </w:sdtContent>
     </w:sdt>
-    <w:bookmarkStart w:id="20" w:name="setup"/>
-    <w:p>
-      <w:pPr>
-        <w:pStyle w:val="SourceCode"/>
-      </w:pPr>
-      <w:r>
-        <w:rPr>
-          <w:rStyle w:val="VerbatimChar"/>
-        </w:rPr>
-        <w:t xml:space="preserve">⚠️  celula_0_utils não encontrado. Definindo helpers locais...</w:t>
-      </w:r>
-    </w:p>
-    <w:bookmarkEnd w:id="20"/>
-    <w:bookmarkStart w:id="70" w:name="página-1-executive-cockpit"/>
+    <w:bookmarkStart w:id="69" w:name="página-1-executive-cockpit"/>
     <w:p>
       <w:pPr>
         <w:pStyle w:val="Heading1"/>
@@ -84,9 +71,9 @@
         <w:t xml:space="preserve">Nesta seção, apresentamos o resumo executivo da operação, destacando a tração de receita (MRR), a eficiência de capital (Burn Rate) e os principais marcos atingidos.</w:t>
       </w:r>
     </w:p>
-    <w:bookmarkStart w:id="69" w:name="pagina1"/>
-    <w:bookmarkStart w:id="22" w:name="pagina1-1"/>
-    <w:bookmarkStart w:id="21" w:name="tabela-executiva-master"/>
+    <w:bookmarkStart w:id="68" w:name="pagina1"/>
+    <w:bookmarkStart w:id="21" w:name="pagina1-1"/>
+    <w:bookmarkStart w:id="20" w:name="tabela-executiva-master"/>
     <w:p>
       <w:pPr>
         <w:pStyle w:val="Heading2"/>
@@ -95,9 +82,9 @@
         <w:t xml:space="preserve">📊 1.1 TABELA EXECUTIVA MASTER</w:t>
       </w:r>
     </w:p>
+    <w:bookmarkEnd w:id="20"/>
     <w:bookmarkEnd w:id="21"/>
-    <w:bookmarkEnd w:id="22"/>
-    <w:bookmarkStart w:id="23" w:name="pagina1-2"/>
+    <w:bookmarkStart w:id="22" w:name="pagina1-2"/>
     <w:tbl>
       <w:tblPr>
         <w:tblStyle w:val="Table"/>
@@ -1686,8 +1673,8 @@
         </w:tc>
       </w:tr>
     </w:tbl>
-    <w:bookmarkEnd w:id="23"/>
-    <w:bookmarkStart w:id="24" w:name="pagina1-3"/>
+    <w:bookmarkEnd w:id="22"/>
+    <w:bookmarkStart w:id="23" w:name="pagina1-3"/>
     <w:p>
       <w:pPr>
         <w:pStyle w:val="BodyText"/>
@@ -1706,10 +1693,10 @@
         <w:t xml:space="preserve">Benchmark = Cenário Ideal.</w:t>
       </w:r>
     </w:p>
+    <w:bookmarkEnd w:id="23"/>
+    <w:bookmarkStart w:id="24" w:name="pagina1-4"/>
     <w:bookmarkEnd w:id="24"/>
-    <w:bookmarkStart w:id="25" w:name="pagina1-4"/>
-    <w:bookmarkEnd w:id="25"/>
-    <w:bookmarkStart w:id="29" w:name="pagina1-5"/>
+    <w:bookmarkStart w:id="28" w:name="pagina1-5"/>
     <w:p>
       <w:pPr>
         <w:pStyle w:val="CaptionedFigure"/>
@@ -1719,18 +1706,18 @@
           <wp:inline>
             <wp:extent cx="5334000" cy="1637969"/>
             <wp:effectExtent b="0" l="0" r="0" t="0"/>
-            <wp:docPr descr="KPI Cards" title="" id="27" name="Picture"/>
+            <wp:docPr descr="KPI Cards" title="" id="26" name="Picture"/>
             <a:graphic>
               <a:graphicData uri="http://schemas.openxmlformats.org/drawingml/2006/picture">
                 <pic:pic>
                   <pic:nvPicPr>
-                    <pic:cNvPr descr="outputs/figs/pg1_kpi_cards.png" id="28" name="Picture"/>
+                    <pic:cNvPr descr="outputs/figs/pg1_kpi_cards.png" id="27" name="Picture"/>
                     <pic:cNvPicPr>
                       <a:picLocks noChangeArrowheads="1" noChangeAspect="1"/>
                     </pic:cNvPicPr>
                   </pic:nvPicPr>
                   <pic:blipFill>
-                    <a:blip r:embed="rId26"/>
+                    <a:blip r:embed="rId25"/>
                     <a:stretch>
                       <a:fillRect/>
                     </a:stretch>
@@ -1765,9 +1752,9 @@
         <w:t xml:space="preserve">KPI Cards</w:t>
       </w:r>
     </w:p>
+    <w:bookmarkEnd w:id="28"/>
+    <w:bookmarkStart w:id="29" w:name="pagina1-6"/>
     <w:bookmarkEnd w:id="29"/>
-    <w:bookmarkStart w:id="30" w:name="pagina1-6"/>
-    <w:bookmarkEnd w:id="30"/>
     <w:p>
       <w:pPr>
         <w:pStyle w:val="SourceCode"/>
@@ -1779,8 +1766,8 @@
         <w:t xml:space="preserve">DEBUG: Executing gerar_grafico_temporal_correlacao V2.1 (FIX NAMEERROR)</w:t>
       </w:r>
     </w:p>
-    <w:bookmarkStart w:id="32" w:name="pagina1-7"/>
-    <w:bookmarkStart w:id="31" w:name="evolução-mrr-vs-usuários"/>
+    <w:bookmarkStart w:id="31" w:name="pagina1-7"/>
+    <w:bookmarkStart w:id="30" w:name="evolução-mrr-vs-usuários"/>
     <w:p>
       <w:pPr>
         <w:pStyle w:val="Heading3"/>
@@ -1789,9 +1776,9 @@
         <w:t xml:space="preserve">📈 EVOLUÇÃO MRR vs USUÁRIOS</w:t>
       </w:r>
     </w:p>
+    <w:bookmarkEnd w:id="30"/>
     <w:bookmarkEnd w:id="31"/>
-    <w:bookmarkEnd w:id="32"/>
-    <w:bookmarkStart w:id="36" w:name="pagina1-8"/>
+    <w:bookmarkStart w:id="35" w:name="pagina1-8"/>
     <w:p>
       <w:pPr>
         <w:pStyle w:val="CaptionedFigure"/>
@@ -1801,18 +1788,18 @@
           <wp:inline>
             <wp:extent cx="5334000" cy="2626881"/>
             <wp:effectExtent b="0" l="0" r="0" t="0"/>
-            <wp:docPr descr="Evolução Temporal" title="" id="34" name="Picture"/>
+            <wp:docPr descr="Evolução Temporal" title="" id="33" name="Picture"/>
             <a:graphic>
               <a:graphicData uri="http://schemas.openxmlformats.org/drawingml/2006/picture">
                 <pic:pic>
                   <pic:nvPicPr>
-                    <pic:cNvPr descr="outputs/figs/pg1_temporal_correlacao.png" id="35" name="Picture"/>
+                    <pic:cNvPr descr="outputs/figs/pg1_temporal_correlacao.png" id="34" name="Picture"/>
                     <pic:cNvPicPr>
                       <a:picLocks noChangeArrowheads="1" noChangeAspect="1"/>
                     </pic:cNvPicPr>
                   </pic:nvPicPr>
                   <pic:blipFill>
-                    <a:blip r:embed="rId33"/>
+                    <a:blip r:embed="rId32"/>
                     <a:stretch>
                       <a:fillRect/>
                     </a:stretch>
@@ -1847,8 +1834,8 @@
         <w:t xml:space="preserve">Evolução Temporal</w:t>
       </w:r>
     </w:p>
-    <w:bookmarkEnd w:id="36"/>
-    <w:bookmarkStart w:id="37" w:name="pagina1-9"/>
+    <w:bookmarkEnd w:id="35"/>
+    <w:bookmarkStart w:id="36" w:name="pagina1-9"/>
     <w:p>
       <w:r>
         <w:pict>
@@ -1856,9 +1843,9 @@
         </w:pict>
       </w:r>
     </w:p>
-    <w:bookmarkEnd w:id="37"/>
-    <w:bookmarkStart w:id="39" w:name="pagina1-10"/>
-    <w:bookmarkStart w:id="38" w:name="tabela-de-referência"/>
+    <w:bookmarkEnd w:id="36"/>
+    <w:bookmarkStart w:id="38" w:name="pagina1-10"/>
+    <w:bookmarkStart w:id="37" w:name="tabela-de-referência"/>
     <w:p>
       <w:pPr>
         <w:pStyle w:val="Heading4"/>
@@ -1867,9 +1854,9 @@
         <w:t xml:space="preserve">📋 TABELA DE REFERÊNCIA</w:t>
       </w:r>
     </w:p>
+    <w:bookmarkEnd w:id="37"/>
     <w:bookmarkEnd w:id="38"/>
-    <w:bookmarkEnd w:id="39"/>
-    <w:bookmarkStart w:id="40" w:name="pagina1-11"/>
+    <w:bookmarkStart w:id="39" w:name="pagina1-11"/>
     <w:tbl>
       <w:tblPr>
         <w:tblStyle w:val="Table"/>
@@ -2321,11 +2308,11 @@
         </w:tc>
       </w:tr>
     </w:tbl>
+    <w:bookmarkEnd w:id="39"/>
+    <w:bookmarkStart w:id="40" w:name="pagina1-12"/>
     <w:bookmarkEnd w:id="40"/>
-    <w:bookmarkStart w:id="41" w:name="pagina1-12"/>
-    <w:bookmarkEnd w:id="41"/>
-    <w:bookmarkStart w:id="43" w:name="pagina1-13"/>
-    <w:bookmarkStart w:id="42" w:name="tabela-de-milestones"/>
+    <w:bookmarkStart w:id="42" w:name="pagina1-13"/>
+    <w:bookmarkStart w:id="41" w:name="tabela-de-milestones"/>
     <w:p>
       <w:pPr>
         <w:pStyle w:val="Heading4"/>
@@ -2334,9 +2321,9 @@
         <w:t xml:space="preserve">🏁 TABELA DE MILESTONES</w:t>
       </w:r>
     </w:p>
+    <w:bookmarkEnd w:id="41"/>
     <w:bookmarkEnd w:id="42"/>
-    <w:bookmarkEnd w:id="43"/>
-    <w:bookmarkStart w:id="44" w:name="pagina1-14"/>
+    <w:bookmarkStart w:id="43" w:name="pagina1-14"/>
     <w:tbl>
       <w:tblPr>
         <w:tblStyle w:val="Table"/>
@@ -2953,8 +2940,8 @@
         </w:tc>
       </w:tr>
     </w:tbl>
-    <w:bookmarkEnd w:id="44"/>
-    <w:bookmarkStart w:id="48" w:name="pagina1-15"/>
+    <w:bookmarkEnd w:id="43"/>
+    <w:bookmarkStart w:id="47" w:name="pagina1-15"/>
     <w:p>
       <w:pPr>
         <w:pStyle w:val="CaptionedFigure"/>
@@ -2964,18 +2951,18 @@
           <wp:inline>
             <wp:extent cx="5334000" cy="2554824"/>
             <wp:effectExtent b="0" l="0" r="0" t="0"/>
-            <wp:docPr descr="Eficiência Marketing" title="" id="46" name="Picture"/>
+            <wp:docPr descr="Eficiência Marketing" title="" id="45" name="Picture"/>
             <a:graphic>
               <a:graphicData uri="http://schemas.openxmlformats.org/drawingml/2006/picture">
                 <pic:pic>
                   <pic:nvPicPr>
-                    <pic:cNvPr descr="outputs/figs/pg1_eficiencia_marketing.png" id="47" name="Picture"/>
+                    <pic:cNvPr descr="outputs/figs/pg1_eficiencia_marketing.png" id="46" name="Picture"/>
                     <pic:cNvPicPr>
                       <a:picLocks noChangeArrowheads="1" noChangeAspect="1"/>
                     </pic:cNvPicPr>
                   </pic:nvPicPr>
                   <pic:blipFill>
-                    <a:blip r:embed="rId45"/>
+                    <a:blip r:embed="rId44"/>
                     <a:stretch>
                       <a:fillRect/>
                     </a:stretch>
@@ -3010,11 +2997,11 @@
         <w:t xml:space="preserve">Eficiência Marketing</w:t>
       </w:r>
     </w:p>
+    <w:bookmarkEnd w:id="47"/>
+    <w:bookmarkStart w:id="48" w:name="pagina1-16"/>
     <w:bookmarkEnd w:id="48"/>
-    <w:bookmarkStart w:id="49" w:name="pagina1-16"/>
-    <w:bookmarkEnd w:id="49"/>
-    <w:bookmarkStart w:id="51" w:name="pagina1-17"/>
-    <w:bookmarkStart w:id="50" w:name="insights-estratégicos-do-cockpit"/>
+    <w:bookmarkStart w:id="50" w:name="pagina1-17"/>
+    <w:bookmarkStart w:id="49" w:name="insights-estratégicos-do-cockpit"/>
     <w:p>
       <w:pPr>
         <w:pStyle w:val="Heading2"/>
@@ -3023,9 +3010,9 @@
         <w:t xml:space="preserve">🧠 INSIGHTS ESTRATÉGICOS DO COCKPIT</w:t>
       </w:r>
     </w:p>
+    <w:bookmarkEnd w:id="49"/>
     <w:bookmarkEnd w:id="50"/>
-    <w:bookmarkEnd w:id="51"/>
-    <w:bookmarkStart w:id="55" w:name="pagina1-18"/>
+    <w:bookmarkStart w:id="54" w:name="pagina1-18"/>
     <w:tbl>
       <w:tblPr>
         <w:tblStyle w:val="Table"/>
@@ -3067,18 +3054,18 @@
                 <wp:inline>
                   <wp:extent cx="152400" cy="152400"/>
                   <wp:effectExtent b="0" l="0" r="0" t="0"/>
-                  <wp:docPr descr="" title="" id="53" name="Picture"/>
+                  <wp:docPr descr="" title="" id="52" name="Picture"/>
                   <a:graphic>
                     <a:graphicData uri="http://schemas.openxmlformats.org/drawingml/2006/picture">
                       <pic:pic>
                         <pic:nvPicPr>
-                          <pic:cNvPr descr="C:\Users\User\AppData\Local\Programs\Quarto\share\formats\docx\tip.png" id="54" name="Picture"/>
+                          <pic:cNvPr descr="C:\Users\User\AppData\Local\Programs\Quarto\share\formats\docx\tip.png" id="53" name="Picture"/>
                           <pic:cNvPicPr>
                             <a:picLocks noChangeArrowheads="1" noChangeAspect="1"/>
                           </pic:cNvPicPr>
                         </pic:nvPicPr>
                         <pic:blipFill>
-                          <a:blip r:embed="rId52"/>
+                          <a:blip r:embed="rId51"/>
                           <a:stretch>
                             <a:fillRect/>
                           </a:stretch>
@@ -3219,8 +3206,8 @@
         </w:tc>
       </w:tr>
     </w:tbl>
-    <w:bookmarkEnd w:id="55"/>
-    <w:bookmarkStart w:id="59" w:name="pagina1-19"/>
+    <w:bookmarkEnd w:id="54"/>
+    <w:bookmarkStart w:id="58" w:name="pagina1-19"/>
     <w:tbl>
       <w:tblPr>
         <w:tblStyle w:val="Table"/>
@@ -3262,18 +3249,18 @@
                 <wp:inline>
                   <wp:extent cx="152400" cy="152400"/>
                   <wp:effectExtent b="0" l="0" r="0" t="0"/>
-                  <wp:docPr descr="" title="" id="57" name="Picture"/>
+                  <wp:docPr descr="" title="" id="56" name="Picture"/>
                   <a:graphic>
                     <a:graphicData uri="http://schemas.openxmlformats.org/drawingml/2006/picture">
                       <pic:pic>
                         <pic:nvPicPr>
-                          <pic:cNvPr descr="C:\Users\User\AppData\Local\Programs\Quarto\share\formats\docx\warning.png" id="58" name="Picture"/>
+                          <pic:cNvPr descr="C:\Users\User\AppData\Local\Programs\Quarto\share\formats\docx\warning.png" id="57" name="Picture"/>
                           <pic:cNvPicPr>
                             <a:picLocks noChangeArrowheads="1" noChangeAspect="1"/>
                           </pic:cNvPicPr>
                         </pic:nvPicPr>
                         <pic:blipFill>
-                          <a:blip r:embed="rId56"/>
+                          <a:blip r:embed="rId55"/>
                           <a:stretch>
                             <a:fillRect/>
                           </a:stretch>
@@ -3414,8 +3401,8 @@
         </w:tc>
       </w:tr>
     </w:tbl>
-    <w:bookmarkEnd w:id="59"/>
-    <w:bookmarkStart w:id="63" w:name="pagina1-20"/>
+    <w:bookmarkEnd w:id="58"/>
+    <w:bookmarkStart w:id="62" w:name="pagina1-20"/>
     <w:tbl>
       <w:tblPr>
         <w:tblStyle w:val="Table"/>
@@ -3457,18 +3444,18 @@
                 <wp:inline>
                   <wp:extent cx="152400" cy="152400"/>
                   <wp:effectExtent b="0" l="0" r="0" t="0"/>
-                  <wp:docPr descr="" title="" id="61" name="Picture"/>
+                  <wp:docPr descr="" title="" id="60" name="Picture"/>
                   <a:graphic>
                     <a:graphicData uri="http://schemas.openxmlformats.org/drawingml/2006/picture">
                       <pic:pic>
                         <pic:nvPicPr>
-                          <pic:cNvPr descr="C:\Users\User\AppData\Local\Programs\Quarto\share\formats\docx\important.png" id="62" name="Picture"/>
+                          <pic:cNvPr descr="C:\Users\User\AppData\Local\Programs\Quarto\share\formats\docx\important.png" id="61" name="Picture"/>
                           <pic:cNvPicPr>
                             <a:picLocks noChangeArrowheads="1" noChangeAspect="1"/>
                           </pic:cNvPicPr>
                         </pic:nvPicPr>
                         <pic:blipFill>
-                          <a:blip r:embed="rId60"/>
+                          <a:blip r:embed="rId59"/>
                           <a:stretch>
                             <a:fillRect/>
                           </a:stretch>
@@ -3609,8 +3596,8 @@
         </w:tc>
       </w:tr>
     </w:tbl>
-    <w:bookmarkEnd w:id="63"/>
-    <w:bookmarkStart w:id="67" w:name="pagina1-21"/>
+    <w:bookmarkEnd w:id="62"/>
+    <w:bookmarkStart w:id="66" w:name="pagina1-21"/>
     <w:tbl>
       <w:tblPr>
         <w:tblStyle w:val="Table"/>
@@ -3652,18 +3639,18 @@
                 <wp:inline>
                   <wp:extent cx="152400" cy="152400"/>
                   <wp:effectExtent b="0" l="0" r="0" t="0"/>
-                  <wp:docPr descr="" title="" id="65" name="Picture"/>
+                  <wp:docPr descr="" title="" id="64" name="Picture"/>
                   <a:graphic>
                     <a:graphicData uri="http://schemas.openxmlformats.org/drawingml/2006/picture">
                       <pic:pic>
                         <pic:nvPicPr>
-                          <pic:cNvPr descr="C:\Users\User\AppData\Local\Programs\Quarto\share\formats\docx\note.png" id="66" name="Picture"/>
+                          <pic:cNvPr descr="C:\Users\User\AppData\Local\Programs\Quarto\share\formats\docx\note.png" id="65" name="Picture"/>
                           <pic:cNvPicPr>
                             <a:picLocks noChangeArrowheads="1" noChangeAspect="1"/>
                           </pic:cNvPicPr>
                         </pic:nvPicPr>
                         <pic:blipFill>
-                          <a:blip r:embed="rId64"/>
+                          <a:blip r:embed="rId63"/>
                           <a:stretch>
                             <a:fillRect/>
                           </a:stretch>
@@ -3826,9 +3813,9 @@
         </w:tc>
       </w:tr>
     </w:tbl>
+    <w:bookmarkEnd w:id="66"/>
+    <w:bookmarkStart w:id="67" w:name="pagina1-22"/>
     <w:bookmarkEnd w:id="67"/>
-    <w:bookmarkStart w:id="68" w:name="pagina1-22"/>
-    <w:bookmarkEnd w:id="68"/>
     <w:p>
       <w:pPr>
         <w:pStyle w:val="SourceCode"/>
@@ -3876,9 +3863,9 @@
         <w:t xml:space="preserve">================================================================================</w:t>
       </w:r>
     </w:p>
+    <w:bookmarkEnd w:id="68"/>
     <w:bookmarkEnd w:id="69"/>
-    <w:bookmarkEnd w:id="70"/>
-    <w:bookmarkStart w:id="180" w:name="página-2-growth-machine"/>
+    <w:bookmarkStart w:id="179" w:name="página-2-growth-machine"/>
     <w:p>
       <w:pPr>
         <w:pStyle w:val="Heading1"/>
@@ -3913,9 +3900,9 @@
         <w:t xml:space="preserve">Analisamos aqui o Funil de Vendas, a relação LTV/CAC e a curva de saturação dos canais de marketing.</w:t>
       </w:r>
     </w:p>
-    <w:bookmarkStart w:id="179" w:name="pagina2"/>
-    <w:bookmarkStart w:id="72" w:name="pagina2-1"/>
-    <w:bookmarkStart w:id="71" w:name="X96d6a4908f818785dc42f1f396f7aa04f444d62"/>
+    <w:bookmarkStart w:id="178" w:name="pagina2"/>
+    <w:bookmarkStart w:id="71" w:name="pagina2-1"/>
+    <w:bookmarkStart w:id="70" w:name="X96d6a4908f818785dc42f1f396f7aa04f444d62"/>
     <w:p>
       <w:pPr>
         <w:pStyle w:val="Heading2"/>
@@ -3924,10 +3911,10 @@
         <w:t xml:space="preserve">O volume de vendas sustenta a operação no cenário conservador?</w:t>
       </w:r>
     </w:p>
+    <w:bookmarkEnd w:id="70"/>
     <w:bookmarkEnd w:id="71"/>
-    <w:bookmarkEnd w:id="72"/>
-    <w:bookmarkStart w:id="74" w:name="pagina2-2"/>
-    <w:bookmarkStart w:id="73" w:name="Xf1c95410531ea9248ac1cadc3ebb6d2d0a19f37"/>
+    <w:bookmarkStart w:id="73" w:name="pagina2-2"/>
+    <w:bookmarkStart w:id="72" w:name="Xf1c95410531ea9248ac1cadc3ebb6d2d0a19f37"/>
     <w:p>
       <w:pPr>
         <w:pStyle w:val="Heading3"/>
@@ -3936,30 +3923,30 @@
         <w:t xml:space="preserve">📉 Funil de Aquisição: Conservador vs Benchmark (Log Scale)</w:t>
       </w:r>
     </w:p>
+    <w:bookmarkEnd w:id="72"/>
     <w:bookmarkEnd w:id="73"/>
-    <w:bookmarkEnd w:id="74"/>
     <w:p>
       <w:pPr>
         <w:pStyle w:val="FirstParagraph"/>
       </w:pPr>
-      <w:bookmarkStart w:id="78" w:name="pagina2-3"/>
+      <w:bookmarkStart w:id="77" w:name="pagina2-3"/>
       <w:r>
         <w:drawing>
           <wp:inline>
             <wp:extent cx="5334000" cy="2378675"/>
             <wp:effectExtent b="0" l="0" r="0" t="0"/>
-            <wp:docPr descr="" title="" id="76" name="Picture"/>
+            <wp:docPr descr="" title="" id="75" name="Picture"/>
             <a:graphic>
               <a:graphicData uri="http://schemas.openxmlformats.org/drawingml/2006/picture">
                 <pic:pic>
                   <pic:nvPicPr>
-                    <pic:cNvPr descr="relatorio_investidores_files/figure-docx/pagina2-output-3.png" id="77" name="Picture"/>
+                    <pic:cNvPr descr="relatorio_investidores_files/figure-docx/pagina2-output-3.png" id="76" name="Picture"/>
                     <pic:cNvPicPr>
                       <a:picLocks noChangeArrowheads="1" noChangeAspect="1"/>
                     </pic:cNvPicPr>
                   </pic:nvPicPr>
                   <pic:blipFill>
-                    <a:blip r:embed="rId75"/>
+                    <a:blip r:embed="rId74"/>
                     <a:stretch>
                       <a:fillRect/>
                     </a:stretch>
@@ -3985,9 +3972,9 @@
           </wp:inline>
         </w:drawing>
       </w:r>
-      <w:bookmarkEnd w:id="78"/>
+      <w:bookmarkEnd w:id="77"/>
     </w:p>
-    <w:bookmarkStart w:id="79" w:name="pagina2-4"/>
+    <w:bookmarkStart w:id="78" w:name="pagina2-4"/>
     <w:p>
       <w:r>
         <w:pict>
@@ -3995,9 +3982,9 @@
         </w:pict>
       </w:r>
     </w:p>
-    <w:bookmarkEnd w:id="79"/>
-    <w:bookmarkStart w:id="81" w:name="pagina2-5"/>
-    <w:bookmarkStart w:id="80" w:name="como-ler-este-gráfico"/>
+    <w:bookmarkEnd w:id="78"/>
+    <w:bookmarkStart w:id="80" w:name="pagina2-5"/>
+    <w:bookmarkStart w:id="79" w:name="como-ler-este-gráfico"/>
     <w:p>
       <w:pPr>
         <w:pStyle w:val="Heading4"/>
@@ -4053,10 +4040,10 @@
         <w:t xml:space="preserve">5. **Regra de Sucesso:** Se a barra escura ultrapassar ou igualar a cinza, o benchmark foi atingido.</w:t>
       </w:r>
     </w:p>
+    <w:bookmarkEnd w:id="79"/>
     <w:bookmarkEnd w:id="80"/>
-    <w:bookmarkEnd w:id="81"/>
-    <w:bookmarkStart w:id="83" w:name="pagina2-6"/>
-    <w:bookmarkStart w:id="82" w:name="a-prova-numérica"/>
+    <w:bookmarkStart w:id="82" w:name="pagina2-6"/>
+    <w:bookmarkStart w:id="81" w:name="a-prova-numérica"/>
     <w:p>
       <w:pPr>
         <w:pStyle w:val="Heading4"/>
@@ -4065,9 +4052,9 @@
         <w:t xml:space="preserve">📋 A PROVA NUMÉRICA:</w:t>
       </w:r>
     </w:p>
+    <w:bookmarkEnd w:id="81"/>
     <w:bookmarkEnd w:id="82"/>
-    <w:bookmarkEnd w:id="83"/>
-    <w:bookmarkStart w:id="84" w:name="pagina2-7"/>
+    <w:bookmarkStart w:id="83" w:name="pagina2-7"/>
     <w:tbl>
       <w:tblPr>
         <w:tblStyle w:val="Table"/>
@@ -4457,8 +4444,8 @@
         </w:tc>
       </w:tr>
     </w:tbl>
-    <w:bookmarkEnd w:id="84"/>
-    <w:bookmarkStart w:id="87" w:name="pagina2-8"/>
+    <w:bookmarkEnd w:id="83"/>
+    <w:bookmarkStart w:id="86" w:name="pagina2-8"/>
     <w:tbl>
       <w:tblPr>
         <w:tblStyle w:val="Table"/>
@@ -4500,18 +4487,18 @@
                 <wp:inline>
                   <wp:extent cx="152400" cy="152400"/>
                   <wp:effectExtent b="0" l="0" r="0" t="0"/>
-                  <wp:docPr descr="" title="" id="85" name="Picture"/>
+                  <wp:docPr descr="" title="" id="84" name="Picture"/>
                   <a:graphic>
                     <a:graphicData uri="http://schemas.openxmlformats.org/drawingml/2006/picture">
                       <pic:pic>
                         <pic:nvPicPr>
-                          <pic:cNvPr descr="C:\Users\User\AppData\Local\Programs\Quarto\share\formats\docx\tip.png" id="86" name="Picture"/>
+                          <pic:cNvPr descr="C:\Users\User\AppData\Local\Programs\Quarto\share\formats\docx\tip.png" id="85" name="Picture"/>
                           <pic:cNvPicPr>
                             <a:picLocks noChangeArrowheads="1" noChangeAspect="1"/>
                           </pic:cNvPicPr>
                         </pic:nvPicPr>
                         <pic:blipFill>
-                          <a:blip r:embed="rId52"/>
+                          <a:blip r:embed="rId51"/>
                           <a:stretch>
                             <a:fillRect/>
                           </a:stretch>
@@ -4652,8 +4639,8 @@
         </w:tc>
       </w:tr>
     </w:tbl>
-    <w:bookmarkEnd w:id="87"/>
-    <w:bookmarkStart w:id="90" w:name="pagina2-9"/>
+    <w:bookmarkEnd w:id="86"/>
+    <w:bookmarkStart w:id="89" w:name="pagina2-9"/>
     <w:tbl>
       <w:tblPr>
         <w:tblStyle w:val="Table"/>
@@ -4695,18 +4682,18 @@
                 <wp:inline>
                   <wp:extent cx="152400" cy="152400"/>
                   <wp:effectExtent b="0" l="0" r="0" t="0"/>
-                  <wp:docPr descr="" title="" id="88" name="Picture"/>
+                  <wp:docPr descr="" title="" id="87" name="Picture"/>
                   <a:graphic>
                     <a:graphicData uri="http://schemas.openxmlformats.org/drawingml/2006/picture">
                       <pic:pic>
                         <pic:nvPicPr>
-                          <pic:cNvPr descr="C:\Users\User\AppData\Local\Programs\Quarto\share\formats\docx\note.png" id="89" name="Picture"/>
+                          <pic:cNvPr descr="C:\Users\User\AppData\Local\Programs\Quarto\share\formats\docx\note.png" id="88" name="Picture"/>
                           <pic:cNvPicPr>
                             <a:picLocks noChangeArrowheads="1" noChangeAspect="1"/>
                           </pic:cNvPicPr>
                         </pic:nvPicPr>
                         <pic:blipFill>
-                          <a:blip r:embed="rId64"/>
+                          <a:blip r:embed="rId63"/>
                           <a:stretch>
                             <a:fillRect/>
                           </a:stretch>
@@ -4815,11 +4802,11 @@
         </w:tc>
       </w:tr>
     </w:tbl>
+    <w:bookmarkEnd w:id="89"/>
+    <w:bookmarkStart w:id="90" w:name="pagina2-10"/>
     <w:bookmarkEnd w:id="90"/>
-    <w:bookmarkStart w:id="91" w:name="pagina2-10"/>
-    <w:bookmarkEnd w:id="91"/>
-    <w:bookmarkStart w:id="93" w:name="pagina2-11"/>
-    <w:bookmarkStart w:id="92" w:name="o-negócio-para-em-pé-saúde-unitária"/>
+    <w:bookmarkStart w:id="92" w:name="pagina2-11"/>
+    <w:bookmarkStart w:id="91" w:name="o-negócio-para-em-pé-saúde-unitária"/>
     <w:p>
       <w:pPr>
         <w:pStyle w:val="Heading2"/>
@@ -4828,10 +4815,10 @@
         <w:t xml:space="preserve">O negócio para em pé? (Saúde Unitária)</w:t>
       </w:r>
     </w:p>
+    <w:bookmarkEnd w:id="91"/>
     <w:bookmarkEnd w:id="92"/>
-    <w:bookmarkEnd w:id="93"/>
-    <w:bookmarkStart w:id="95" w:name="pagina2-12"/>
-    <w:bookmarkStart w:id="94" w:name="evolução-ltvcac-vs-zonas-de-risco"/>
+    <w:bookmarkStart w:id="94" w:name="pagina2-12"/>
+    <w:bookmarkStart w:id="93" w:name="evolução-ltvcac-vs-zonas-de-risco"/>
     <w:p>
       <w:pPr>
         <w:pStyle w:val="Heading3"/>
@@ -4840,30 +4827,30 @@
         <w:t xml:space="preserve">📉 Evolução LTV/CAC vs Zonas de Risco</w:t>
       </w:r>
     </w:p>
+    <w:bookmarkEnd w:id="93"/>
     <w:bookmarkEnd w:id="94"/>
-    <w:bookmarkEnd w:id="95"/>
     <w:p>
       <w:pPr>
         <w:pStyle w:val="FirstParagraph"/>
       </w:pPr>
-      <w:bookmarkStart w:id="99" w:name="pagina2-13"/>
+      <w:bookmarkStart w:id="98" w:name="pagina2-13"/>
       <w:r>
         <w:drawing>
           <wp:inline>
             <wp:extent cx="5334000" cy="2559275"/>
             <wp:effectExtent b="0" l="0" r="0" t="0"/>
-            <wp:docPr descr="" title="" id="97" name="Picture"/>
+            <wp:docPr descr="" title="" id="96" name="Picture"/>
             <a:graphic>
               <a:graphicData uri="http://schemas.openxmlformats.org/drawingml/2006/picture">
                 <pic:pic>
                   <pic:nvPicPr>
-                    <pic:cNvPr descr="relatorio_investidores_files/figure-docx/pagina2-output-13.png" id="98" name="Picture"/>
+                    <pic:cNvPr descr="relatorio_investidores_files/figure-docx/pagina2-output-13.png" id="97" name="Picture"/>
                     <pic:cNvPicPr>
                       <a:picLocks noChangeArrowheads="1" noChangeAspect="1"/>
                     </pic:cNvPicPr>
                   </pic:nvPicPr>
                   <pic:blipFill>
-                    <a:blip r:embed="rId96"/>
+                    <a:blip r:embed="rId95"/>
                     <a:stretch>
                       <a:fillRect/>
                     </a:stretch>
@@ -4889,9 +4876,9 @@
           </wp:inline>
         </w:drawing>
       </w:r>
-      <w:bookmarkEnd w:id="99"/>
+      <w:bookmarkEnd w:id="98"/>
     </w:p>
-    <w:bookmarkStart w:id="100" w:name="pagina2-14"/>
+    <w:bookmarkStart w:id="99" w:name="pagina2-14"/>
     <w:p>
       <w:r>
         <w:pict>
@@ -4899,9 +4886,9 @@
         </w:pict>
       </w:r>
     </w:p>
-    <w:bookmarkEnd w:id="100"/>
-    <w:bookmarkStart w:id="102" w:name="pagina2-15"/>
-    <w:bookmarkStart w:id="101" w:name="como-ler-este-gráfico-1"/>
+    <w:bookmarkEnd w:id="99"/>
+    <w:bookmarkStart w:id="101" w:name="pagina2-15"/>
+    <w:bookmarkStart w:id="100" w:name="como-ler-este-gráfico-1"/>
     <w:p>
       <w:pPr>
         <w:pStyle w:val="Heading4"/>
@@ -4948,10 +4935,10 @@
         <w:t xml:space="preserve">4. **Zona Vermelha (&lt;1x):** Prejuízo. Custa mais trazer o cliente do que ele rende.</w:t>
       </w:r>
     </w:p>
+    <w:bookmarkEnd w:id="100"/>
     <w:bookmarkEnd w:id="101"/>
-    <w:bookmarkEnd w:id="102"/>
-    <w:bookmarkStart w:id="104" w:name="pagina2-16"/>
-    <w:bookmarkStart w:id="103" w:name="a-prova-numérica-1"/>
+    <w:bookmarkStart w:id="103" w:name="pagina2-16"/>
+    <w:bookmarkStart w:id="102" w:name="a-prova-numérica-1"/>
     <w:p>
       <w:pPr>
         <w:pStyle w:val="Heading4"/>
@@ -4960,9 +4947,9 @@
         <w:t xml:space="preserve">📋 A PROVA NUMÉRICA:</w:t>
       </w:r>
     </w:p>
+    <w:bookmarkEnd w:id="102"/>
     <w:bookmarkEnd w:id="103"/>
-    <w:bookmarkEnd w:id="104"/>
-    <w:bookmarkStart w:id="105" w:name="pagina2-17"/>
+    <w:bookmarkStart w:id="104" w:name="pagina2-17"/>
     <w:tbl>
       <w:tblPr>
         <w:tblStyle w:val="Table"/>
@@ -5291,8 +5278,8 @@
         </w:tc>
       </w:tr>
     </w:tbl>
-    <w:bookmarkEnd w:id="105"/>
-    <w:bookmarkStart w:id="108" w:name="pagina2-18"/>
+    <w:bookmarkEnd w:id="104"/>
+    <w:bookmarkStart w:id="107" w:name="pagina2-18"/>
     <w:tbl>
       <w:tblPr>
         <w:tblStyle w:val="Table"/>
@@ -5334,18 +5321,18 @@
                 <wp:inline>
                   <wp:extent cx="152400" cy="152400"/>
                   <wp:effectExtent b="0" l="0" r="0" t="0"/>
-                  <wp:docPr descr="" title="" id="106" name="Picture"/>
+                  <wp:docPr descr="" title="" id="105" name="Picture"/>
                   <a:graphic>
                     <a:graphicData uri="http://schemas.openxmlformats.org/drawingml/2006/picture">
                       <pic:pic>
                         <pic:nvPicPr>
-                          <pic:cNvPr descr="C:\Users\User\AppData\Local\Programs\Quarto\share\formats\docx\tip.png" id="107" name="Picture"/>
+                          <pic:cNvPr descr="C:\Users\User\AppData\Local\Programs\Quarto\share\formats\docx\tip.png" id="106" name="Picture"/>
                           <pic:cNvPicPr>
                             <a:picLocks noChangeArrowheads="1" noChangeAspect="1"/>
                           </pic:cNvPicPr>
                         </pic:nvPicPr>
                         <pic:blipFill>
-                          <a:blip r:embed="rId52"/>
+                          <a:blip r:embed="rId51"/>
                           <a:stretch>
                             <a:fillRect/>
                           </a:stretch>
@@ -5486,8 +5473,8 @@
         </w:tc>
       </w:tr>
     </w:tbl>
-    <w:bookmarkEnd w:id="108"/>
-    <w:bookmarkStart w:id="111" w:name="pagina2-19"/>
+    <w:bookmarkEnd w:id="107"/>
+    <w:bookmarkStart w:id="110" w:name="pagina2-19"/>
     <w:tbl>
       <w:tblPr>
         <w:tblStyle w:val="Table"/>
@@ -5529,18 +5516,18 @@
                 <wp:inline>
                   <wp:extent cx="152400" cy="152400"/>
                   <wp:effectExtent b="0" l="0" r="0" t="0"/>
-                  <wp:docPr descr="" title="" id="109" name="Picture"/>
+                  <wp:docPr descr="" title="" id="108" name="Picture"/>
                   <a:graphic>
                     <a:graphicData uri="http://schemas.openxmlformats.org/drawingml/2006/picture">
                       <pic:pic>
                         <pic:nvPicPr>
-                          <pic:cNvPr descr="C:\Users\User\AppData\Local\Programs\Quarto\share\formats\docx\note.png" id="110" name="Picture"/>
+                          <pic:cNvPr descr="C:\Users\User\AppData\Local\Programs\Quarto\share\formats\docx\note.png" id="109" name="Picture"/>
                           <pic:cNvPicPr>
                             <a:picLocks noChangeArrowheads="1" noChangeAspect="1"/>
                           </pic:cNvPicPr>
                         </pic:nvPicPr>
                         <pic:blipFill>
-                          <a:blip r:embed="rId64"/>
+                          <a:blip r:embed="rId63"/>
                           <a:stretch>
                             <a:fillRect/>
                           </a:stretch>
@@ -5658,11 +5645,11 @@
         </w:tc>
       </w:tr>
     </w:tbl>
+    <w:bookmarkEnd w:id="110"/>
+    <w:bookmarkStart w:id="111" w:name="pagina2-20"/>
     <w:bookmarkEnd w:id="111"/>
-    <w:bookmarkStart w:id="112" w:name="pagina2-20"/>
-    <w:bookmarkEnd w:id="112"/>
-    <w:bookmarkStart w:id="114" w:name="pagina2-21"/>
-    <w:bookmarkStart w:id="113" w:name="existe-descontrole-tático-de-custos"/>
+    <w:bookmarkStart w:id="113" w:name="pagina2-21"/>
+    <w:bookmarkStart w:id="112" w:name="existe-descontrole-tático-de-custos"/>
     <w:p>
       <w:pPr>
         <w:pStyle w:val="Heading2"/>
@@ -5671,10 +5658,10 @@
         <w:t xml:space="preserve">Existe descontrole tático de custos?</w:t>
       </w:r>
     </w:p>
+    <w:bookmarkEnd w:id="112"/>
     <w:bookmarkEnd w:id="113"/>
-    <w:bookmarkEnd w:id="114"/>
-    <w:bookmarkStart w:id="116" w:name="pagina2-22"/>
-    <w:bookmarkStart w:id="115" w:name="X82d8f77aa129853a76d160bc6ea826ca68c3568"/>
+    <w:bookmarkStart w:id="115" w:name="pagina2-22"/>
+    <w:bookmarkStart w:id="114" w:name="X82d8f77aa129853a76d160bc6ea826ca68c3568"/>
     <w:p>
       <w:pPr>
         <w:pStyle w:val="Heading3"/>
@@ -5683,30 +5670,30 @@
         <w:t xml:space="preserve">📉 Statistical Process Control (SPC): Volatilidade Semanal do CAC</w:t>
       </w:r>
     </w:p>
+    <w:bookmarkEnd w:id="114"/>
     <w:bookmarkEnd w:id="115"/>
-    <w:bookmarkEnd w:id="116"/>
     <w:p>
       <w:pPr>
         <w:pStyle w:val="FirstParagraph"/>
       </w:pPr>
-      <w:bookmarkStart w:id="120" w:name="pagina2-23"/>
+      <w:bookmarkStart w:id="119" w:name="pagina2-23"/>
       <w:r>
         <w:drawing>
           <wp:inline>
             <wp:extent cx="5334000" cy="2549912"/>
             <wp:effectExtent b="0" l="0" r="0" t="0"/>
-            <wp:docPr descr="" title="" id="118" name="Picture"/>
+            <wp:docPr descr="" title="" id="117" name="Picture"/>
             <a:graphic>
               <a:graphicData uri="http://schemas.openxmlformats.org/drawingml/2006/picture">
                 <pic:pic>
                   <pic:nvPicPr>
-                    <pic:cNvPr descr="relatorio_investidores_files/figure-docx/pagina2-output-23.png" id="119" name="Picture"/>
+                    <pic:cNvPr descr="relatorio_investidores_files/figure-docx/pagina2-output-23.png" id="118" name="Picture"/>
                     <pic:cNvPicPr>
                       <a:picLocks noChangeArrowheads="1" noChangeAspect="1"/>
                     </pic:cNvPicPr>
                   </pic:nvPicPr>
                   <pic:blipFill>
-                    <a:blip r:embed="rId117"/>
+                    <a:blip r:embed="rId116"/>
                     <a:stretch>
                       <a:fillRect/>
                     </a:stretch>
@@ -5732,9 +5719,9 @@
           </wp:inline>
         </w:drawing>
       </w:r>
-      <w:bookmarkEnd w:id="120"/>
+      <w:bookmarkEnd w:id="119"/>
     </w:p>
-    <w:bookmarkStart w:id="121" w:name="pagina2-24"/>
+    <w:bookmarkStart w:id="120" w:name="pagina2-24"/>
     <w:p>
       <w:r>
         <w:pict>
@@ -5742,9 +5729,9 @@
         </w:pict>
       </w:r>
     </w:p>
-    <w:bookmarkEnd w:id="121"/>
-    <w:bookmarkStart w:id="123" w:name="pagina2-25"/>
-    <w:bookmarkStart w:id="122" w:name="como-ler-este-gráfico-2"/>
+    <w:bookmarkEnd w:id="120"/>
+    <w:bookmarkStart w:id="122" w:name="pagina2-25"/>
+    <w:bookmarkStart w:id="121" w:name="como-ler-este-gráfico-2"/>
     <w:p>
       <w:pPr>
         <w:pStyle w:val="Heading4"/>
@@ -5791,10 +5778,10 @@
         <w:t xml:space="preserve">4. **Objetivo:** Manter a linha preta dentro do túnel cinza.</w:t>
       </w:r>
     </w:p>
+    <w:bookmarkEnd w:id="121"/>
     <w:bookmarkEnd w:id="122"/>
-    <w:bookmarkEnd w:id="123"/>
-    <w:bookmarkStart w:id="125" w:name="pagina2-26"/>
-    <w:bookmarkStart w:id="124" w:name="a-prova-numérica-2"/>
+    <w:bookmarkStart w:id="124" w:name="pagina2-26"/>
+    <w:bookmarkStart w:id="123" w:name="a-prova-numérica-2"/>
     <w:p>
       <w:pPr>
         <w:pStyle w:val="Heading4"/>
@@ -5803,9 +5790,9 @@
         <w:t xml:space="preserve">📋 A PROVA NUMÉRICA:</w:t>
       </w:r>
     </w:p>
+    <w:bookmarkEnd w:id="123"/>
     <w:bookmarkEnd w:id="124"/>
-    <w:bookmarkEnd w:id="125"/>
-    <w:bookmarkStart w:id="126" w:name="pagina2-27"/>
+    <w:bookmarkStart w:id="125" w:name="pagina2-27"/>
     <w:tbl>
       <w:tblPr>
         <w:tblStyle w:val="Table"/>
@@ -6196,8 +6183,8 @@
         </w:tc>
       </w:tr>
     </w:tbl>
-    <w:bookmarkEnd w:id="126"/>
-    <w:bookmarkStart w:id="129" w:name="pagina2-28"/>
+    <w:bookmarkEnd w:id="125"/>
+    <w:bookmarkStart w:id="128" w:name="pagina2-28"/>
     <w:tbl>
       <w:tblPr>
         <w:tblStyle w:val="Table"/>
@@ -6239,18 +6226,18 @@
                 <wp:inline>
                   <wp:extent cx="152400" cy="152400"/>
                   <wp:effectExtent b="0" l="0" r="0" t="0"/>
-                  <wp:docPr descr="" title="" id="127" name="Picture"/>
+                  <wp:docPr descr="" title="" id="126" name="Picture"/>
                   <a:graphic>
                     <a:graphicData uri="http://schemas.openxmlformats.org/drawingml/2006/picture">
                       <pic:pic>
                         <pic:nvPicPr>
-                          <pic:cNvPr descr="C:\Users\User\AppData\Local\Programs\Quarto\share\formats\docx\tip.png" id="128" name="Picture"/>
+                          <pic:cNvPr descr="C:\Users\User\AppData\Local\Programs\Quarto\share\formats\docx\tip.png" id="127" name="Picture"/>
                           <pic:cNvPicPr>
                             <a:picLocks noChangeArrowheads="1" noChangeAspect="1"/>
                           </pic:cNvPicPr>
                         </pic:nvPicPr>
                         <pic:blipFill>
-                          <a:blip r:embed="rId52"/>
+                          <a:blip r:embed="rId51"/>
                           <a:stretch>
                             <a:fillRect/>
                           </a:stretch>
@@ -6391,8 +6378,8 @@
         </w:tc>
       </w:tr>
     </w:tbl>
-    <w:bookmarkEnd w:id="129"/>
-    <w:bookmarkStart w:id="132" w:name="pagina2-29"/>
+    <w:bookmarkEnd w:id="128"/>
+    <w:bookmarkStart w:id="131" w:name="pagina2-29"/>
     <w:tbl>
       <w:tblPr>
         <w:tblStyle w:val="Table"/>
@@ -6434,18 +6421,18 @@
                 <wp:inline>
                   <wp:extent cx="152400" cy="152400"/>
                   <wp:effectExtent b="0" l="0" r="0" t="0"/>
-                  <wp:docPr descr="" title="" id="130" name="Picture"/>
+                  <wp:docPr descr="" title="" id="129" name="Picture"/>
                   <a:graphic>
                     <a:graphicData uri="http://schemas.openxmlformats.org/drawingml/2006/picture">
                       <pic:pic>
                         <pic:nvPicPr>
-                          <pic:cNvPr descr="C:\Users\User\AppData\Local\Programs\Quarto\share\formats\docx\note.png" id="131" name="Picture"/>
+                          <pic:cNvPr descr="C:\Users\User\AppData\Local\Programs\Quarto\share\formats\docx\note.png" id="130" name="Picture"/>
                           <pic:cNvPicPr>
                             <a:picLocks noChangeArrowheads="1" noChangeAspect="1"/>
                           </pic:cNvPicPr>
                         </pic:nvPicPr>
                         <pic:blipFill>
-                          <a:blip r:embed="rId64"/>
+                          <a:blip r:embed="rId63"/>
                           <a:stretch>
                             <a:fillRect/>
                           </a:stretch>
@@ -6554,11 +6541,11 @@
         </w:tc>
       </w:tr>
     </w:tbl>
+    <w:bookmarkEnd w:id="131"/>
+    <w:bookmarkStart w:id="132" w:name="pagina2-30"/>
     <w:bookmarkEnd w:id="132"/>
-    <w:bookmarkStart w:id="133" w:name="pagina2-30"/>
-    <w:bookmarkEnd w:id="133"/>
-    <w:bookmarkStart w:id="135" w:name="pagina2-31"/>
-    <w:bookmarkStart w:id="134" w:name="se-dobrar-o-marketing-dobra-a-venda"/>
+    <w:bookmarkStart w:id="134" w:name="pagina2-31"/>
+    <w:bookmarkStart w:id="133" w:name="se-dobrar-o-marketing-dobra-a-venda"/>
     <w:p>
       <w:pPr>
         <w:pStyle w:val="Heading2"/>
@@ -6567,10 +6554,10 @@
         <w:t xml:space="preserve">Se dobrar o marketing, dobra a venda?</w:t>
       </w:r>
     </w:p>
+    <w:bookmarkEnd w:id="133"/>
     <w:bookmarkEnd w:id="134"/>
-    <w:bookmarkEnd w:id="135"/>
-    <w:bookmarkStart w:id="137" w:name="pagina2-32"/>
-    <w:bookmarkStart w:id="136" w:name="curva-de-escala-e-elasticidade-de-canal"/>
+    <w:bookmarkStart w:id="136" w:name="pagina2-32"/>
+    <w:bookmarkStart w:id="135" w:name="curva-de-escala-e-elasticidade-de-canal"/>
     <w:p>
       <w:pPr>
         <w:pStyle w:val="Heading3"/>
@@ -6579,30 +6566,30 @@
         <w:t xml:space="preserve">📉 Curva de Escala e Elasticidade de Canal</w:t>
       </w:r>
     </w:p>
+    <w:bookmarkEnd w:id="135"/>
     <w:bookmarkEnd w:id="136"/>
-    <w:bookmarkEnd w:id="137"/>
     <w:p>
       <w:pPr>
         <w:pStyle w:val="FirstParagraph"/>
       </w:pPr>
-      <w:bookmarkStart w:id="141" w:name="pagina2-33"/>
+      <w:bookmarkStart w:id="140" w:name="pagina2-33"/>
       <w:r>
         <w:drawing>
           <wp:inline>
             <wp:extent cx="5334000" cy="2729671"/>
             <wp:effectExtent b="0" l="0" r="0" t="0"/>
-            <wp:docPr descr="" title="" id="139" name="Picture"/>
+            <wp:docPr descr="" title="" id="138" name="Picture"/>
             <a:graphic>
               <a:graphicData uri="http://schemas.openxmlformats.org/drawingml/2006/picture">
                 <pic:pic>
                   <pic:nvPicPr>
-                    <pic:cNvPr descr="relatorio_investidores_files/figure-docx/pagina2-output-33.png" id="140" name="Picture"/>
+                    <pic:cNvPr descr="relatorio_investidores_files/figure-docx/pagina2-output-33.png" id="139" name="Picture"/>
                     <pic:cNvPicPr>
                       <a:picLocks noChangeArrowheads="1" noChangeAspect="1"/>
                     </pic:cNvPicPr>
                   </pic:nvPicPr>
                   <pic:blipFill>
-                    <a:blip r:embed="rId138"/>
+                    <a:blip r:embed="rId137"/>
                     <a:stretch>
                       <a:fillRect/>
                     </a:stretch>
@@ -6628,9 +6615,9 @@
           </wp:inline>
         </w:drawing>
       </w:r>
-      <w:bookmarkEnd w:id="141"/>
+      <w:bookmarkEnd w:id="140"/>
     </w:p>
-    <w:bookmarkStart w:id="142" w:name="pagina2-34"/>
+    <w:bookmarkStart w:id="141" w:name="pagina2-34"/>
     <w:p>
       <w:r>
         <w:pict>
@@ -6638,9 +6625,9 @@
         </w:pict>
       </w:r>
     </w:p>
-    <w:bookmarkEnd w:id="142"/>
-    <w:bookmarkStart w:id="144" w:name="pagina2-35"/>
-    <w:bookmarkStart w:id="143" w:name="como-ler-este-gráfico-3"/>
+    <w:bookmarkEnd w:id="141"/>
+    <w:bookmarkStart w:id="143" w:name="pagina2-35"/>
+    <w:bookmarkStart w:id="142" w:name="como-ler-este-gráfico-3"/>
     <w:p>
       <w:pPr>
         <w:pStyle w:val="Heading4"/>
@@ -6687,10 +6674,10 @@
         <w:t xml:space="preserve">4. **Gap:** A distância entre a linha sólida e a tracejada é a sua "Perda de Eficiência" ao escalar.</w:t>
       </w:r>
     </w:p>
+    <w:bookmarkEnd w:id="142"/>
     <w:bookmarkEnd w:id="143"/>
-    <w:bookmarkEnd w:id="144"/>
-    <w:bookmarkStart w:id="146" w:name="pagina2-36"/>
-    <w:bookmarkStart w:id="145" w:name="a-prova-numérica-3"/>
+    <w:bookmarkStart w:id="145" w:name="pagina2-36"/>
+    <w:bookmarkStart w:id="144" w:name="a-prova-numérica-3"/>
     <w:p>
       <w:pPr>
         <w:pStyle w:val="Heading4"/>
@@ -6699,9 +6686,9 @@
         <w:t xml:space="preserve">📋 A PROVA NUMÉRICA:</w:t>
       </w:r>
     </w:p>
+    <w:bookmarkEnd w:id="144"/>
     <w:bookmarkEnd w:id="145"/>
-    <w:bookmarkEnd w:id="146"/>
-    <w:bookmarkStart w:id="147" w:name="pagina2-37"/>
+    <w:bookmarkStart w:id="146" w:name="pagina2-37"/>
     <w:p>
       <w:pPr>
         <w:pStyle w:val="FirstParagraph"/>
@@ -6736,8 +6723,8 @@
         <w:t xml:space="preserve">| R$ 21.689,32 | 89 | 132 | 32.4% | RETORNOS DECRESCENTES |</w:t>
       </w:r>
     </w:p>
-    <w:bookmarkEnd w:id="147"/>
-    <w:bookmarkStart w:id="150" w:name="pagina2-38"/>
+    <w:bookmarkEnd w:id="146"/>
+    <w:bookmarkStart w:id="149" w:name="pagina2-38"/>
     <w:tbl>
       <w:tblPr>
         <w:tblStyle w:val="Table"/>
@@ -6779,18 +6766,18 @@
                 <wp:inline>
                   <wp:extent cx="152400" cy="152400"/>
                   <wp:effectExtent b="0" l="0" r="0" t="0"/>
-                  <wp:docPr descr="" title="" id="148" name="Picture"/>
+                  <wp:docPr descr="" title="" id="147" name="Picture"/>
                   <a:graphic>
                     <a:graphicData uri="http://schemas.openxmlformats.org/drawingml/2006/picture">
                       <pic:pic>
                         <pic:nvPicPr>
-                          <pic:cNvPr descr="C:\Users\User\AppData\Local\Programs\Quarto\share\formats\docx\tip.png" id="149" name="Picture"/>
+                          <pic:cNvPr descr="C:\Users\User\AppData\Local\Programs\Quarto\share\formats\docx\tip.png" id="148" name="Picture"/>
                           <pic:cNvPicPr>
                             <a:picLocks noChangeArrowheads="1" noChangeAspect="1"/>
                           </pic:cNvPicPr>
                         </pic:nvPicPr>
                         <pic:blipFill>
-                          <a:blip r:embed="rId52"/>
+                          <a:blip r:embed="rId51"/>
                           <a:stretch>
                             <a:fillRect/>
                           </a:stretch>
@@ -6943,8 +6930,8 @@
         </w:tc>
       </w:tr>
     </w:tbl>
-    <w:bookmarkEnd w:id="150"/>
-    <w:bookmarkStart w:id="153" w:name="pagina2-39"/>
+    <w:bookmarkEnd w:id="149"/>
+    <w:bookmarkStart w:id="152" w:name="pagina2-39"/>
     <w:tbl>
       <w:tblPr>
         <w:tblStyle w:val="Table"/>
@@ -6986,18 +6973,18 @@
                 <wp:inline>
                   <wp:extent cx="152400" cy="152400"/>
                   <wp:effectExtent b="0" l="0" r="0" t="0"/>
-                  <wp:docPr descr="" title="" id="151" name="Picture"/>
+                  <wp:docPr descr="" title="" id="150" name="Picture"/>
                   <a:graphic>
                     <a:graphicData uri="http://schemas.openxmlformats.org/drawingml/2006/picture">
                       <pic:pic>
                         <pic:nvPicPr>
-                          <pic:cNvPr descr="C:\Users\User\AppData\Local\Programs\Quarto\share\formats\docx\note.png" id="152" name="Picture"/>
+                          <pic:cNvPr descr="C:\Users\User\AppData\Local\Programs\Quarto\share\formats\docx\note.png" id="151" name="Picture"/>
                           <pic:cNvPicPr>
                             <a:picLocks noChangeArrowheads="1" noChangeAspect="1"/>
                           </pic:cNvPicPr>
                         </pic:nvPicPr>
                         <pic:blipFill>
-                          <a:blip r:embed="rId64"/>
+                          <a:blip r:embed="rId63"/>
                           <a:stretch>
                             <a:fillRect/>
                           </a:stretch>
@@ -7088,11 +7075,11 @@
         </w:tc>
       </w:tr>
     </w:tbl>
+    <w:bookmarkEnd w:id="152"/>
+    <w:bookmarkStart w:id="153" w:name="pagina2-40"/>
     <w:bookmarkEnd w:id="153"/>
-    <w:bookmarkStart w:id="154" w:name="pagina2-40"/>
-    <w:bookmarkEnd w:id="154"/>
-    <w:bookmarkStart w:id="156" w:name="pagina2-41"/>
-    <w:bookmarkStart w:id="155" w:name="X0242aa2cd5c6dadfa7d222599db7f5681a7c98c"/>
+    <w:bookmarkStart w:id="155" w:name="pagina2-41"/>
+    <w:bookmarkStart w:id="154" w:name="X0242aa2cd5c6dadfa7d222599db7f5681a7c98c"/>
     <w:p>
       <w:pPr>
         <w:pStyle w:val="Heading2"/>
@@ -7101,10 +7088,10 @@
         <w:t xml:space="preserve">Quanto dinheiro estamos perdendo pelo ralo?</w:t>
       </w:r>
     </w:p>
+    <w:bookmarkEnd w:id="154"/>
     <w:bookmarkEnd w:id="155"/>
-    <w:bookmarkEnd w:id="156"/>
-    <w:bookmarkStart w:id="158" w:name="pagina2-42"/>
-    <w:bookmarkStart w:id="157" w:name="X0f5d044a9c268cebc285f0dfb09d1528caf61f7"/>
+    <w:bookmarkStart w:id="157" w:name="pagina2-42"/>
+    <w:bookmarkStart w:id="156" w:name="X0f5d044a9c268cebc285f0dfb09d1528caf61f7"/>
     <w:p>
       <w:pPr>
         <w:pStyle w:val="Heading3"/>
@@ -7113,30 +7100,30 @@
         <w:t xml:space="preserve">📉 Análise de Vazamento: Net MRR Growth &amp; Churn Cost</w:t>
       </w:r>
     </w:p>
+    <w:bookmarkEnd w:id="156"/>
     <w:bookmarkEnd w:id="157"/>
-    <w:bookmarkEnd w:id="158"/>
     <w:p>
       <w:pPr>
         <w:pStyle w:val="FirstParagraph"/>
       </w:pPr>
-      <w:bookmarkStart w:id="162" w:name="pagina2-43"/>
+      <w:bookmarkStart w:id="161" w:name="pagina2-43"/>
       <w:r>
         <w:drawing>
           <wp:inline>
             <wp:extent cx="5334000" cy="2501110"/>
             <wp:effectExtent b="0" l="0" r="0" t="0"/>
-            <wp:docPr descr="" title="" id="160" name="Picture"/>
+            <wp:docPr descr="" title="" id="159" name="Picture"/>
             <a:graphic>
               <a:graphicData uri="http://schemas.openxmlformats.org/drawingml/2006/picture">
                 <pic:pic>
                   <pic:nvPicPr>
-                    <pic:cNvPr descr="relatorio_investidores_files/figure-docx/pagina2-output-43.png" id="161" name="Picture"/>
+                    <pic:cNvPr descr="relatorio_investidores_files/figure-docx/pagina2-output-43.png" id="160" name="Picture"/>
                     <pic:cNvPicPr>
                       <a:picLocks noChangeArrowheads="1" noChangeAspect="1"/>
                     </pic:cNvPicPr>
                   </pic:nvPicPr>
                   <pic:blipFill>
-                    <a:blip r:embed="rId159"/>
+                    <a:blip r:embed="rId158"/>
                     <a:stretch>
                       <a:fillRect/>
                     </a:stretch>
@@ -7162,9 +7149,9 @@
           </wp:inline>
         </w:drawing>
       </w:r>
-      <w:bookmarkEnd w:id="162"/>
+      <w:bookmarkEnd w:id="161"/>
     </w:p>
-    <w:bookmarkStart w:id="163" w:name="pagina2-44"/>
+    <w:bookmarkStart w:id="162" w:name="pagina2-44"/>
     <w:p>
       <w:r>
         <w:pict>
@@ -7172,9 +7159,9 @@
         </w:pict>
       </w:r>
     </w:p>
-    <w:bookmarkEnd w:id="163"/>
-    <w:bookmarkStart w:id="165" w:name="pagina2-45"/>
-    <w:bookmarkStart w:id="164" w:name="como-ler-este-gráfico-4"/>
+    <w:bookmarkEnd w:id="162"/>
+    <w:bookmarkStart w:id="164" w:name="pagina2-45"/>
+    <w:bookmarkStart w:id="163" w:name="como-ler-este-gráfico-4"/>
     <w:p>
       <w:pPr>
         <w:pStyle w:val="Heading4"/>
@@ -7221,10 +7208,10 @@
         <w:t xml:space="preserve">4. **Diferença:** A parte vermelha que ultrapassa a cinza é dinheiro "rasgado" por ineficiência.</w:t>
       </w:r>
     </w:p>
+    <w:bookmarkEnd w:id="163"/>
     <w:bookmarkEnd w:id="164"/>
-    <w:bookmarkEnd w:id="165"/>
-    <w:bookmarkStart w:id="167" w:name="pagina2-46"/>
-    <w:bookmarkStart w:id="166" w:name="a-prova-numérica-4"/>
+    <w:bookmarkStart w:id="166" w:name="pagina2-46"/>
+    <w:bookmarkStart w:id="165" w:name="a-prova-numérica-4"/>
     <w:p>
       <w:pPr>
         <w:pStyle w:val="Heading4"/>
@@ -7233,9 +7220,9 @@
         <w:t xml:space="preserve">📋 A PROVA NUMÉRICA:</w:t>
       </w:r>
     </w:p>
+    <w:bookmarkEnd w:id="165"/>
     <w:bookmarkEnd w:id="166"/>
-    <w:bookmarkEnd w:id="167"/>
-    <w:bookmarkStart w:id="168" w:name="pagina2-47"/>
+    <w:bookmarkStart w:id="167" w:name="pagina2-47"/>
     <w:tbl>
       <w:tblPr>
         <w:tblStyle w:val="Table"/>
@@ -7625,8 +7612,8 @@
         </w:tc>
       </w:tr>
     </w:tbl>
-    <w:bookmarkEnd w:id="168"/>
-    <w:bookmarkStart w:id="171" w:name="pagina2-48"/>
+    <w:bookmarkEnd w:id="167"/>
+    <w:bookmarkStart w:id="170" w:name="pagina2-48"/>
     <w:tbl>
       <w:tblPr>
         <w:tblStyle w:val="Table"/>
@@ -7668,18 +7655,18 @@
                 <wp:inline>
                   <wp:extent cx="152400" cy="152400"/>
                   <wp:effectExtent b="0" l="0" r="0" t="0"/>
-                  <wp:docPr descr="" title="" id="169" name="Picture"/>
+                  <wp:docPr descr="" title="" id="168" name="Picture"/>
                   <a:graphic>
                     <a:graphicData uri="http://schemas.openxmlformats.org/drawingml/2006/picture">
                       <pic:pic>
                         <pic:nvPicPr>
-                          <pic:cNvPr descr="C:\Users\User\AppData\Local\Programs\Quarto\share\formats\docx\tip.png" id="170" name="Picture"/>
+                          <pic:cNvPr descr="C:\Users\User\AppData\Local\Programs\Quarto\share\formats\docx\tip.png" id="169" name="Picture"/>
                           <pic:cNvPicPr>
                             <a:picLocks noChangeArrowheads="1" noChangeAspect="1"/>
                           </pic:cNvPicPr>
                         </pic:nvPicPr>
                         <pic:blipFill>
-                          <a:blip r:embed="rId52"/>
+                          <a:blip r:embed="rId51"/>
                           <a:stretch>
                             <a:fillRect/>
                           </a:stretch>
@@ -7820,8 +7807,8 @@
         </w:tc>
       </w:tr>
     </w:tbl>
-    <w:bookmarkEnd w:id="171"/>
-    <w:bookmarkStart w:id="174" w:name="pagina2-49"/>
+    <w:bookmarkEnd w:id="170"/>
+    <w:bookmarkStart w:id="173" w:name="pagina2-49"/>
     <w:tbl>
       <w:tblPr>
         <w:tblStyle w:val="Table"/>
@@ -7863,18 +7850,18 @@
                 <wp:inline>
                   <wp:extent cx="152400" cy="152400"/>
                   <wp:effectExtent b="0" l="0" r="0" t="0"/>
-                  <wp:docPr descr="" title="" id="172" name="Picture"/>
+                  <wp:docPr descr="" title="" id="171" name="Picture"/>
                   <a:graphic>
                     <a:graphicData uri="http://schemas.openxmlformats.org/drawingml/2006/picture">
                       <pic:pic>
                         <pic:nvPicPr>
-                          <pic:cNvPr descr="C:\Users\User\AppData\Local\Programs\Quarto\share\formats\docx\note.png" id="173" name="Picture"/>
+                          <pic:cNvPr descr="C:\Users\User\AppData\Local\Programs\Quarto\share\formats\docx\note.png" id="172" name="Picture"/>
                           <pic:cNvPicPr>
                             <a:picLocks noChangeArrowheads="1" noChangeAspect="1"/>
                           </pic:cNvPicPr>
                         </pic:nvPicPr>
                         <pic:blipFill>
-                          <a:blip r:embed="rId64"/>
+                          <a:blip r:embed="rId63"/>
                           <a:stretch>
                             <a:fillRect/>
                           </a:stretch>
@@ -7974,10 +7961,10 @@
         </w:tc>
       </w:tr>
     </w:tbl>
+    <w:bookmarkEnd w:id="173"/>
+    <w:bookmarkStart w:id="174" w:name="pagina2-50"/>
     <w:bookmarkEnd w:id="174"/>
-    <w:bookmarkStart w:id="175" w:name="pagina2-50"/>
-    <w:bookmarkEnd w:id="175"/>
-    <w:bookmarkStart w:id="178" w:name="pagina2-51"/>
+    <w:bookmarkStart w:id="177" w:name="pagina2-51"/>
     <w:tbl>
       <w:tblPr>
         <w:tblStyle w:val="Table"/>
@@ -8019,18 +8006,18 @@
                 <wp:inline>
                   <wp:extent cx="152400" cy="152400"/>
                   <wp:effectExtent b="0" l="0" r="0" t="0"/>
-                  <wp:docPr descr="" title="" id="176" name="Picture"/>
+                  <wp:docPr descr="" title="" id="175" name="Picture"/>
                   <a:graphic>
                     <a:graphicData uri="http://schemas.openxmlformats.org/drawingml/2006/picture">
                       <pic:pic>
                         <pic:nvPicPr>
-                          <pic:cNvPr descr="C:\Users\User\AppData\Local\Programs\Quarto\share\formats\docx\important.png" id="177" name="Picture"/>
+                          <pic:cNvPr descr="C:\Users\User\AppData\Local\Programs\Quarto\share\formats\docx\important.png" id="176" name="Picture"/>
                           <pic:cNvPicPr>
                             <a:picLocks noChangeArrowheads="1" noChangeAspect="1"/>
                           </pic:cNvPicPr>
                         </pic:nvPicPr>
                         <pic:blipFill>
-                          <a:blip r:embed="rId60"/>
+                          <a:blip r:embed="rId59"/>
                           <a:stretch>
                             <a:fillRect/>
                           </a:stretch>
@@ -8199,10 +8186,10 @@
         </w:tc>
       </w:tr>
     </w:tbl>
+    <w:bookmarkEnd w:id="177"/>
     <w:bookmarkEnd w:id="178"/>
     <w:bookmarkEnd w:id="179"/>
-    <w:bookmarkEnd w:id="180"/>
-    <w:bookmarkStart w:id="181" w:name="página-3-análise-financeira"/>
+    <w:bookmarkStart w:id="180" w:name="página-3-análise-financeira"/>
     <w:p>
       <w:pPr>
         <w:pStyle w:val="Heading1"/>
@@ -8237,10 +8224,10 @@
         <w:t xml:space="preserve">Analisamos aqui a estrutura de custos (DRE), o fluxo de caixa, a alavancagem operacional e a evolução das margens ao longo de 36 meses.</w:t>
       </w:r>
     </w:p>
-    <w:bookmarkEnd w:id="181"/>
+    <w:bookmarkEnd w:id="180"/>
     <w:bookmarkStart w:id="270" w:name="pagina3"/>
-    <w:bookmarkStart w:id="183" w:name="pagina3-1"/>
-    <w:bookmarkStart w:id="182" w:name="página-3-análise-financeira-1"/>
+    <w:bookmarkStart w:id="182" w:name="pagina3-1"/>
+    <w:bookmarkStart w:id="181" w:name="página-3-análise-financeira-1"/>
     <w:p>
       <w:pPr>
         <w:pStyle w:val="Heading1"/>
@@ -8249,9 +8236,9 @@
         <w:t xml:space="preserve">💰 PÁGINA 3: ANÁLISE FINANCEIRA</w:t>
       </w:r>
     </w:p>
+    <w:bookmarkEnd w:id="181"/>
     <w:bookmarkEnd w:id="182"/>
-    <w:bookmarkEnd w:id="183"/>
-    <w:bookmarkStart w:id="184" w:name="pagina3-2"/>
+    <w:bookmarkStart w:id="183" w:name="pagina3-2"/>
     <w:p>
       <w:pPr>
         <w:pStyle w:val="FirstParagraph"/>
@@ -8270,8 +8257,8 @@
         <w:t xml:space="preserve">Provar que a conta fecha no cenário conservador vs benchmark.</w:t>
       </w:r>
     </w:p>
-    <w:bookmarkEnd w:id="184"/>
-    <w:bookmarkStart w:id="185" w:name="pagina3-3"/>
+    <w:bookmarkEnd w:id="183"/>
+    <w:bookmarkStart w:id="184" w:name="pagina3-3"/>
     <w:p>
       <w:r>
         <w:pict>
@@ -8279,9 +8266,9 @@
         </w:pict>
       </w:r>
     </w:p>
-    <w:bookmarkEnd w:id="185"/>
-    <w:bookmarkStart w:id="187" w:name="pagina3-4"/>
-    <w:bookmarkStart w:id="186" w:name="X956f84e40a9d956acab6cfa28d3784cb24056b8"/>
+    <w:bookmarkEnd w:id="184"/>
+    <w:bookmarkStart w:id="186" w:name="pagina3-4"/>
+    <w:bookmarkStart w:id="185" w:name="X956f84e40a9d956acab6cfa28d3784cb24056b8"/>
     <w:p>
       <w:pPr>
         <w:pStyle w:val="Heading3"/>
@@ -8290,9 +8277,9 @@
         <w:t xml:space="preserve">📊 DRE - Demonstração de Resultado (Marcos Principais)</w:t>
       </w:r>
     </w:p>
+    <w:bookmarkEnd w:id="185"/>
     <w:bookmarkEnd w:id="186"/>
-    <w:bookmarkEnd w:id="187"/>
-    <w:bookmarkStart w:id="188" w:name="pagina3-5"/>
+    <w:bookmarkStart w:id="187" w:name="pagina3-5"/>
     <w:p>
       <w:pPr>
         <w:pStyle w:val="FirstParagraph"/>
@@ -8305,8 +8292,8 @@
         <w:t xml:space="preserve">Esta é a primeira tabela que mostra o LUCRO REAL da operação.</w:t>
       </w:r>
     </w:p>
-    <w:bookmarkEnd w:id="188"/>
-    <w:bookmarkStart w:id="189" w:name="pagina3-6"/>
+    <w:bookmarkEnd w:id="187"/>
+    <w:bookmarkStart w:id="188" w:name="pagina3-6"/>
     <w:tbl>
       <w:tblPr>
         <w:tblStyle w:val="Table"/>
@@ -9306,31 +9293,31 @@
         </w:tc>
       </w:tr>
     </w:tbl>
+    <w:bookmarkEnd w:id="188"/>
+    <w:bookmarkStart w:id="189" w:name="pagina3-7"/>
     <w:bookmarkEnd w:id="189"/>
-    <w:bookmarkStart w:id="190" w:name="pagina3-7"/>
-    <w:bookmarkEnd w:id="190"/>
     <w:p>
       <w:pPr>
         <w:pStyle w:val="BodyText"/>
       </w:pPr>
-      <w:bookmarkStart w:id="194" w:name="pagina3-8"/>
+      <w:bookmarkStart w:id="193" w:name="pagina3-8"/>
       <w:r>
         <w:drawing>
           <wp:inline>
             <wp:extent cx="5334000" cy="2751410"/>
             <wp:effectExtent b="0" l="0" r="0" t="0"/>
-            <wp:docPr descr="" title="" id="192" name="Picture"/>
+            <wp:docPr descr="" title="" id="191" name="Picture"/>
             <a:graphic>
               <a:graphicData uri="http://schemas.openxmlformats.org/drawingml/2006/picture">
                 <pic:pic>
                   <pic:nvPicPr>
-                    <pic:cNvPr descr="relatorio_investidores_files/figure-docx/pagina3-output-8.png" id="193" name="Picture"/>
+                    <pic:cNvPr descr="relatorio_investidores_files/figure-docx/pagina3-output-8.png" id="192" name="Picture"/>
                     <pic:cNvPicPr>
                       <a:picLocks noChangeArrowheads="1" noChangeAspect="1"/>
                     </pic:cNvPicPr>
                   </pic:nvPicPr>
                   <pic:blipFill>
-                    <a:blip r:embed="rId191"/>
+                    <a:blip r:embed="rId190"/>
                     <a:stretch>
                       <a:fillRect/>
                     </a:stretch>
@@ -9356,9 +9343,9 @@
           </wp:inline>
         </w:drawing>
       </w:r>
-      <w:bookmarkEnd w:id="194"/>
+      <w:bookmarkEnd w:id="193"/>
     </w:p>
-    <w:bookmarkStart w:id="195" w:name="pagina3-9"/>
+    <w:bookmarkStart w:id="194" w:name="pagina3-9"/>
     <w:p>
       <w:pPr>
         <w:pStyle w:val="BodyText"/>
@@ -9373,140 +9360,274 @@
     </w:p>
     <w:p>
       <w:pPr>
-        <w:pStyle w:val="Compact"/>
-        <w:numPr>
-          <w:ilvl w:val="0"/>
-          <w:numId w:val="1011"/>
-        </w:numPr>
+        <w:pStyle w:val="BodyText"/>
       </w:pPr>
       <w:r>
         <w:rPr>
           <w:b/>
           <w:bCs/>
         </w:rPr>
-        <w:t xml:space="preserve">Linha Azul Sólida:</w:t>
+        <w:t xml:space="preserve">O QUE ESTOU VENDO?</w:t>
       </w:r>
       <w:r>
         <w:t xml:space="preserve"> </w:t>
       </w:r>
       <w:r>
-        <w:t xml:space="preserve">Caixa no cenário conservador (Real)</w:t>
+        <w:t xml:space="preserve">Este gráfico mostra a saúde financeira da empresa ao longo de 36 meses, comparando dois cenários.</w:t>
       </w:r>
     </w:p>
     <w:p>
       <w:pPr>
-        <w:pStyle w:val="Compact"/>
-        <w:numPr>
-          <w:ilvl w:val="0"/>
-          <w:numId w:val="1011"/>
-        </w:numPr>
+        <w:pStyle w:val="BodyText"/>
       </w:pPr>
       <w:r>
         <w:rPr>
           <w:b/>
           <w:bCs/>
         </w:rPr>
-        <w:t xml:space="preserve">Linha Azul Tracejada:</w:t>
+        <w:t xml:space="preserve">ELEMENTOS DO GRÁFICO:</w:t>
       </w:r>
       <w:r>
         <w:t xml:space="preserve"> </w:t>
       </w:r>
       <w:r>
-        <w:t xml:space="preserve">Caixa no cenário otimista (Ideal)</w:t>
-      </w:r>
-    </w:p>
-    <w:p>
-      <w:pPr>
-        <w:pStyle w:val="Compact"/>
-        <w:numPr>
-          <w:ilvl w:val="0"/>
-          <w:numId w:val="1011"/>
-        </w:numPr>
-      </w:pPr>
+        <w:t xml:space="preserve">-</w:t>
+      </w:r>
+      <w:r>
+        <w:t xml:space="preserve"> </w:t>
+      </w:r>
       <w:r>
         <w:rPr>
           <w:b/>
           <w:bCs/>
         </w:rPr>
-        <w:t xml:space="preserve">Área Vermelha:</w:t>
+        <w:t xml:space="preserve">Linha Azul Sólida (Caixa Real):</w:t>
       </w:r>
       <w:r>
         <w:t xml:space="preserve"> </w:t>
       </w:r>
       <w:r>
-        <w:t xml:space="preserve">Burn Rate (queima de caixa mensal)</w:t>
-      </w:r>
-    </w:p>
-    <w:p>
-      <w:pPr>
-        <w:pStyle w:val="Compact"/>
-        <w:numPr>
-          <w:ilvl w:val="0"/>
-          <w:numId w:val="1011"/>
-        </w:numPr>
-      </w:pPr>
+        <w:t xml:space="preserve">Quanto dinheiro temos no banco no cenário conservador</w:t>
+      </w:r>
+      <w:r>
+        <w:t xml:space="preserve"> </w:t>
+      </w:r>
+      <w:r>
+        <w:t xml:space="preserve">-</w:t>
+      </w:r>
+      <w:r>
+        <w:t xml:space="preserve"> </w:t>
+      </w:r>
       <w:r>
         <w:rPr>
           <w:b/>
           <w:bCs/>
         </w:rPr>
-        <w:t xml:space="preserve">Linha Verde Sólida:</w:t>
+        <w:t xml:space="preserve">Linha Azul Tracejada (Caixa Ideal):</w:t>
       </w:r>
       <w:r>
         <w:t xml:space="preserve"> </w:t>
       </w:r>
       <w:r>
-        <w:t xml:space="preserve">EBITDA Real (eixo direito)</w:t>
-      </w:r>
-    </w:p>
-    <w:p>
-      <w:pPr>
-        <w:pStyle w:val="Compact"/>
-        <w:numPr>
-          <w:ilvl w:val="0"/>
-          <w:numId w:val="1011"/>
-        </w:numPr>
-      </w:pPr>
+        <w:t xml:space="preserve">Quanto teriamos se atingissemos benchmarks de mercado</w:t>
+      </w:r>
+      <w:r>
+        <w:t xml:space="preserve"> </w:t>
+      </w:r>
+      <w:r>
+        <w:t xml:space="preserve">-</w:t>
+      </w:r>
+      <w:r>
+        <w:t xml:space="preserve"> </w:t>
+      </w:r>
       <w:r>
         <w:rPr>
           <w:b/>
           <w:bCs/>
         </w:rPr>
-        <w:t xml:space="preserve">Linha Verde Tracejada:</w:t>
+        <w:t xml:space="preserve">Area Vermelha (Burn Rate):</w:t>
       </w:r>
       <w:r>
         <w:t xml:space="preserve"> </w:t>
       </w:r>
       <w:r>
-        <w:t xml:space="preserve">EBITDA Ideal (eixo direito)</w:t>
-      </w:r>
-    </w:p>
-    <w:p>
-      <w:pPr>
-        <w:pStyle w:val="Compact"/>
-        <w:numPr>
-          <w:ilvl w:val="0"/>
-          <w:numId w:val="1011"/>
-        </w:numPr>
-      </w:pPr>
+        <w:t xml:space="preserve">Quanto dinheiro</w:t>
+      </w:r>
+      <w:r>
+        <w:t xml:space="preserve"> </w:t>
+      </w:r>
+      <w:r>
+        <w:t xml:space="preserve">“queimamos”</w:t>
+      </w:r>
+      <w:r>
+        <w:t xml:space="preserve"> </w:t>
+      </w:r>
+      <w:r>
+        <w:t xml:space="preserve">por mes para operar - se esta area e grande, estamos gastando muito</w:t>
+      </w:r>
+      <w:r>
+        <w:t xml:space="preserve"> </w:t>
+      </w:r>
+      <w:r>
+        <w:t xml:space="preserve">-</w:t>
+      </w:r>
+      <w:r>
+        <w:t xml:space="preserve"> </w:t>
+      </w:r>
       <w:r>
         <w:rPr>
           <w:b/>
           <w:bCs/>
         </w:rPr>
-        <w:t xml:space="preserve">Regra de Sucesso:</w:t>
+        <w:t xml:space="preserve">Linha Verde Solida (EBITDA Real):</w:t>
       </w:r>
       <w:r>
         <w:t xml:space="preserve"> </w:t>
       </w:r>
       <w:r>
-        <w:t xml:space="preserve">Quando a linha verde cruzar o zero, a operação é lucrativa</w:t>
+        <w:t xml:space="preserve">Lucro operacional antes de impostos - quando cruza o zero, paramos de dar prejuizo</w:t>
+      </w:r>
+      <w:r>
+        <w:t xml:space="preserve"> </w:t>
+      </w:r>
+      <w:r>
+        <w:t xml:space="preserve">-</w:t>
+      </w:r>
+      <w:r>
+        <w:t xml:space="preserve"> </w:t>
+      </w:r>
+      <w:r>
+        <w:rPr>
+          <w:b/>
+          <w:bCs/>
+        </w:rPr>
+        <w:t xml:space="preserve">Linha Verde Tracejada (EBITDA Ideal):</w:t>
+      </w:r>
+      <w:r>
+        <w:t xml:space="preserve"> </w:t>
+      </w:r>
+      <w:r>
+        <w:t xml:space="preserve">Lucro que teriamos no cenario otimista</w:t>
       </w:r>
     </w:p>
+    <w:p>
+      <w:pPr>
+        <w:pStyle w:val="BodyText"/>
+      </w:pPr>
+      <w:r>
+        <w:rPr>
+          <w:b/>
+          <w:bCs/>
+        </w:rPr>
+        <w:t xml:space="preserve">COMO INTERPRETAR:</w:t>
+      </w:r>
+      <w:r>
+        <w:t xml:space="preserve"> </w:t>
+      </w:r>
+      <w:r>
+        <w:t xml:space="preserve">- Se a linha verde esta ABAIXO de zero = prejuizo operacional (normal no inicio)</w:t>
+      </w:r>
+      <w:r>
+        <w:t xml:space="preserve"> </w:t>
+      </w:r>
+      <w:r>
+        <w:t xml:space="preserve">- Se a linha verde CRUZA o zero = break-even (empresa se paga)</w:t>
+      </w:r>
+      <w:r>
+        <w:t xml:space="preserve"> </w:t>
+      </w:r>
+      <w:r>
+        <w:t xml:space="preserve">- Se a linha azul CAI muito = cuidado, caixa acabando</w:t>
+      </w:r>
+      <w:r>
+        <w:t xml:space="preserve"> </w:t>
+      </w:r>
+      <w:r>
+        <w:t xml:space="preserve">- Se area vermelha DIMINUI = estamos ficando mais eficientes</w:t>
+      </w:r>
+    </w:p>
+    <w:p>
+      <w:pPr>
+        <w:pStyle w:val="BodyText"/>
+      </w:pPr>
+      <w:r>
+        <w:rPr>
+          <w:b/>
+          <w:bCs/>
+        </w:rPr>
+        <w:t xml:space="preserve">TERMOS IMPORTANTES:</w:t>
+      </w:r>
+      <w:r>
+        <w:t xml:space="preserve"> </w:t>
+      </w:r>
+      <w:r>
+        <w:t xml:space="preserve">-</w:t>
+      </w:r>
+      <w:r>
+        <w:t xml:space="preserve"> </w:t>
+      </w:r>
+      <w:r>
+        <w:rPr>
+          <w:b/>
+          <w:bCs/>
+        </w:rPr>
+        <w:t xml:space="preserve">EBITDA:</w:t>
+      </w:r>
+      <w:r>
+        <w:t xml:space="preserve"> </w:t>
+      </w:r>
+      <w:r>
+        <w:t xml:space="preserve">Lucro antes de juros, impostos, depreciacao e amortizacao - mede eficiencia operacional</w:t>
+      </w:r>
+      <w:r>
+        <w:t xml:space="preserve"> </w:t>
+      </w:r>
+      <w:r>
+        <w:t xml:space="preserve">-</w:t>
+      </w:r>
+      <w:r>
+        <w:t xml:space="preserve"> </w:t>
+      </w:r>
+      <w:r>
+        <w:rPr>
+          <w:b/>
+          <w:bCs/>
+        </w:rPr>
+        <w:t xml:space="preserve">Burn Rate:</w:t>
+      </w:r>
+      <w:r>
+        <w:t xml:space="preserve"> </w:t>
+      </w:r>
+      <w:r>
+        <w:t xml:space="preserve">Taxa de queima de caixa - quanto gastamos por mes alem do que ganhamos</w:t>
+      </w:r>
+      <w:r>
+        <w:t xml:space="preserve"> </w:t>
+      </w:r>
+      <w:r>
+        <w:t xml:space="preserve">-</w:t>
+      </w:r>
+      <w:r>
+        <w:t xml:space="preserve"> </w:t>
+      </w:r>
+      <w:r>
+        <w:rPr>
+          <w:b/>
+          <w:bCs/>
+        </w:rPr>
+        <w:t xml:space="preserve">Break-even:</w:t>
+      </w:r>
+      <w:r>
+        <w:t xml:space="preserve"> </w:t>
+      </w:r>
+      <w:r>
+        <w:t xml:space="preserve">Ponto onde receita = despesas, sem lucro nem prejuizo</w:t>
+      </w:r>
+    </w:p>
+    <w:bookmarkEnd w:id="194"/>
+    <w:bookmarkStart w:id="195" w:name="pagina3-10"/>
     <w:bookmarkEnd w:id="195"/>
-    <w:bookmarkStart w:id="196" w:name="pagina3-10"/>
-    <w:bookmarkEnd w:id="196"/>
-    <w:bookmarkStart w:id="199" w:name="pagina3-11"/>
+    <w:bookmarkStart w:id="198" w:name="pagina3-11"/>
     <w:tbl>
       <w:tblPr>
         <w:tblStyle w:val="Table"/>
@@ -9537,7 +9658,7 @@
           </w:tcPr>
           <w:p>
             <w:pPr>
-              <w:pStyle w:val="FirstParagraph"/>
+              <w:pStyle w:val="BodyText"/>
             </w:pPr>
             <w:pPr>
               <w:spacing w:before="0" w:after="0"/>
@@ -9548,18 +9669,18 @@
                 <wp:inline>
                   <wp:extent cx="152400" cy="152400"/>
                   <wp:effectExtent b="0" l="0" r="0" t="0"/>
-                  <wp:docPr descr="" title="" id="197" name="Picture"/>
+                  <wp:docPr descr="" title="" id="196" name="Picture"/>
                   <a:graphic>
                     <a:graphicData uri="http://schemas.openxmlformats.org/drawingml/2006/picture">
                       <pic:pic>
                         <pic:nvPicPr>
-                          <pic:cNvPr descr="C:\Users\User\AppData\Local\Programs\Quarto\share\formats\docx\tip.png" id="198" name="Picture"/>
+                          <pic:cNvPr descr="C:\Users\User\AppData\Local\Programs\Quarto\share\formats\docx\tip.png" id="197" name="Picture"/>
                           <pic:cNvPicPr>
                             <a:picLocks noChangeArrowheads="1" noChangeAspect="1"/>
                           </pic:cNvPicPr>
                         </pic:nvPicPr>
                         <pic:blipFill>
-                          <a:blip r:embed="rId52"/>
+                          <a:blip r:embed="rId51"/>
                           <a:stretch>
                             <a:fillRect/>
                           </a:stretch>
@@ -9613,7 +9734,7 @@
               <w:pStyle w:val="Compact"/>
               <w:numPr>
                 <w:ilvl w:val="0"/>
-                <w:numId w:val="1012"/>
+                <w:numId w:val="1011"/>
               </w:numPr>
             </w:pPr>
             <w:r>
@@ -9635,7 +9756,7 @@
               <w:pStyle w:val="Compact"/>
               <w:numPr>
                 <w:ilvl w:val="0"/>
-                <w:numId w:val="1012"/>
+                <w:numId w:val="1011"/>
               </w:numPr>
             </w:pPr>
             <w:r>
@@ -9657,7 +9778,7 @@
               <w:pStyle w:val="Compact"/>
               <w:numPr>
                 <w:ilvl w:val="0"/>
-                <w:numId w:val="1012"/>
+                <w:numId w:val="1011"/>
               </w:numPr>
             </w:pPr>
             <w:r>
@@ -9679,7 +9800,7 @@
               <w:pStyle w:val="Compact"/>
               <w:numPr>
                 <w:ilvl w:val="0"/>
-                <w:numId w:val="1012"/>
+                <w:numId w:val="1011"/>
               </w:numPr>
             </w:pPr>
             <w:r>
@@ -9700,8 +9821,8 @@
         </w:tc>
       </w:tr>
     </w:tbl>
-    <w:bookmarkEnd w:id="199"/>
-    <w:bookmarkStart w:id="202" w:name="pagina3-12"/>
+    <w:bookmarkEnd w:id="198"/>
+    <w:bookmarkStart w:id="201" w:name="pagina3-12"/>
     <w:tbl>
       <w:tblPr>
         <w:tblStyle w:val="Table"/>
@@ -9743,18 +9864,18 @@
                 <wp:inline>
                   <wp:extent cx="152400" cy="152400"/>
                   <wp:effectExtent b="0" l="0" r="0" t="0"/>
-                  <wp:docPr descr="" title="" id="200" name="Picture"/>
+                  <wp:docPr descr="" title="" id="199" name="Picture"/>
                   <a:graphic>
                     <a:graphicData uri="http://schemas.openxmlformats.org/drawingml/2006/picture">
                       <pic:pic>
                         <pic:nvPicPr>
-                          <pic:cNvPr descr="C:\Users\User\AppData\Local\Programs\Quarto\share\formats\docx\note.png" id="201" name="Picture"/>
+                          <pic:cNvPr descr="C:\Users\User\AppData\Local\Programs\Quarto\share\formats\docx\note.png" id="200" name="Picture"/>
                           <pic:cNvPicPr>
                             <a:picLocks noChangeArrowheads="1" noChangeAspect="1"/>
                           </pic:cNvPicPr>
                         </pic:nvPicPr>
                         <pic:blipFill>
-                          <a:blip r:embed="rId64"/>
+                          <a:blip r:embed="rId63"/>
                           <a:stretch>
                             <a:fillRect/>
                           </a:stretch>
@@ -9861,9 +9982,9 @@
         </w:tc>
       </w:tr>
     </w:tbl>
-    <w:bookmarkEnd w:id="202"/>
-    <w:bookmarkStart w:id="204" w:name="pagina3-13"/>
-    <w:bookmarkStart w:id="203" w:name="decomposição-da-dre-m36"/>
+    <w:bookmarkEnd w:id="201"/>
+    <w:bookmarkStart w:id="203" w:name="pagina3-13"/>
+    <w:bookmarkStart w:id="202" w:name="decomposição-da-dre-m36"/>
     <w:p>
       <w:pPr>
         <w:pStyle w:val="Heading3"/>
@@ -9872,9 +9993,9 @@
         <w:t xml:space="preserve">📊 DECOMPOSIÇÃO DA DRE (M36)</w:t>
       </w:r>
     </w:p>
+    <w:bookmarkEnd w:id="202"/>
     <w:bookmarkEnd w:id="203"/>
-    <w:bookmarkEnd w:id="204"/>
-    <w:bookmarkStart w:id="205" w:name="pagina3-14"/>
+    <w:bookmarkStart w:id="204" w:name="pagina3-14"/>
     <w:tbl>
       <w:tblPr>
         <w:tblStyle w:val="Table"/>
@@ -10291,31 +10412,31 @@
         </w:tc>
       </w:tr>
     </w:tbl>
+    <w:bookmarkEnd w:id="204"/>
+    <w:bookmarkStart w:id="205" w:name="pagina3-15"/>
     <w:bookmarkEnd w:id="205"/>
-    <w:bookmarkStart w:id="206" w:name="pagina3-15"/>
-    <w:bookmarkEnd w:id="206"/>
     <w:p>
       <w:pPr>
         <w:pStyle w:val="BodyText"/>
       </w:pPr>
-      <w:bookmarkStart w:id="210" w:name="pagina3-16"/>
+      <w:bookmarkStart w:id="209" w:name="pagina3-16"/>
       <w:r>
         <w:drawing>
           <wp:inline>
             <wp:extent cx="5334000" cy="2755002"/>
             <wp:effectExtent b="0" l="0" r="0" t="0"/>
-            <wp:docPr descr="" title="" id="208" name="Picture"/>
+            <wp:docPr descr="" title="" id="207" name="Picture"/>
             <a:graphic>
               <a:graphicData uri="http://schemas.openxmlformats.org/drawingml/2006/picture">
                 <pic:pic>
                   <pic:nvPicPr>
-                    <pic:cNvPr descr="relatorio_investidores_files/figure-docx/pagina3-output-16.png" id="209" name="Picture"/>
+                    <pic:cNvPr descr="relatorio_investidores_files/figure-docx/pagina3-output-16.png" id="208" name="Picture"/>
                     <pic:cNvPicPr>
                       <a:picLocks noChangeArrowheads="1" noChangeAspect="1"/>
                     </pic:cNvPicPr>
                   </pic:nvPicPr>
                   <pic:blipFill>
-                    <a:blip r:embed="rId207"/>
+                    <a:blip r:embed="rId206"/>
                     <a:stretch>
                       <a:fillRect/>
                     </a:stretch>
@@ -10341,9 +10462,9 @@
           </wp:inline>
         </w:drawing>
       </w:r>
-      <w:bookmarkEnd w:id="210"/>
+      <w:bookmarkEnd w:id="209"/>
     </w:p>
-    <w:bookmarkStart w:id="211" w:name="pagina3-17"/>
+    <w:bookmarkStart w:id="210" w:name="pagina3-17"/>
     <w:p>
       <w:pPr>
         <w:pStyle w:val="BodyText"/>
@@ -10361,7 +10482,7 @@
         <w:pStyle w:val="Compact"/>
         <w:numPr>
           <w:ilvl w:val="0"/>
-          <w:numId w:val="1013"/>
+          <w:numId w:val="1012"/>
         </w:numPr>
       </w:pPr>
       <w:r>
@@ -10383,7 +10504,7 @@
         <w:pStyle w:val="Compact"/>
         <w:numPr>
           <w:ilvl w:val="0"/>
-          <w:numId w:val="1013"/>
+          <w:numId w:val="1012"/>
         </w:numPr>
       </w:pPr>
       <w:r>
@@ -10405,7 +10526,7 @@
         <w:pStyle w:val="Compact"/>
         <w:numPr>
           <w:ilvl w:val="0"/>
-          <w:numId w:val="1013"/>
+          <w:numId w:val="1012"/>
         </w:numPr>
       </w:pPr>
       <w:r>
@@ -10427,7 +10548,7 @@
         <w:pStyle w:val="Compact"/>
         <w:numPr>
           <w:ilvl w:val="0"/>
-          <w:numId w:val="1013"/>
+          <w:numId w:val="1012"/>
         </w:numPr>
       </w:pPr>
       <w:r>
@@ -10444,9 +10565,9 @@
         <w:t xml:space="preserve">Barra final deve ser verde e representar &gt;20% da receita</w:t>
       </w:r>
     </w:p>
-    <w:bookmarkEnd w:id="211"/>
-    <w:bookmarkStart w:id="213" w:name="pagina3-18"/>
-    <w:bookmarkStart w:id="212" w:name="breakdown-detalhado-de-custos-m36"/>
+    <w:bookmarkEnd w:id="210"/>
+    <w:bookmarkStart w:id="212" w:name="pagina3-18"/>
+    <w:bookmarkStart w:id="211" w:name="breakdown-detalhado-de-custos-m36"/>
     <w:p>
       <w:pPr>
         <w:pStyle w:val="Heading3"/>
@@ -10455,9 +10576,9 @@
         <w:t xml:space="preserve">💰 BREAKDOWN DETALHADO DE CUSTOS (M36)</w:t>
       </w:r>
     </w:p>
+    <w:bookmarkEnd w:id="211"/>
     <w:bookmarkEnd w:id="212"/>
-    <w:bookmarkEnd w:id="213"/>
-    <w:bookmarkStart w:id="214" w:name="pagina3-19"/>
+    <w:bookmarkStart w:id="213" w:name="pagina3-19"/>
     <w:p>
       <w:pPr>
         <w:pStyle w:val="FirstParagraph"/>
@@ -10470,8 +10591,8 @@
         <w:t xml:space="preserve">Decomposição completa de COGS e OPEX por canal/categoria.</w:t>
       </w:r>
     </w:p>
-    <w:bookmarkEnd w:id="214"/>
-    <w:bookmarkStart w:id="215" w:name="pagina3-20"/>
+    <w:bookmarkEnd w:id="213"/>
+    <w:bookmarkStart w:id="214" w:name="pagina3-20"/>
     <w:tbl>
       <w:tblPr>
         <w:tblStyle w:val="Table"/>
@@ -11286,31 +11407,31 @@
         </w:tc>
       </w:tr>
     </w:tbl>
+    <w:bookmarkEnd w:id="214"/>
+    <w:bookmarkStart w:id="215" w:name="pagina3-21"/>
     <w:bookmarkEnd w:id="215"/>
-    <w:bookmarkStart w:id="216" w:name="pagina3-21"/>
-    <w:bookmarkEnd w:id="216"/>
     <w:p>
       <w:pPr>
         <w:pStyle w:val="BodyText"/>
       </w:pPr>
-      <w:bookmarkStart w:id="220" w:name="pagina3-22"/>
+      <w:bookmarkStart w:id="219" w:name="pagina3-22"/>
       <w:r>
         <w:drawing>
           <wp:inline>
             <wp:extent cx="5334000" cy="2845295"/>
             <wp:effectExtent b="0" l="0" r="0" t="0"/>
-            <wp:docPr descr="" title="" id="218" name="Picture"/>
+            <wp:docPr descr="" title="" id="217" name="Picture"/>
             <a:graphic>
               <a:graphicData uri="http://schemas.openxmlformats.org/drawingml/2006/picture">
                 <pic:pic>
                   <pic:nvPicPr>
-                    <pic:cNvPr descr="relatorio_investidores_files/figure-docx/pagina3-output-22.png" id="219" name="Picture"/>
+                    <pic:cNvPr descr="relatorio_investidores_files/figure-docx/pagina3-output-22.png" id="218" name="Picture"/>
                     <pic:cNvPicPr>
                       <a:picLocks noChangeArrowheads="1" noChangeAspect="1"/>
                     </pic:cNvPicPr>
                   </pic:nvPicPr>
                   <pic:blipFill>
-                    <a:blip r:embed="rId217"/>
+                    <a:blip r:embed="rId216"/>
                     <a:stretch>
                       <a:fillRect/>
                     </a:stretch>
@@ -11336,11 +11457,11 @@
           </wp:inline>
         </w:drawing>
       </w:r>
-      <w:bookmarkEnd w:id="220"/>
+      <w:bookmarkEnd w:id="219"/>
     </w:p>
-    <w:bookmarkStart w:id="221" w:name="pagina3-23"/>
-    <w:bookmarkEnd w:id="221"/>
-    <w:bookmarkStart w:id="224" w:name="pagina3-24"/>
+    <w:bookmarkStart w:id="220" w:name="pagina3-23"/>
+    <w:bookmarkEnd w:id="220"/>
+    <w:bookmarkStart w:id="223" w:name="pagina3-24"/>
     <w:tbl>
       <w:tblPr>
         <w:tblStyle w:val="Table"/>
@@ -11382,18 +11503,18 @@
                 <wp:inline>
                   <wp:extent cx="152400" cy="152400"/>
                   <wp:effectExtent b="0" l="0" r="0" t="0"/>
-                  <wp:docPr descr="" title="" id="222" name="Picture"/>
+                  <wp:docPr descr="" title="" id="221" name="Picture"/>
                   <a:graphic>
                     <a:graphicData uri="http://schemas.openxmlformats.org/drawingml/2006/picture">
                       <pic:pic>
                         <pic:nvPicPr>
-                          <pic:cNvPr descr="C:\Users\User\AppData\Local\Programs\Quarto\share\formats\docx\tip.png" id="223" name="Picture"/>
+                          <pic:cNvPr descr="C:\Users\User\AppData\Local\Programs\Quarto\share\formats\docx\tip.png" id="222" name="Picture"/>
                           <pic:cNvPicPr>
                             <a:picLocks noChangeArrowheads="1" noChangeAspect="1"/>
                           </pic:cNvPicPr>
                         </pic:nvPicPr>
                         <pic:blipFill>
-                          <a:blip r:embed="rId52"/>
+                          <a:blip r:embed="rId51"/>
                           <a:stretch>
                             <a:fillRect/>
                           </a:stretch>
@@ -11447,7 +11568,7 @@
               <w:pStyle w:val="Compact"/>
               <w:numPr>
                 <w:ilvl w:val="0"/>
-                <w:numId w:val="1014"/>
+                <w:numId w:val="1013"/>
               </w:numPr>
             </w:pPr>
             <w:r>
@@ -11469,7 +11590,7 @@
               <w:pStyle w:val="Compact"/>
               <w:numPr>
                 <w:ilvl w:val="0"/>
-                <w:numId w:val="1014"/>
+                <w:numId w:val="1013"/>
               </w:numPr>
             </w:pPr>
             <w:r>
@@ -11491,7 +11612,7 @@
               <w:pStyle w:val="Compact"/>
               <w:numPr>
                 <w:ilvl w:val="0"/>
-                <w:numId w:val="1014"/>
+                <w:numId w:val="1013"/>
               </w:numPr>
             </w:pPr>
             <w:r>
@@ -11513,7 +11634,7 @@
               <w:pStyle w:val="Compact"/>
               <w:numPr>
                 <w:ilvl w:val="0"/>
-                <w:numId w:val="1014"/>
+                <w:numId w:val="1013"/>
               </w:numPr>
             </w:pPr>
             <w:r>
@@ -11534,8 +11655,8 @@
         </w:tc>
       </w:tr>
     </w:tbl>
-    <w:bookmarkEnd w:id="224"/>
-    <w:bookmarkStart w:id="227" w:name="pagina3-25"/>
+    <w:bookmarkEnd w:id="223"/>
+    <w:bookmarkStart w:id="226" w:name="pagina3-25"/>
     <w:tbl>
       <w:tblPr>
         <w:tblStyle w:val="Table"/>
@@ -11577,18 +11698,18 @@
                 <wp:inline>
                   <wp:extent cx="152400" cy="152400"/>
                   <wp:effectExtent b="0" l="0" r="0" t="0"/>
-                  <wp:docPr descr="" title="" id="225" name="Picture"/>
+                  <wp:docPr descr="" title="" id="224" name="Picture"/>
                   <a:graphic>
                     <a:graphicData uri="http://schemas.openxmlformats.org/drawingml/2006/picture">
                       <pic:pic>
                         <pic:nvPicPr>
-                          <pic:cNvPr descr="C:\Users\User\AppData\Local\Programs\Quarto\share\formats\docx\note.png" id="226" name="Picture"/>
+                          <pic:cNvPr descr="C:\Users\User\AppData\Local\Programs\Quarto\share\formats\docx\note.png" id="225" name="Picture"/>
                           <pic:cNvPicPr>
                             <a:picLocks noChangeArrowheads="1" noChangeAspect="1"/>
                           </pic:cNvPicPr>
                         </pic:nvPicPr>
                         <pic:blipFill>
-                          <a:blip r:embed="rId64"/>
+                          <a:blip r:embed="rId63"/>
                           <a:stretch>
                             <a:fillRect/>
                           </a:stretch>
@@ -11695,29 +11816,29 @@
         </w:tc>
       </w:tr>
     </w:tbl>
-    <w:bookmarkEnd w:id="227"/>
+    <w:bookmarkEnd w:id="226"/>
     <w:p>
       <w:pPr>
         <w:pStyle w:val="BodyText"/>
       </w:pPr>
-      <w:bookmarkStart w:id="231" w:name="pagina3-26"/>
+      <w:bookmarkStart w:id="230" w:name="pagina3-26"/>
       <w:r>
         <w:drawing>
           <wp:inline>
             <wp:extent cx="5334000" cy="2755002"/>
             <wp:effectExtent b="0" l="0" r="0" t="0"/>
-            <wp:docPr descr="" title="" id="229" name="Picture"/>
+            <wp:docPr descr="" title="" id="228" name="Picture"/>
             <a:graphic>
               <a:graphicData uri="http://schemas.openxmlformats.org/drawingml/2006/picture">
                 <pic:pic>
                   <pic:nvPicPr>
-                    <pic:cNvPr descr="relatorio_investidores_files/figure-docx/pagina3-output-26.png" id="230" name="Picture"/>
+                    <pic:cNvPr descr="relatorio_investidores_files/figure-docx/pagina3-output-26.png" id="229" name="Picture"/>
                     <pic:cNvPicPr>
                       <a:picLocks noChangeArrowheads="1" noChangeAspect="1"/>
                     </pic:cNvPicPr>
                   </pic:nvPicPr>
                   <pic:blipFill>
-                    <a:blip r:embed="rId228"/>
+                    <a:blip r:embed="rId227"/>
                     <a:stretch>
                       <a:fillRect/>
                     </a:stretch>
@@ -11743,9 +11864,9 @@
           </wp:inline>
         </w:drawing>
       </w:r>
-      <w:bookmarkEnd w:id="231"/>
+      <w:bookmarkEnd w:id="230"/>
     </w:p>
-    <w:bookmarkStart w:id="232" w:name="pagina3-27"/>
+    <w:bookmarkStart w:id="231" w:name="pagina3-27"/>
     <w:p>
       <w:pPr>
         <w:pStyle w:val="BodyText"/>
@@ -11763,7 +11884,7 @@
         <w:pStyle w:val="Compact"/>
         <w:numPr>
           <w:ilvl w:val="0"/>
-          <w:numId w:val="1015"/>
+          <w:numId w:val="1014"/>
         </w:numPr>
       </w:pPr>
       <w:r>
@@ -11785,7 +11906,7 @@
         <w:pStyle w:val="Compact"/>
         <w:numPr>
           <w:ilvl w:val="0"/>
-          <w:numId w:val="1015"/>
+          <w:numId w:val="1014"/>
         </w:numPr>
       </w:pPr>
       <w:r>
@@ -11807,7 +11928,7 @@
         <w:pStyle w:val="Compact"/>
         <w:numPr>
           <w:ilvl w:val="0"/>
-          <w:numId w:val="1015"/>
+          <w:numId w:val="1014"/>
         </w:numPr>
       </w:pPr>
       <w:r>
@@ -11829,7 +11950,7 @@
         <w:pStyle w:val="Compact"/>
         <w:numPr>
           <w:ilvl w:val="0"/>
-          <w:numId w:val="1015"/>
+          <w:numId w:val="1014"/>
         </w:numPr>
       </w:pPr>
       <w:r>
@@ -11851,7 +11972,7 @@
         <w:pStyle w:val="Compact"/>
         <w:numPr>
           <w:ilvl w:val="0"/>
-          <w:numId w:val="1015"/>
+          <w:numId w:val="1014"/>
         </w:numPr>
       </w:pPr>
       <w:r>
@@ -11873,7 +11994,7 @@
         <w:pStyle w:val="Compact"/>
         <w:numPr>
           <w:ilvl w:val="0"/>
-          <w:numId w:val="1015"/>
+          <w:numId w:val="1014"/>
         </w:numPr>
       </w:pPr>
       <w:r>
@@ -11890,8 +12011,8 @@
         <w:t xml:space="preserve">Manter caixa sempre acima da linha vermelha</w:t>
       </w:r>
     </w:p>
-    <w:bookmarkEnd w:id="232"/>
-    <w:bookmarkStart w:id="233" w:name="pagina3-28"/>
+    <w:bookmarkEnd w:id="231"/>
+    <w:bookmarkStart w:id="232" w:name="pagina3-28"/>
     <w:tbl>
       <w:tblPr>
         <w:tblStyle w:val="Table"/>
@@ -12428,8 +12549,8 @@
         </w:tc>
       </w:tr>
     </w:tbl>
-    <w:bookmarkEnd w:id="233"/>
-    <w:bookmarkStart w:id="234" w:name="pagina3-29"/>
+    <w:bookmarkEnd w:id="232"/>
+    <w:bookmarkStart w:id="233" w:name="pagina3-29"/>
     <w:p>
       <w:pPr>
         <w:pStyle w:val="BodyText"/>
@@ -12442,12 +12563,306 @@
         <w:t xml:space="preserve">Fonte: Celulas 5A/5B | df_real_m interpolado para granularidade semanal</w:t>
       </w:r>
     </w:p>
+    <w:bookmarkEnd w:id="233"/>
+    <w:bookmarkStart w:id="234" w:name="pagina3-30"/>
+    <w:p>
+      <w:pPr>
+        <w:pStyle w:val="BodyText"/>
+      </w:pPr>
+      <w:r>
+        <w:rPr>
+          <w:b/>
+          <w:bCs/>
+        </w:rPr>
+        <w:t xml:space="preserve">📖 COMO LER ESTE GRÁFICO (FLUXO DE CAIXA SEMANAL):</w:t>
+      </w:r>
+    </w:p>
+    <w:p>
+      <w:pPr>
+        <w:pStyle w:val="BodyText"/>
+      </w:pPr>
+      <w:r>
+        <w:rPr>
+          <w:b/>
+          <w:bCs/>
+        </w:rPr>
+        <w:t xml:space="preserve">O QUE ESTOU VENDO?</w:t>
+      </w:r>
+      <w:r>
+        <w:t xml:space="preserve"> </w:t>
+      </w:r>
+      <w:r>
+        <w:t xml:space="preserve">Este grafico mostra a saude do caixa SEMANA A SEMANA nos primeiros 6 meses - periodo mais critico para startups.</w:t>
+      </w:r>
+    </w:p>
+    <w:p>
+      <w:pPr>
+        <w:pStyle w:val="BodyText"/>
+      </w:pPr>
+      <w:r>
+        <w:rPr>
+          <w:b/>
+          <w:bCs/>
+        </w:rPr>
+        <w:t xml:space="preserve">ELEMENTOS:</w:t>
+      </w:r>
+      <w:r>
+        <w:t xml:space="preserve"> </w:t>
+      </w:r>
+      <w:r>
+        <w:t xml:space="preserve">-</w:t>
+      </w:r>
+      <w:r>
+        <w:t xml:space="preserve"> </w:t>
+      </w:r>
+      <w:r>
+        <w:rPr>
+          <w:b/>
+          <w:bCs/>
+        </w:rPr>
+        <w:t xml:space="preserve">Linha Azul (Saldo Caixa):</w:t>
+      </w:r>
+      <w:r>
+        <w:t xml:space="preserve"> </w:t>
+      </w:r>
+      <w:r>
+        <w:t xml:space="preserve">Quanto dinheiro temos no banco a cada semana</w:t>
+      </w:r>
+      <w:r>
+        <w:t xml:space="preserve"> </w:t>
+      </w:r>
+      <w:r>
+        <w:t xml:space="preserve">-</w:t>
+      </w:r>
+      <w:r>
+        <w:t xml:space="preserve"> </w:t>
+      </w:r>
+      <w:r>
+        <w:rPr>
+          <w:b/>
+          <w:bCs/>
+        </w:rPr>
+        <w:t xml:space="preserve">Linha Vermelha Tracejada (Limite Critico):</w:t>
+      </w:r>
+      <w:r>
+        <w:t xml:space="preserve"> </w:t>
+      </w:r>
+      <w:r>
+        <w:t xml:space="preserve">Se caixa cair abaixo disso, temos menos de 2 semanas de sobrevivencia</w:t>
+      </w:r>
+      <w:r>
+        <w:t xml:space="preserve"> </w:t>
+      </w:r>
+      <w:r>
+        <w:t xml:space="preserve">-</w:t>
+      </w:r>
+      <w:r>
+        <w:t xml:space="preserve"> </w:t>
+      </w:r>
+      <w:r>
+        <w:rPr>
+          <w:b/>
+          <w:bCs/>
+        </w:rPr>
+        <w:t xml:space="preserve">Ponto Vermelho (Vale):</w:t>
+      </w:r>
+      <w:r>
+        <w:t xml:space="preserve"> </w:t>
+      </w:r>
+      <w:r>
+        <w:t xml:space="preserve">Semana mais perigosa - caixa no nivel mais baixo</w:t>
+      </w:r>
+      <w:r>
+        <w:t xml:space="preserve"> </w:t>
+      </w:r>
+      <w:r>
+        <w:t xml:space="preserve">-</w:t>
+      </w:r>
+      <w:r>
+        <w:t xml:space="preserve"> </w:t>
+      </w:r>
+      <w:r>
+        <w:rPr>
+          <w:b/>
+          <w:bCs/>
+        </w:rPr>
+        <w:t xml:space="preserve">Linha Laranja (Runway):</w:t>
+      </w:r>
+      <w:r>
+        <w:t xml:space="preserve"> </w:t>
+      </w:r>
+      <w:r>
+        <w:t xml:space="preserve">Quantas semanas conseguimos sobreviver com o caixa atual</w:t>
+      </w:r>
+    </w:p>
+    <w:p>
+      <w:pPr>
+        <w:pStyle w:val="BodyText"/>
+      </w:pPr>
+      <w:r>
+        <w:rPr>
+          <w:b/>
+          <w:bCs/>
+        </w:rPr>
+        <w:t xml:space="preserve">COMO INTERPRETAR:</w:t>
+      </w:r>
+      <w:r>
+        <w:t xml:space="preserve"> </w:t>
+      </w:r>
+      <w:r>
+        <w:t xml:space="preserve">-</w:t>
+      </w:r>
+      <w:r>
+        <w:t xml:space="preserve"> </w:t>
+      </w:r>
+      <w:r>
+        <w:rPr>
+          <w:b/>
+          <w:bCs/>
+        </w:rPr>
+        <w:t xml:space="preserve">Caixa NUNCA deve tocar a linha vermelha</w:t>
+      </w:r>
+      <w:r>
+        <w:t xml:space="preserve"> </w:t>
+      </w:r>
+      <w:r>
+        <w:t xml:space="preserve">- se tocar, risco de insolvencia</w:t>
+      </w:r>
+      <w:r>
+        <w:t xml:space="preserve"> </w:t>
+      </w:r>
+      <w:r>
+        <w:t xml:space="preserve">-</w:t>
+      </w:r>
+      <w:r>
+        <w:t xml:space="preserve"> </w:t>
+      </w:r>
+      <w:r>
+        <w:rPr>
+          <w:b/>
+          <w:bCs/>
+        </w:rPr>
+        <w:t xml:space="preserve">Vale muito profundo</w:t>
+      </w:r>
+      <w:r>
+        <w:t xml:space="preserve"> </w:t>
+      </w:r>
+      <w:r>
+        <w:t xml:space="preserve">= precisamos de capital extra ou renegociar prazos</w:t>
+      </w:r>
+      <w:r>
+        <w:t xml:space="preserve"> </w:t>
+      </w:r>
+      <w:r>
+        <w:t xml:space="preserve">-</w:t>
+      </w:r>
+      <w:r>
+        <w:t xml:space="preserve"> </w:t>
+      </w:r>
+      <w:r>
+        <w:rPr>
+          <w:b/>
+          <w:bCs/>
+        </w:rPr>
+        <w:t xml:space="preserve">Runway abaixo de 4 semanas</w:t>
+      </w:r>
+      <w:r>
+        <w:t xml:space="preserve"> </w:t>
+      </w:r>
+      <w:r>
+        <w:t xml:space="preserve">= ALERTA MAXIMO</w:t>
+      </w:r>
+    </w:p>
+    <w:p>
+      <w:pPr>
+        <w:pStyle w:val="BodyText"/>
+      </w:pPr>
+      <w:r>
+        <w:rPr>
+          <w:b/>
+          <w:bCs/>
+        </w:rPr>
+        <w:t xml:space="preserve">TERMOS IMPORTANTES:</w:t>
+      </w:r>
+      <w:r>
+        <w:t xml:space="preserve"> </w:t>
+      </w:r>
+      <w:r>
+        <w:t xml:space="preserve">-</w:t>
+      </w:r>
+      <w:r>
+        <w:t xml:space="preserve"> </w:t>
+      </w:r>
+      <w:r>
+        <w:rPr>
+          <w:b/>
+          <w:bCs/>
+        </w:rPr>
+        <w:t xml:space="preserve">Runway:</w:t>
+      </w:r>
+      <w:r>
+        <w:t xml:space="preserve"> </w:t>
+      </w:r>
+      <w:r>
+        <w:t xml:space="preserve">“Pista de pouso”</w:t>
+      </w:r>
+      <w:r>
+        <w:t xml:space="preserve"> </w:t>
+      </w:r>
+      <w:r>
+        <w:t xml:space="preserve">- quantas semanas/meses a empresa sobrevive sem receita nova</w:t>
+      </w:r>
+      <w:r>
+        <w:t xml:space="preserve"> </w:t>
+      </w:r>
+      <w:r>
+        <w:t xml:space="preserve">-</w:t>
+      </w:r>
+      <w:r>
+        <w:t xml:space="preserve"> </w:t>
+      </w:r>
+      <w:r>
+        <w:rPr>
+          <w:b/>
+          <w:bCs/>
+        </w:rPr>
+        <w:t xml:space="preserve">Vale de Caixa:</w:t>
+      </w:r>
+      <w:r>
+        <w:t xml:space="preserve"> </w:t>
+      </w:r>
+      <w:r>
+        <w:t xml:space="preserve">Momento de menor liquidez, geralmente nos primeiros meses</w:t>
+      </w:r>
+      <w:r>
+        <w:t xml:space="preserve"> </w:t>
+      </w:r>
+      <w:r>
+        <w:t xml:space="preserve">-</w:t>
+      </w:r>
+      <w:r>
+        <w:t xml:space="preserve"> </w:t>
+      </w:r>
+      <w:r>
+        <w:rPr>
+          <w:b/>
+          <w:bCs/>
+        </w:rPr>
+        <w:t xml:space="preserve">Limite Critico:</w:t>
+      </w:r>
+      <w:r>
+        <w:t xml:space="preserve"> </w:t>
+      </w:r>
+      <w:r>
+        <w:t xml:space="preserve">Reserva minima para emergencias (2 semanas de despesas)</w:t>
+      </w:r>
+    </w:p>
     <w:bookmarkEnd w:id="234"/>
-    <w:bookmarkStart w:id="235" w:name="pagina3-30"/>
+    <w:bookmarkStart w:id="235" w:name="pagina3-31"/>
     <w:bookmarkEnd w:id="235"/>
-    <w:bookmarkStart w:id="236" w:name="pagina3-31"/>
+    <w:bookmarkStart w:id="236" w:name="pagina3-32"/>
     <w:bookmarkEnd w:id="236"/>
-    <w:bookmarkStart w:id="239" w:name="pagina3-32"/>
+    <w:bookmarkStart w:id="239" w:name="pagina3-33"/>
     <w:tbl>
       <w:tblPr>
         <w:tblStyle w:val="Table"/>
@@ -12500,7 +12915,7 @@
                           </pic:cNvPicPr>
                         </pic:nvPicPr>
                         <pic:blipFill>
-                          <a:blip r:embed="rId56"/>
+                          <a:blip r:embed="rId55"/>
                           <a:stretch>
                             <a:fillRect/>
                           </a:stretch>
@@ -12554,7 +12969,7 @@
               <w:pStyle w:val="Compact"/>
               <w:numPr>
                 <w:ilvl w:val="0"/>
-                <w:numId w:val="1016"/>
+                <w:numId w:val="1015"/>
               </w:numPr>
             </w:pPr>
             <w:r>
@@ -12576,7 +12991,7 @@
               <w:pStyle w:val="Compact"/>
               <w:numPr>
                 <w:ilvl w:val="0"/>
-                <w:numId w:val="1016"/>
+                <w:numId w:val="1015"/>
               </w:numPr>
             </w:pPr>
             <w:r>
@@ -12598,7 +13013,7 @@
               <w:pStyle w:val="Compact"/>
               <w:numPr>
                 <w:ilvl w:val="0"/>
-                <w:numId w:val="1016"/>
+                <w:numId w:val="1015"/>
               </w:numPr>
             </w:pPr>
             <w:r>
@@ -12620,7 +13035,7 @@
               <w:pStyle w:val="Compact"/>
               <w:numPr>
                 <w:ilvl w:val="0"/>
-                <w:numId w:val="1016"/>
+                <w:numId w:val="1015"/>
               </w:numPr>
             </w:pPr>
             <w:r>
@@ -12642,7 +13057,7 @@
       </w:tr>
     </w:tbl>
     <w:bookmarkEnd w:id="239"/>
-    <w:bookmarkStart w:id="242" w:name="pagina3-33"/>
+    <w:bookmarkStart w:id="242" w:name="pagina3-34"/>
     <w:tbl>
       <w:tblPr>
         <w:tblStyle w:val="Table"/>
@@ -12695,7 +13110,7 @@
                           </pic:cNvPicPr>
                         </pic:nvPicPr>
                         <pic:blipFill>
-                          <a:blip r:embed="rId64"/>
+                          <a:blip r:embed="rId63"/>
                           <a:stretch>
                             <a:fillRect/>
                           </a:stretch>
@@ -12807,7 +13222,7 @@
       <w:pPr>
         <w:pStyle w:val="BodyText"/>
       </w:pPr>
-      <w:bookmarkStart w:id="246" w:name="pagina3-34"/>
+      <w:bookmarkStart w:id="246" w:name="pagina3-35"/>
       <w:r>
         <w:drawing>
           <wp:inline>
@@ -12818,7 +13233,7 @@
               <a:graphicData uri="http://schemas.openxmlformats.org/drawingml/2006/picture">
                 <pic:pic>
                   <pic:nvPicPr>
-                    <pic:cNvPr descr="relatorio_investidores_files/figure-docx/pagina3-output-34.png" id="245" name="Picture"/>
+                    <pic:cNvPr descr="relatorio_investidores_files/figure-docx/pagina3-output-35.png" id="245" name="Picture"/>
                     <pic:cNvPicPr>
                       <a:picLocks noChangeArrowheads="1" noChangeAspect="1"/>
                     </pic:cNvPicPr>
@@ -12852,7 +13267,7 @@
       </w:r>
       <w:bookmarkEnd w:id="246"/>
     </w:p>
-    <w:bookmarkStart w:id="247" w:name="pagina3-35"/>
+    <w:bookmarkStart w:id="247" w:name="pagina3-36"/>
     <w:p>
       <w:pPr>
         <w:pStyle w:val="BodyText"/>
@@ -12862,83 +13277,147 @@
           <w:b/>
           <w:bCs/>
         </w:rPr>
-        <w:t xml:space="preserve">📖 COMO LER ESTE GRÁFICO:</w:t>
+        <w:t xml:space="preserve">📖 COMO LER ESTE GRÁFICO (ALAVANCAGEM OPERACIONAL):</w:t>
       </w:r>
     </w:p>
     <w:p>
       <w:pPr>
-        <w:pStyle w:val="Compact"/>
-        <w:numPr>
-          <w:ilvl w:val="0"/>
-          <w:numId w:val="1017"/>
-        </w:numPr>
+        <w:pStyle w:val="BodyText"/>
       </w:pPr>
       <w:r>
         <w:rPr>
           <w:b/>
           <w:bCs/>
         </w:rPr>
-        <w:t xml:space="preserve">Pontos Coloridos:</w:t>
+        <w:t xml:space="preserve">O QUE ESTOU VENDO?</w:t>
       </w:r>
       <w:r>
         <w:t xml:space="preserve"> </w:t>
       </w:r>
       <w:r>
-        <w:t xml:space="preserve">Cada mês da projeção (M1 a M36, cor mais clara = mais antigo)</w:t>
+        <w:t xml:space="preserve">Este grafico responde:</w:t>
+      </w:r>
+      <w:r>
+        <w:t xml:space="preserve"> </w:t>
+      </w:r>
+      <w:r>
+        <w:t xml:space="preserve">“Quando a receita cresce, o lucro cresce mais rapido, igual, ou mais devagar?”</w:t>
       </w:r>
     </w:p>
     <w:p>
       <w:pPr>
-        <w:pStyle w:val="Compact"/>
-        <w:numPr>
-          <w:ilvl w:val="0"/>
-          <w:numId w:val="1017"/>
-        </w:numPr>
+        <w:pStyle w:val="BodyText"/>
       </w:pPr>
       <w:r>
         <w:rPr>
           <w:b/>
           <w:bCs/>
         </w:rPr>
-        <w:t xml:space="preserve">Eixo X:</w:t>
+        <w:t xml:space="preserve">ELEMENTOS:</w:t>
       </w:r>
       <w:r>
         <w:t xml:space="preserve"> </w:t>
       </w:r>
       <w:r>
-        <w:t xml:space="preserve">Receita bruta mensal</w:t>
-      </w:r>
-    </w:p>
-    <w:p>
-      <w:pPr>
-        <w:pStyle w:val="Compact"/>
-        <w:numPr>
-          <w:ilvl w:val="0"/>
-          <w:numId w:val="1017"/>
-        </w:numPr>
-      </w:pPr>
+        <w:t xml:space="preserve">-</w:t>
+      </w:r>
+      <w:r>
+        <w:t xml:space="preserve"> </w:t>
+      </w:r>
       <w:r>
         <w:rPr>
           <w:b/>
           <w:bCs/>
         </w:rPr>
-        <w:t xml:space="preserve">Eixo Y:</w:t>
+        <w:t xml:space="preserve">Cada Ponto = 1 Mes:</w:t>
       </w:r>
       <w:r>
         <w:t xml:space="preserve"> </w:t>
       </w:r>
       <w:r>
-        <w:t xml:space="preserve">Margem EBITDA (%)</w:t>
-      </w:r>
-    </w:p>
-    <w:p>
-      <w:pPr>
-        <w:pStyle w:val="Compact"/>
-        <w:numPr>
-          <w:ilvl w:val="0"/>
-          <w:numId w:val="1017"/>
-        </w:numPr>
-      </w:pPr>
+        <w:t xml:space="preserve">Cor mais escura = mes mais recente. Os pontos devem</w:t>
+      </w:r>
+      <w:r>
+        <w:t xml:space="preserve"> </w:t>
+      </w:r>
+      <w:r>
+        <w:t xml:space="preserve">“subir e ir para direita”</w:t>
+      </w:r>
+      <w:r>
+        <w:t xml:space="preserve"> </w:t>
+      </w:r>
+      <w:r>
+        <w:t xml:space="preserve">-</w:t>
+      </w:r>
+      <w:r>
+        <w:t xml:space="preserve"> </w:t>
+      </w:r>
+      <w:r>
+        <w:rPr>
+          <w:b/>
+          <w:bCs/>
+        </w:rPr>
+        <w:t xml:space="preserve">Eixo X (Horizontal):</w:t>
+      </w:r>
+      <w:r>
+        <w:t xml:space="preserve"> </w:t>
+      </w:r>
+      <w:r>
+        <w:t xml:space="preserve">Receita bruta - quanto a empresa fatura</w:t>
+      </w:r>
+      <w:r>
+        <w:t xml:space="preserve"> </w:t>
+      </w:r>
+      <w:r>
+        <w:t xml:space="preserve">-</w:t>
+      </w:r>
+      <w:r>
+        <w:t xml:space="preserve"> </w:t>
+      </w:r>
+      <w:r>
+        <w:rPr>
+          <w:b/>
+          <w:bCs/>
+        </w:rPr>
+        <w:t xml:space="preserve">Eixo Y (Vertical):</w:t>
+      </w:r>
+      <w:r>
+        <w:t xml:space="preserve"> </w:t>
+      </w:r>
+      <w:r>
+        <w:t xml:space="preserve">Margem EBITDA em % - quanto sobra de lucro operacional</w:t>
+      </w:r>
+      <w:r>
+        <w:t xml:space="preserve"> </w:t>
+      </w:r>
+      <w:r>
+        <w:t xml:space="preserve">-</w:t>
+      </w:r>
+      <w:r>
+        <w:t xml:space="preserve"> </w:t>
+      </w:r>
+      <w:r>
+        <w:rPr>
+          <w:b/>
+          <w:bCs/>
+        </w:rPr>
+        <w:t xml:space="preserve">Linha Roxa Tracejada (Ideal):</w:t>
+      </w:r>
+      <w:r>
+        <w:t xml:space="preserve"> </w:t>
+      </w:r>
+      <w:r>
+        <w:t xml:space="preserve">Trajetoria que atingiriamos com benchmarks de mercado</w:t>
+      </w:r>
+      <w:r>
+        <w:t xml:space="preserve"> </w:t>
+      </w:r>
+      <w:r>
+        <w:t xml:space="preserve">-</w:t>
+      </w:r>
+      <w:r>
+        <w:t xml:space="preserve"> </w:t>
+      </w:r>
       <w:r>
         <w:rPr>
           <w:b/>
@@ -12950,79 +13429,219 @@
         <w:t xml:space="preserve"> </w:t>
       </w:r>
       <w:r>
-        <w:t xml:space="preserve">Tendência real (regressão)</w:t>
-      </w:r>
-    </w:p>
-    <w:p>
-      <w:pPr>
-        <w:pStyle w:val="Compact"/>
-        <w:numPr>
-          <w:ilvl w:val="0"/>
-          <w:numId w:val="1017"/>
-        </w:numPr>
-      </w:pPr>
+        <w:t xml:space="preserve">Tendencia real baseada nos dados</w:t>
+      </w:r>
+      <w:r>
+        <w:t xml:space="preserve"> </w:t>
+      </w:r>
+      <w:r>
+        <w:t xml:space="preserve">-</w:t>
+      </w:r>
+      <w:r>
+        <w:t xml:space="preserve"> </w:t>
+      </w:r>
       <w:r>
         <w:rPr>
           <w:b/>
           <w:bCs/>
         </w:rPr>
-        <w:t xml:space="preserve">Faixa Verde:</w:t>
+        <w:t xml:space="preserve">Faixa Verde (acima de 20%):</w:t>
       </w:r>
       <w:r>
         <w:t xml:space="preserve"> </w:t>
       </w:r>
       <w:r>
-        <w:t xml:space="preserve">Zona saudável (EBITDA &gt; 20%)</w:t>
-      </w:r>
-    </w:p>
-    <w:p>
-      <w:pPr>
-        <w:pStyle w:val="Compact"/>
-        <w:numPr>
-          <w:ilvl w:val="0"/>
-          <w:numId w:val="1017"/>
-        </w:numPr>
-      </w:pPr>
+        <w:t xml:space="preserve">Margem saudavel para reinvestir e crescer</w:t>
+      </w:r>
+      <w:r>
+        <w:t xml:space="preserve"> </w:t>
+      </w:r>
+      <w:r>
+        <w:t xml:space="preserve">-</w:t>
+      </w:r>
+      <w:r>
+        <w:t xml:space="preserve"> </w:t>
+      </w:r>
       <w:r>
         <w:rPr>
           <w:b/>
           <w:bCs/>
         </w:rPr>
-        <w:t xml:space="preserve">Faixa Vermelha:</w:t>
+        <w:t xml:space="preserve">Faixa Vermelha (abaixo de 0%):</w:t>
       </w:r>
       <w:r>
         <w:t xml:space="preserve"> </w:t>
       </w:r>
       <w:r>
-        <w:t xml:space="preserve">Zona de prejuízo (EBITDA &lt; 0)</w:t>
+        <w:t xml:space="preserve">Prejuizo operacional</w:t>
       </w:r>
     </w:p>
     <w:p>
       <w:pPr>
-        <w:pStyle w:val="Compact"/>
-        <w:numPr>
-          <w:ilvl w:val="0"/>
-          <w:numId w:val="1017"/>
-        </w:numPr>
+        <w:pStyle w:val="BodyText"/>
       </w:pPr>
       <w:r>
         <w:rPr>
           <w:b/>
           <w:bCs/>
         </w:rPr>
-        <w:t xml:space="preserve">Regra de Sucesso:</w:t>
+        <w:t xml:space="preserve">COMO INTERPRETAR:</w:t>
       </w:r>
       <w:r>
         <w:t xml:space="preserve"> </w:t>
       </w:r>
       <w:r>
-        <w:t xml:space="preserve">Pontos devem subir e entrar na zona verde</w:t>
+        <w:t xml:space="preserve">-</w:t>
+      </w:r>
+      <w:r>
+        <w:t xml:space="preserve"> </w:t>
+      </w:r>
+      <w:r>
+        <w:rPr>
+          <w:b/>
+          <w:bCs/>
+        </w:rPr>
+        <w:t xml:space="preserve">Pontos subindo rapido</w:t>
+      </w:r>
+      <w:r>
+        <w:t xml:space="preserve"> </w:t>
+      </w:r>
+      <w:r>
+        <w:t xml:space="preserve">= Modelo escalavel, cada real novo gera mais lucro</w:t>
+      </w:r>
+      <w:r>
+        <w:t xml:space="preserve"> </w:t>
+      </w:r>
+      <w:r>
+        <w:t xml:space="preserve">-</w:t>
+      </w:r>
+      <w:r>
+        <w:t xml:space="preserve"> </w:t>
+      </w:r>
+      <w:r>
+        <w:rPr>
+          <w:b/>
+          <w:bCs/>
+        </w:rPr>
+        <w:t xml:space="preserve">Pontos subindo devagar</w:t>
+      </w:r>
+      <w:r>
+        <w:t xml:space="preserve"> </w:t>
+      </w:r>
+      <w:r>
+        <w:t xml:space="preserve">= Custos crescem junto com receita, pouca alavancagem</w:t>
+      </w:r>
+      <w:r>
+        <w:t xml:space="preserve"> </w:t>
+      </w:r>
+      <w:r>
+        <w:t xml:space="preserve">-</w:t>
+      </w:r>
+      <w:r>
+        <w:t xml:space="preserve"> </w:t>
+      </w:r>
+      <w:r>
+        <w:rPr>
+          <w:b/>
+          <w:bCs/>
+        </w:rPr>
+        <w:t xml:space="preserve">Ideal vs Real:</w:t>
+      </w:r>
+      <w:r>
+        <w:t xml:space="preserve"> </w:t>
+      </w:r>
+      <w:r>
+        <w:t xml:space="preserve">Se a linha roxa esta acima da azul, estamos abaixo do potencial</w:t>
+      </w:r>
+    </w:p>
+    <w:p>
+      <w:pPr>
+        <w:pStyle w:val="BodyText"/>
+      </w:pPr>
+      <w:r>
+        <w:rPr>
+          <w:b/>
+          <w:bCs/>
+        </w:rPr>
+        <w:t xml:space="preserve">TERMOS IMPORTANTES:</w:t>
+      </w:r>
+      <w:r>
+        <w:t xml:space="preserve"> </w:t>
+      </w:r>
+      <w:r>
+        <w:t xml:space="preserve">-</w:t>
+      </w:r>
+      <w:r>
+        <w:t xml:space="preserve"> </w:t>
+      </w:r>
+      <w:r>
+        <w:rPr>
+          <w:b/>
+          <w:bCs/>
+        </w:rPr>
+        <w:t xml:space="preserve">Alavancagem Operacional:</w:t>
+      </w:r>
+      <w:r>
+        <w:t xml:space="preserve"> </w:t>
+      </w:r>
+      <w:r>
+        <w:t xml:space="preserve">Quanto o lucro cresce para cada 1% de crescimento de receita</w:t>
+      </w:r>
+      <w:r>
+        <w:t xml:space="preserve"> </w:t>
+      </w:r>
+      <w:r>
+        <w:t xml:space="preserve">- Ex: Alavancagem 2x = receita dobra, lucro quadruplica</w:t>
+      </w:r>
+      <w:r>
+        <w:t xml:space="preserve"> </w:t>
+      </w:r>
+      <w:r>
+        <w:t xml:space="preserve">-</w:t>
+      </w:r>
+      <w:r>
+        <w:t xml:space="preserve"> </w:t>
+      </w:r>
+      <w:r>
+        <w:rPr>
+          <w:b/>
+          <w:bCs/>
+        </w:rPr>
+        <w:t xml:space="preserve">Modelo Escalavel:</w:t>
+      </w:r>
+      <w:r>
+        <w:t xml:space="preserve"> </w:t>
+      </w:r>
+      <w:r>
+        <w:t xml:space="preserve">Custos fixos se diluem com volume, margem melhora automaticamente</w:t>
+      </w:r>
+      <w:r>
+        <w:t xml:space="preserve"> </w:t>
+      </w:r>
+      <w:r>
+        <w:t xml:space="preserve">-</w:t>
+      </w:r>
+      <w:r>
+        <w:t xml:space="preserve"> </w:t>
+      </w:r>
+      <w:r>
+        <w:rPr>
+          <w:b/>
+          <w:bCs/>
+        </w:rPr>
+        <w:t xml:space="preserve">Margem EBITDA:</w:t>
+      </w:r>
+      <w:r>
+        <w:t xml:space="preserve"> </w:t>
+      </w:r>
+      <w:r>
+        <w:t xml:space="preserve">Lucro operacional dividido pela receita, em percentual</w:t>
       </w:r>
     </w:p>
     <w:bookmarkEnd w:id="247"/>
-    <w:bookmarkStart w:id="248" w:name="pagina3-36"/>
+    <w:bookmarkStart w:id="248" w:name="pagina3-37"/>
     <w:bookmarkEnd w:id="248"/>
-    <w:bookmarkStart w:id="251" w:name="pagina3-37"/>
+    <w:bookmarkStart w:id="251" w:name="pagina3-38"/>
     <w:tbl>
       <w:tblPr>
         <w:tblStyle w:val="Table"/>
@@ -13053,7 +13672,7 @@
           </w:tcPr>
           <w:p>
             <w:pPr>
-              <w:pStyle w:val="FirstParagraph"/>
+              <w:pStyle w:val="BodyText"/>
             </w:pPr>
             <w:pPr>
               <w:spacing w:before="0" w:after="0"/>
@@ -13075,7 +13694,7 @@
                           </pic:cNvPicPr>
                         </pic:nvPicPr>
                         <pic:blipFill>
-                          <a:blip r:embed="rId52"/>
+                          <a:blip r:embed="rId51"/>
                           <a:stretch>
                             <a:fillRect/>
                           </a:stretch>
@@ -13129,7 +13748,7 @@
               <w:pStyle w:val="Compact"/>
               <w:numPr>
                 <w:ilvl w:val="0"/>
-                <w:numId w:val="1018"/>
+                <w:numId w:val="1016"/>
               </w:numPr>
             </w:pPr>
             <w:r>
@@ -13151,7 +13770,7 @@
               <w:pStyle w:val="Compact"/>
               <w:numPr>
                 <w:ilvl w:val="0"/>
-                <w:numId w:val="1018"/>
+                <w:numId w:val="1016"/>
               </w:numPr>
             </w:pPr>
             <w:r>
@@ -13173,7 +13792,7 @@
               <w:pStyle w:val="Compact"/>
               <w:numPr>
                 <w:ilvl w:val="0"/>
-                <w:numId w:val="1018"/>
+                <w:numId w:val="1016"/>
               </w:numPr>
             </w:pPr>
             <w:r>
@@ -13195,7 +13814,7 @@
               <w:pStyle w:val="Compact"/>
               <w:numPr>
                 <w:ilvl w:val="0"/>
-                <w:numId w:val="1018"/>
+                <w:numId w:val="1016"/>
               </w:numPr>
             </w:pPr>
             <w:r>
@@ -13217,7 +13836,7 @@
       </w:tr>
     </w:tbl>
     <w:bookmarkEnd w:id="251"/>
-    <w:bookmarkStart w:id="254" w:name="pagina3-38"/>
+    <w:bookmarkStart w:id="254" w:name="pagina3-39"/>
     <w:tbl>
       <w:tblPr>
         <w:tblStyle w:val="Table"/>
@@ -13270,7 +13889,7 @@
                           </pic:cNvPicPr>
                         </pic:nvPicPr>
                         <pic:blipFill>
-                          <a:blip r:embed="rId64"/>
+                          <a:blip r:embed="rId63"/>
                           <a:stretch>
                             <a:fillRect/>
                           </a:stretch>
@@ -13382,7 +14001,7 @@
       <w:pPr>
         <w:pStyle w:val="BodyText"/>
       </w:pPr>
-      <w:bookmarkStart w:id="258" w:name="pagina3-39"/>
+      <w:bookmarkStart w:id="258" w:name="pagina3-40"/>
       <w:r>
         <w:drawing>
           <wp:inline>
@@ -13393,7 +14012,7 @@
               <a:graphicData uri="http://schemas.openxmlformats.org/drawingml/2006/picture">
                 <pic:pic>
                   <pic:nvPicPr>
-                    <pic:cNvPr descr="relatorio_investidores_files/figure-docx/pagina3-output-39.png" id="257" name="Picture"/>
+                    <pic:cNvPr descr="relatorio_investidores_files/figure-docx/pagina3-output-40.png" id="257" name="Picture"/>
                     <pic:cNvPicPr>
                       <a:picLocks noChangeArrowheads="1" noChangeAspect="1"/>
                     </pic:cNvPicPr>
@@ -13427,7 +14046,7 @@
       </w:r>
       <w:bookmarkEnd w:id="258"/>
     </w:p>
-    <w:bookmarkStart w:id="259" w:name="pagina3-40"/>
+    <w:bookmarkStart w:id="259" w:name="pagina3-41"/>
     <w:p>
       <w:pPr>
         <w:pStyle w:val="BodyText"/>
@@ -13629,9 +14248,9 @@
       </w:r>
     </w:p>
     <w:bookmarkEnd w:id="259"/>
-    <w:bookmarkStart w:id="260" w:name="pagina3-41"/>
+    <w:bookmarkStart w:id="260" w:name="pagina3-42"/>
     <w:bookmarkEnd w:id="260"/>
-    <w:bookmarkStart w:id="263" w:name="pagina3-42"/>
+    <w:bookmarkStart w:id="263" w:name="pagina3-43"/>
     <w:tbl>
       <w:tblPr>
         <w:tblStyle w:val="Table"/>
@@ -13684,7 +14303,7 @@
                           </pic:cNvPicPr>
                         </pic:nvPicPr>
                         <pic:blipFill>
-                          <a:blip r:embed="rId64"/>
+                          <a:blip r:embed="rId63"/>
                           <a:stretch>
                             <a:fillRect/>
                           </a:stretch>
@@ -13738,7 +14357,7 @@
               <w:pStyle w:val="Compact"/>
               <w:numPr>
                 <w:ilvl w:val="0"/>
-                <w:numId w:val="1019"/>
+                <w:numId w:val="1017"/>
               </w:numPr>
             </w:pPr>
             <w:r>
@@ -13760,7 +14379,7 @@
               <w:pStyle w:val="Compact"/>
               <w:numPr>
                 <w:ilvl w:val="0"/>
-                <w:numId w:val="1019"/>
+                <w:numId w:val="1017"/>
               </w:numPr>
             </w:pPr>
             <w:r>
@@ -13782,7 +14401,7 @@
               <w:pStyle w:val="Compact"/>
               <w:numPr>
                 <w:ilvl w:val="0"/>
-                <w:numId w:val="1019"/>
+                <w:numId w:val="1017"/>
               </w:numPr>
             </w:pPr>
             <w:r>
@@ -13804,7 +14423,7 @@
               <w:pStyle w:val="Compact"/>
               <w:numPr>
                 <w:ilvl w:val="0"/>
-                <w:numId w:val="1019"/>
+                <w:numId w:val="1017"/>
               </w:numPr>
             </w:pPr>
             <w:r>
@@ -13826,7 +14445,7 @@
       </w:tr>
     </w:tbl>
     <w:bookmarkEnd w:id="263"/>
-    <w:bookmarkStart w:id="266" w:name="pagina3-43"/>
+    <w:bookmarkStart w:id="266" w:name="pagina3-44"/>
     <w:tbl>
       <w:tblPr>
         <w:tblStyle w:val="Table"/>
@@ -13879,7 +14498,7 @@
                           </pic:cNvPicPr>
                         </pic:nvPicPr>
                         <pic:blipFill>
-                          <a:blip r:embed="rId64"/>
+                          <a:blip r:embed="rId63"/>
                           <a:stretch>
                             <a:fillRect/>
                           </a:stretch>
@@ -13987,7 +14606,7 @@
       </w:tr>
     </w:tbl>
     <w:bookmarkEnd w:id="266"/>
-    <w:bookmarkStart w:id="269" w:name="pagina3-44"/>
+    <w:bookmarkStart w:id="269" w:name="pagina3-45"/>
     <w:tbl>
       <w:tblPr>
         <w:tblStyle w:val="Table"/>
@@ -14040,7 +14659,7 @@
                           </pic:cNvPicPr>
                         </pic:nvPicPr>
                         <pic:blipFill>
-                          <a:blip r:embed="rId60"/>
+                          <a:blip r:embed="rId59"/>
                           <a:stretch>
                             <a:fillRect/>
                           </a:stretch>
@@ -14109,7 +14728,7 @@
               <w:pStyle w:val="Compact"/>
               <w:numPr>
                 <w:ilvl w:val="0"/>
-                <w:numId w:val="1020"/>
+                <w:numId w:val="1018"/>
               </w:numPr>
             </w:pPr>
             <w:r>
@@ -14131,7 +14750,7 @@
               <w:pStyle w:val="Compact"/>
               <w:numPr>
                 <w:ilvl w:val="0"/>
-                <w:numId w:val="1020"/>
+                <w:numId w:val="1018"/>
               </w:numPr>
             </w:pPr>
             <w:r>
@@ -14153,7 +14772,7 @@
               <w:pStyle w:val="Compact"/>
               <w:numPr>
                 <w:ilvl w:val="0"/>
-                <w:numId w:val="1020"/>
+                <w:numId w:val="1018"/>
               </w:numPr>
             </w:pPr>
             <w:r>
@@ -14175,7 +14794,7 @@
               <w:pStyle w:val="Compact"/>
               <w:numPr>
                 <w:ilvl w:val="0"/>
-                <w:numId w:val="1020"/>
+                <w:numId w:val="1018"/>
               </w:numPr>
             </w:pPr>
             <w:r>
@@ -14197,7 +14816,7 @@
               <w:pStyle w:val="Compact"/>
               <w:numPr>
                 <w:ilvl w:val="0"/>
-                <w:numId w:val="1020"/>
+                <w:numId w:val="1018"/>
               </w:numPr>
             </w:pPr>
             <w:r>
@@ -14643,6 +15262,9 @@
     </w:lvlOverride>
   </w:num>
   <w:num w:numId="1011">
+    <w:abstractNumId w:val="991"/>
+  </w:num>
+  <w:num w:numId="1012">
     <w:abstractNumId w:val="99411"/>
     <w:lvlOverride w:ilvl="0">
       <w:startOverride w:val="1"/>
@@ -14672,10 +15294,10 @@
       <w:startOverride w:val="1"/>
     </w:lvlOverride>
   </w:num>
-  <w:num w:numId="1012">
+  <w:num w:numId="1013">
     <w:abstractNumId w:val="991"/>
   </w:num>
-  <w:num w:numId="1013">
+  <w:num w:numId="1014">
     <w:abstractNumId w:val="99411"/>
     <w:lvlOverride w:ilvl="0">
       <w:startOverride w:val="1"/>
@@ -14705,79 +15327,16 @@
       <w:startOverride w:val="1"/>
     </w:lvlOverride>
   </w:num>
-  <w:num w:numId="1014">
+  <w:num w:numId="1015">
     <w:abstractNumId w:val="991"/>
-  </w:num>
-  <w:num w:numId="1015">
-    <w:abstractNumId w:val="99411"/>
-    <w:lvlOverride w:ilvl="0">
-      <w:startOverride w:val="1"/>
-    </w:lvlOverride>
-    <w:lvlOverride w:ilvl="1">
-      <w:startOverride w:val="1"/>
-    </w:lvlOverride>
-    <w:lvlOverride w:ilvl="2">
-      <w:startOverride w:val="1"/>
-    </w:lvlOverride>
-    <w:lvlOverride w:ilvl="3">
-      <w:startOverride w:val="1"/>
-    </w:lvlOverride>
-    <w:lvlOverride w:ilvl="4">
-      <w:startOverride w:val="1"/>
-    </w:lvlOverride>
-    <w:lvlOverride w:ilvl="5">
-      <w:startOverride w:val="1"/>
-    </w:lvlOverride>
-    <w:lvlOverride w:ilvl="6">
-      <w:startOverride w:val="1"/>
-    </w:lvlOverride>
-    <w:lvlOverride w:ilvl="7">
-      <w:startOverride w:val="1"/>
-    </w:lvlOverride>
-    <w:lvlOverride w:ilvl="8">
-      <w:startOverride w:val="1"/>
-    </w:lvlOverride>
   </w:num>
   <w:num w:numId="1016">
     <w:abstractNumId w:val="991"/>
   </w:num>
   <w:num w:numId="1017">
-    <w:abstractNumId w:val="99411"/>
-    <w:lvlOverride w:ilvl="0">
-      <w:startOverride w:val="1"/>
-    </w:lvlOverride>
-    <w:lvlOverride w:ilvl="1">
-      <w:startOverride w:val="1"/>
-    </w:lvlOverride>
-    <w:lvlOverride w:ilvl="2">
-      <w:startOverride w:val="1"/>
-    </w:lvlOverride>
-    <w:lvlOverride w:ilvl="3">
-      <w:startOverride w:val="1"/>
-    </w:lvlOverride>
-    <w:lvlOverride w:ilvl="4">
-      <w:startOverride w:val="1"/>
-    </w:lvlOverride>
-    <w:lvlOverride w:ilvl="5">
-      <w:startOverride w:val="1"/>
-    </w:lvlOverride>
-    <w:lvlOverride w:ilvl="6">
-      <w:startOverride w:val="1"/>
-    </w:lvlOverride>
-    <w:lvlOverride w:ilvl="7">
-      <w:startOverride w:val="1"/>
-    </w:lvlOverride>
-    <w:lvlOverride w:ilvl="8">
-      <w:startOverride w:val="1"/>
-    </w:lvlOverride>
+    <w:abstractNumId w:val="991"/>
   </w:num>
   <w:num w:numId="1018">
-    <w:abstractNumId w:val="991"/>
-  </w:num>
-  <w:num w:numId="1019">
-    <w:abstractNumId w:val="991"/>
-  </w:num>
-  <w:num w:numId="1020">
     <w:abstractNumId w:val="99411"/>
     <w:lvlOverride w:ilvl="0">
       <w:startOverride w:val="1"/>

</xml_diff>

<commit_message>
Titulos VIZ + checklist V2
</commit_message>
<xml_diff>
--- a/notebooks/quarto_pdf/relatorio_investidores.docx
+++ b/notebooks/quarto_pdf/relatorio_investidores.docx
@@ -36,7 +36,20 @@
         </w:p>
       </w:sdtContent>
     </w:sdt>
-    <w:bookmarkStart w:id="69" w:name="página-1-executive-cockpit"/>
+    <w:bookmarkStart w:id="20" w:name="setup"/>
+    <w:p>
+      <w:pPr>
+        <w:pStyle w:val="SourceCode"/>
+      </w:pPr>
+      <w:r>
+        <w:rPr>
+          <w:rStyle w:val="VerbatimChar"/>
+        </w:rPr>
+        <w:t xml:space="preserve">⚠️  celula_0_utils não encontrado. Definindo helpers locais...</w:t>
+      </w:r>
+    </w:p>
+    <w:bookmarkEnd w:id="20"/>
+    <w:bookmarkStart w:id="70" w:name="página-1-executive-cockpit"/>
     <w:p>
       <w:pPr>
         <w:pStyle w:val="Heading1"/>
@@ -71,9 +84,9 @@
         <w:t xml:space="preserve">Nesta seção, apresentamos o resumo executivo da operação, destacando a tração de receita (MRR), a eficiência de capital (Burn Rate) e os principais marcos atingidos.</w:t>
       </w:r>
     </w:p>
-    <w:bookmarkStart w:id="68" w:name="pagina1"/>
-    <w:bookmarkStart w:id="21" w:name="pagina1-1"/>
-    <w:bookmarkStart w:id="20" w:name="tabela-executiva-master"/>
+    <w:bookmarkStart w:id="69" w:name="pagina1"/>
+    <w:bookmarkStart w:id="22" w:name="pagina1-1"/>
+    <w:bookmarkStart w:id="21" w:name="tabela-executiva-master"/>
     <w:p>
       <w:pPr>
         <w:pStyle w:val="Heading2"/>
@@ -82,9 +95,9 @@
         <w:t xml:space="preserve">📊 1.1 TABELA EXECUTIVA MASTER</w:t>
       </w:r>
     </w:p>
-    <w:bookmarkEnd w:id="20"/>
     <w:bookmarkEnd w:id="21"/>
-    <w:bookmarkStart w:id="22" w:name="pagina1-2"/>
+    <w:bookmarkEnd w:id="22"/>
+    <w:bookmarkStart w:id="23" w:name="pagina1-2"/>
     <w:tbl>
       <w:tblPr>
         <w:tblStyle w:val="Table"/>
@@ -1673,8 +1686,8 @@
         </w:tc>
       </w:tr>
     </w:tbl>
-    <w:bookmarkEnd w:id="22"/>
-    <w:bookmarkStart w:id="23" w:name="pagina1-3"/>
+    <w:bookmarkEnd w:id="23"/>
+    <w:bookmarkStart w:id="24" w:name="pagina1-3"/>
     <w:p>
       <w:pPr>
         <w:pStyle w:val="BodyText"/>
@@ -1693,10 +1706,10 @@
         <w:t xml:space="preserve">Benchmark = Cenário Ideal.</w:t>
       </w:r>
     </w:p>
-    <w:bookmarkEnd w:id="23"/>
-    <w:bookmarkStart w:id="24" w:name="pagina1-4"/>
     <w:bookmarkEnd w:id="24"/>
-    <w:bookmarkStart w:id="28" w:name="pagina1-5"/>
+    <w:bookmarkStart w:id="25" w:name="pagina1-4"/>
+    <w:bookmarkEnd w:id="25"/>
+    <w:bookmarkStart w:id="29" w:name="pagina1-5"/>
     <w:p>
       <w:pPr>
         <w:pStyle w:val="CaptionedFigure"/>
@@ -1706,18 +1719,18 @@
           <wp:inline>
             <wp:extent cx="5334000" cy="1637969"/>
             <wp:effectExtent b="0" l="0" r="0" t="0"/>
-            <wp:docPr descr="KPI Cards" title="" id="26" name="Picture"/>
+            <wp:docPr descr="KPI Cards" title="" id="27" name="Picture"/>
             <a:graphic>
               <a:graphicData uri="http://schemas.openxmlformats.org/drawingml/2006/picture">
                 <pic:pic>
                   <pic:nvPicPr>
-                    <pic:cNvPr descr="outputs/figs/pg1_kpi_cards.png" id="27" name="Picture"/>
+                    <pic:cNvPr descr="outputs/figs/pg1_kpi_cards.png" id="28" name="Picture"/>
                     <pic:cNvPicPr>
                       <a:picLocks noChangeArrowheads="1" noChangeAspect="1"/>
                     </pic:cNvPicPr>
                   </pic:nvPicPr>
                   <pic:blipFill>
-                    <a:blip r:embed="rId25"/>
+                    <a:blip r:embed="rId26"/>
                     <a:stretch>
                       <a:fillRect/>
                     </a:stretch>
@@ -1752,9 +1765,9 @@
         <w:t xml:space="preserve">KPI Cards</w:t>
       </w:r>
     </w:p>
-    <w:bookmarkEnd w:id="28"/>
-    <w:bookmarkStart w:id="29" w:name="pagina1-6"/>
     <w:bookmarkEnd w:id="29"/>
+    <w:bookmarkStart w:id="30" w:name="pagina1-6"/>
+    <w:bookmarkEnd w:id="30"/>
     <w:p>
       <w:pPr>
         <w:pStyle w:val="SourceCode"/>
@@ -1766,8 +1779,8 @@
         <w:t xml:space="preserve">DEBUG: Executing gerar_grafico_temporal_correlacao V2.1 (FIX NAMEERROR)</w:t>
       </w:r>
     </w:p>
-    <w:bookmarkStart w:id="31" w:name="pagina1-7"/>
-    <w:bookmarkStart w:id="30" w:name="evolução-mrr-vs-usuários"/>
+    <w:bookmarkStart w:id="32" w:name="pagina1-7"/>
+    <w:bookmarkStart w:id="31" w:name="evolução-mrr-vs-usuários"/>
     <w:p>
       <w:pPr>
         <w:pStyle w:val="Heading3"/>
@@ -1776,9 +1789,9 @@
         <w:t xml:space="preserve">📈 EVOLUÇÃO MRR vs USUÁRIOS</w:t>
       </w:r>
     </w:p>
-    <w:bookmarkEnd w:id="30"/>
     <w:bookmarkEnd w:id="31"/>
-    <w:bookmarkStart w:id="35" w:name="pagina1-8"/>
+    <w:bookmarkEnd w:id="32"/>
+    <w:bookmarkStart w:id="36" w:name="pagina1-8"/>
     <w:p>
       <w:pPr>
         <w:pStyle w:val="CaptionedFigure"/>
@@ -1788,18 +1801,18 @@
           <wp:inline>
             <wp:extent cx="5334000" cy="2626881"/>
             <wp:effectExtent b="0" l="0" r="0" t="0"/>
-            <wp:docPr descr="Evolução Temporal" title="" id="33" name="Picture"/>
+            <wp:docPr descr="Evolução Temporal" title="" id="34" name="Picture"/>
             <a:graphic>
               <a:graphicData uri="http://schemas.openxmlformats.org/drawingml/2006/picture">
                 <pic:pic>
                   <pic:nvPicPr>
-                    <pic:cNvPr descr="outputs/figs/pg1_temporal_correlacao.png" id="34" name="Picture"/>
+                    <pic:cNvPr descr="outputs/figs/pg1_temporal_correlacao.png" id="35" name="Picture"/>
                     <pic:cNvPicPr>
                       <a:picLocks noChangeArrowheads="1" noChangeAspect="1"/>
                     </pic:cNvPicPr>
                   </pic:nvPicPr>
                   <pic:blipFill>
-                    <a:blip r:embed="rId32"/>
+                    <a:blip r:embed="rId33"/>
                     <a:stretch>
                       <a:fillRect/>
                     </a:stretch>
@@ -1834,8 +1847,8 @@
         <w:t xml:space="preserve">Evolução Temporal</w:t>
       </w:r>
     </w:p>
-    <w:bookmarkEnd w:id="35"/>
-    <w:bookmarkStart w:id="36" w:name="pagina1-9"/>
+    <w:bookmarkEnd w:id="36"/>
+    <w:bookmarkStart w:id="37" w:name="pagina1-9"/>
     <w:p>
       <w:r>
         <w:pict>
@@ -1843,9 +1856,9 @@
         </w:pict>
       </w:r>
     </w:p>
-    <w:bookmarkEnd w:id="36"/>
-    <w:bookmarkStart w:id="38" w:name="pagina1-10"/>
-    <w:bookmarkStart w:id="37" w:name="tabela-de-referência"/>
+    <w:bookmarkEnd w:id="37"/>
+    <w:bookmarkStart w:id="39" w:name="pagina1-10"/>
+    <w:bookmarkStart w:id="38" w:name="tabela-de-referência"/>
     <w:p>
       <w:pPr>
         <w:pStyle w:val="Heading4"/>
@@ -1854,9 +1867,9 @@
         <w:t xml:space="preserve">📋 TABELA DE REFERÊNCIA</w:t>
       </w:r>
     </w:p>
-    <w:bookmarkEnd w:id="37"/>
     <w:bookmarkEnd w:id="38"/>
-    <w:bookmarkStart w:id="39" w:name="pagina1-11"/>
+    <w:bookmarkEnd w:id="39"/>
+    <w:bookmarkStart w:id="40" w:name="pagina1-11"/>
     <w:tbl>
       <w:tblPr>
         <w:tblStyle w:val="Table"/>
@@ -2308,11 +2321,11 @@
         </w:tc>
       </w:tr>
     </w:tbl>
-    <w:bookmarkEnd w:id="39"/>
-    <w:bookmarkStart w:id="40" w:name="pagina1-12"/>
     <w:bookmarkEnd w:id="40"/>
-    <w:bookmarkStart w:id="42" w:name="pagina1-13"/>
-    <w:bookmarkStart w:id="41" w:name="tabela-de-milestones"/>
+    <w:bookmarkStart w:id="41" w:name="pagina1-12"/>
+    <w:bookmarkEnd w:id="41"/>
+    <w:bookmarkStart w:id="43" w:name="pagina1-13"/>
+    <w:bookmarkStart w:id="42" w:name="tabela-de-milestones"/>
     <w:p>
       <w:pPr>
         <w:pStyle w:val="Heading4"/>
@@ -2321,9 +2334,9 @@
         <w:t xml:space="preserve">🏁 TABELA DE MILESTONES</w:t>
       </w:r>
     </w:p>
-    <w:bookmarkEnd w:id="41"/>
     <w:bookmarkEnd w:id="42"/>
-    <w:bookmarkStart w:id="43" w:name="pagina1-14"/>
+    <w:bookmarkEnd w:id="43"/>
+    <w:bookmarkStart w:id="44" w:name="pagina1-14"/>
     <w:tbl>
       <w:tblPr>
         <w:tblStyle w:val="Table"/>
@@ -2940,8 +2953,8 @@
         </w:tc>
       </w:tr>
     </w:tbl>
-    <w:bookmarkEnd w:id="43"/>
-    <w:bookmarkStart w:id="47" w:name="pagina1-15"/>
+    <w:bookmarkEnd w:id="44"/>
+    <w:bookmarkStart w:id="48" w:name="pagina1-15"/>
     <w:p>
       <w:pPr>
         <w:pStyle w:val="CaptionedFigure"/>
@@ -2951,18 +2964,18 @@
           <wp:inline>
             <wp:extent cx="5334000" cy="2554824"/>
             <wp:effectExtent b="0" l="0" r="0" t="0"/>
-            <wp:docPr descr="Eficiência Marketing" title="" id="45" name="Picture"/>
+            <wp:docPr descr="Eficiência Marketing" title="" id="46" name="Picture"/>
             <a:graphic>
               <a:graphicData uri="http://schemas.openxmlformats.org/drawingml/2006/picture">
                 <pic:pic>
                   <pic:nvPicPr>
-                    <pic:cNvPr descr="outputs/figs/pg1_eficiencia_marketing.png" id="46" name="Picture"/>
+                    <pic:cNvPr descr="outputs/figs/pg1_eficiencia_marketing.png" id="47" name="Picture"/>
                     <pic:cNvPicPr>
                       <a:picLocks noChangeArrowheads="1" noChangeAspect="1"/>
                     </pic:cNvPicPr>
                   </pic:nvPicPr>
                   <pic:blipFill>
-                    <a:blip r:embed="rId44"/>
+                    <a:blip r:embed="rId45"/>
                     <a:stretch>
                       <a:fillRect/>
                     </a:stretch>
@@ -2997,11 +3010,11 @@
         <w:t xml:space="preserve">Eficiência Marketing</w:t>
       </w:r>
     </w:p>
-    <w:bookmarkEnd w:id="47"/>
-    <w:bookmarkStart w:id="48" w:name="pagina1-16"/>
     <w:bookmarkEnd w:id="48"/>
-    <w:bookmarkStart w:id="50" w:name="pagina1-17"/>
-    <w:bookmarkStart w:id="49" w:name="insights-estratégicos-do-cockpit"/>
+    <w:bookmarkStart w:id="49" w:name="pagina1-16"/>
+    <w:bookmarkEnd w:id="49"/>
+    <w:bookmarkStart w:id="51" w:name="pagina1-17"/>
+    <w:bookmarkStart w:id="50" w:name="insights-estratégicos-do-cockpit"/>
     <w:p>
       <w:pPr>
         <w:pStyle w:val="Heading2"/>
@@ -3010,9 +3023,9 @@
         <w:t xml:space="preserve">🧠 INSIGHTS ESTRATÉGICOS DO COCKPIT</w:t>
       </w:r>
     </w:p>
-    <w:bookmarkEnd w:id="49"/>
     <w:bookmarkEnd w:id="50"/>
-    <w:bookmarkStart w:id="54" w:name="pagina1-18"/>
+    <w:bookmarkEnd w:id="51"/>
+    <w:bookmarkStart w:id="55" w:name="pagina1-18"/>
     <w:tbl>
       <w:tblPr>
         <w:tblStyle w:val="Table"/>
@@ -3054,18 +3067,18 @@
                 <wp:inline>
                   <wp:extent cx="152400" cy="152400"/>
                   <wp:effectExtent b="0" l="0" r="0" t="0"/>
-                  <wp:docPr descr="" title="" id="52" name="Picture"/>
+                  <wp:docPr descr="" title="" id="53" name="Picture"/>
                   <a:graphic>
                     <a:graphicData uri="http://schemas.openxmlformats.org/drawingml/2006/picture">
                       <pic:pic>
                         <pic:nvPicPr>
-                          <pic:cNvPr descr="C:\Users\User\AppData\Local\Programs\Quarto\share\formats\docx\tip.png" id="53" name="Picture"/>
+                          <pic:cNvPr descr="C:\Users\User\AppData\Local\Programs\Quarto\share\formats\docx\tip.png" id="54" name="Picture"/>
                           <pic:cNvPicPr>
                             <a:picLocks noChangeArrowheads="1" noChangeAspect="1"/>
                           </pic:cNvPicPr>
                         </pic:nvPicPr>
                         <pic:blipFill>
-                          <a:blip r:embed="rId51"/>
+                          <a:blip r:embed="rId52"/>
                           <a:stretch>
                             <a:fillRect/>
                           </a:stretch>
@@ -3206,8 +3219,8 @@
         </w:tc>
       </w:tr>
     </w:tbl>
-    <w:bookmarkEnd w:id="54"/>
-    <w:bookmarkStart w:id="58" w:name="pagina1-19"/>
+    <w:bookmarkEnd w:id="55"/>
+    <w:bookmarkStart w:id="59" w:name="pagina1-19"/>
     <w:tbl>
       <w:tblPr>
         <w:tblStyle w:val="Table"/>
@@ -3249,18 +3262,18 @@
                 <wp:inline>
                   <wp:extent cx="152400" cy="152400"/>
                   <wp:effectExtent b="0" l="0" r="0" t="0"/>
-                  <wp:docPr descr="" title="" id="56" name="Picture"/>
+                  <wp:docPr descr="" title="" id="57" name="Picture"/>
                   <a:graphic>
                     <a:graphicData uri="http://schemas.openxmlformats.org/drawingml/2006/picture">
                       <pic:pic>
                         <pic:nvPicPr>
-                          <pic:cNvPr descr="C:\Users\User\AppData\Local\Programs\Quarto\share\formats\docx\warning.png" id="57" name="Picture"/>
+                          <pic:cNvPr descr="C:\Users\User\AppData\Local\Programs\Quarto\share\formats\docx\warning.png" id="58" name="Picture"/>
                           <pic:cNvPicPr>
                             <a:picLocks noChangeArrowheads="1" noChangeAspect="1"/>
                           </pic:cNvPicPr>
                         </pic:nvPicPr>
                         <pic:blipFill>
-                          <a:blip r:embed="rId55"/>
+                          <a:blip r:embed="rId56"/>
                           <a:stretch>
                             <a:fillRect/>
                           </a:stretch>
@@ -3401,8 +3414,8 @@
         </w:tc>
       </w:tr>
     </w:tbl>
-    <w:bookmarkEnd w:id="58"/>
-    <w:bookmarkStart w:id="62" w:name="pagina1-20"/>
+    <w:bookmarkEnd w:id="59"/>
+    <w:bookmarkStart w:id="63" w:name="pagina1-20"/>
     <w:tbl>
       <w:tblPr>
         <w:tblStyle w:val="Table"/>
@@ -3444,18 +3457,18 @@
                 <wp:inline>
                   <wp:extent cx="152400" cy="152400"/>
                   <wp:effectExtent b="0" l="0" r="0" t="0"/>
-                  <wp:docPr descr="" title="" id="60" name="Picture"/>
+                  <wp:docPr descr="" title="" id="61" name="Picture"/>
                   <a:graphic>
                     <a:graphicData uri="http://schemas.openxmlformats.org/drawingml/2006/picture">
                       <pic:pic>
                         <pic:nvPicPr>
-                          <pic:cNvPr descr="C:\Users\User\AppData\Local\Programs\Quarto\share\formats\docx\important.png" id="61" name="Picture"/>
+                          <pic:cNvPr descr="C:\Users\User\AppData\Local\Programs\Quarto\share\formats\docx\important.png" id="62" name="Picture"/>
                           <pic:cNvPicPr>
                             <a:picLocks noChangeArrowheads="1" noChangeAspect="1"/>
                           </pic:cNvPicPr>
                         </pic:nvPicPr>
                         <pic:blipFill>
-                          <a:blip r:embed="rId59"/>
+                          <a:blip r:embed="rId60"/>
                           <a:stretch>
                             <a:fillRect/>
                           </a:stretch>
@@ -3596,8 +3609,8 @@
         </w:tc>
       </w:tr>
     </w:tbl>
-    <w:bookmarkEnd w:id="62"/>
-    <w:bookmarkStart w:id="66" w:name="pagina1-21"/>
+    <w:bookmarkEnd w:id="63"/>
+    <w:bookmarkStart w:id="67" w:name="pagina1-21"/>
     <w:tbl>
       <w:tblPr>
         <w:tblStyle w:val="Table"/>
@@ -3639,18 +3652,18 @@
                 <wp:inline>
                   <wp:extent cx="152400" cy="152400"/>
                   <wp:effectExtent b="0" l="0" r="0" t="0"/>
-                  <wp:docPr descr="" title="" id="64" name="Picture"/>
+                  <wp:docPr descr="" title="" id="65" name="Picture"/>
                   <a:graphic>
                     <a:graphicData uri="http://schemas.openxmlformats.org/drawingml/2006/picture">
                       <pic:pic>
                         <pic:nvPicPr>
-                          <pic:cNvPr descr="C:\Users\User\AppData\Local\Programs\Quarto\share\formats\docx\note.png" id="65" name="Picture"/>
+                          <pic:cNvPr descr="C:\Users\User\AppData\Local\Programs\Quarto\share\formats\docx\note.png" id="66" name="Picture"/>
                           <pic:cNvPicPr>
                             <a:picLocks noChangeArrowheads="1" noChangeAspect="1"/>
                           </pic:cNvPicPr>
                         </pic:nvPicPr>
                         <pic:blipFill>
-                          <a:blip r:embed="rId63"/>
+                          <a:blip r:embed="rId64"/>
                           <a:stretch>
                             <a:fillRect/>
                           </a:stretch>
@@ -3813,9 +3826,9 @@
         </w:tc>
       </w:tr>
     </w:tbl>
-    <w:bookmarkEnd w:id="66"/>
-    <w:bookmarkStart w:id="67" w:name="pagina1-22"/>
     <w:bookmarkEnd w:id="67"/>
+    <w:bookmarkStart w:id="68" w:name="pagina1-22"/>
+    <w:bookmarkEnd w:id="68"/>
     <w:p>
       <w:pPr>
         <w:pStyle w:val="SourceCode"/>
@@ -3863,9 +3876,9 @@
         <w:t xml:space="preserve">================================================================================</w:t>
       </w:r>
     </w:p>
-    <w:bookmarkEnd w:id="68"/>
     <w:bookmarkEnd w:id="69"/>
-    <w:bookmarkStart w:id="179" w:name="página-2-growth-machine"/>
+    <w:bookmarkEnd w:id="70"/>
+    <w:bookmarkStart w:id="180" w:name="página-2-growth-machine"/>
     <w:p>
       <w:pPr>
         <w:pStyle w:val="Heading1"/>
@@ -3900,9 +3913,9 @@
         <w:t xml:space="preserve">Analisamos aqui o Funil de Vendas, a relação LTV/CAC e a curva de saturação dos canais de marketing.</w:t>
       </w:r>
     </w:p>
-    <w:bookmarkStart w:id="178" w:name="pagina2"/>
-    <w:bookmarkStart w:id="71" w:name="pagina2-1"/>
-    <w:bookmarkStart w:id="70" w:name="X96d6a4908f818785dc42f1f396f7aa04f444d62"/>
+    <w:bookmarkStart w:id="179" w:name="pagina2"/>
+    <w:bookmarkStart w:id="72" w:name="pagina2-1"/>
+    <w:bookmarkStart w:id="71" w:name="X96d6a4908f818785dc42f1f396f7aa04f444d62"/>
     <w:p>
       <w:pPr>
         <w:pStyle w:val="Heading2"/>
@@ -3911,10 +3924,10 @@
         <w:t xml:space="preserve">O volume de vendas sustenta a operação no cenário conservador?</w:t>
       </w:r>
     </w:p>
-    <w:bookmarkEnd w:id="70"/>
     <w:bookmarkEnd w:id="71"/>
-    <w:bookmarkStart w:id="73" w:name="pagina2-2"/>
-    <w:bookmarkStart w:id="72" w:name="Xf1c95410531ea9248ac1cadc3ebb6d2d0a19f37"/>
+    <w:bookmarkEnd w:id="72"/>
+    <w:bookmarkStart w:id="74" w:name="pagina2-2"/>
+    <w:bookmarkStart w:id="73" w:name="Xf1c95410531ea9248ac1cadc3ebb6d2d0a19f37"/>
     <w:p>
       <w:pPr>
         <w:pStyle w:val="Heading3"/>
@@ -3923,30 +3936,30 @@
         <w:t xml:space="preserve">📉 Funil de Aquisição: Conservador vs Benchmark (Log Scale)</w:t>
       </w:r>
     </w:p>
-    <w:bookmarkEnd w:id="72"/>
     <w:bookmarkEnd w:id="73"/>
+    <w:bookmarkEnd w:id="74"/>
     <w:p>
       <w:pPr>
         <w:pStyle w:val="FirstParagraph"/>
       </w:pPr>
-      <w:bookmarkStart w:id="77" w:name="pagina2-3"/>
+      <w:bookmarkStart w:id="78" w:name="pagina2-3"/>
       <w:r>
         <w:drawing>
           <wp:inline>
             <wp:extent cx="5334000" cy="2378675"/>
             <wp:effectExtent b="0" l="0" r="0" t="0"/>
-            <wp:docPr descr="" title="" id="75" name="Picture"/>
+            <wp:docPr descr="" title="" id="76" name="Picture"/>
             <a:graphic>
               <a:graphicData uri="http://schemas.openxmlformats.org/drawingml/2006/picture">
                 <pic:pic>
                   <pic:nvPicPr>
-                    <pic:cNvPr descr="relatorio_investidores_files/figure-docx/pagina2-output-3.png" id="76" name="Picture"/>
+                    <pic:cNvPr descr="relatorio_investidores_files/figure-docx/pagina2-output-3.png" id="77" name="Picture"/>
                     <pic:cNvPicPr>
                       <a:picLocks noChangeArrowheads="1" noChangeAspect="1"/>
                     </pic:cNvPicPr>
                   </pic:nvPicPr>
                   <pic:blipFill>
-                    <a:blip r:embed="rId74"/>
+                    <a:blip r:embed="rId75"/>
                     <a:stretch>
                       <a:fillRect/>
                     </a:stretch>
@@ -3972,9 +3985,9 @@
           </wp:inline>
         </w:drawing>
       </w:r>
-      <w:bookmarkEnd w:id="77"/>
+      <w:bookmarkEnd w:id="78"/>
     </w:p>
-    <w:bookmarkStart w:id="78" w:name="pagina2-4"/>
+    <w:bookmarkStart w:id="79" w:name="pagina2-4"/>
     <w:p>
       <w:r>
         <w:pict>
@@ -3982,9 +3995,9 @@
         </w:pict>
       </w:r>
     </w:p>
-    <w:bookmarkEnd w:id="78"/>
-    <w:bookmarkStart w:id="80" w:name="pagina2-5"/>
-    <w:bookmarkStart w:id="79" w:name="como-ler-este-gráfico"/>
+    <w:bookmarkEnd w:id="79"/>
+    <w:bookmarkStart w:id="81" w:name="pagina2-5"/>
+    <w:bookmarkStart w:id="80" w:name="como-ler-este-gráfico"/>
     <w:p>
       <w:pPr>
         <w:pStyle w:val="Heading4"/>
@@ -4040,10 +4053,10 @@
         <w:t xml:space="preserve">5. **Regra de Sucesso:** Se a barra escura ultrapassar ou igualar a cinza, o benchmark foi atingido.</w:t>
       </w:r>
     </w:p>
-    <w:bookmarkEnd w:id="79"/>
     <w:bookmarkEnd w:id="80"/>
-    <w:bookmarkStart w:id="82" w:name="pagina2-6"/>
-    <w:bookmarkStart w:id="81" w:name="a-prova-numérica"/>
+    <w:bookmarkEnd w:id="81"/>
+    <w:bookmarkStart w:id="83" w:name="pagina2-6"/>
+    <w:bookmarkStart w:id="82" w:name="a-prova-numérica"/>
     <w:p>
       <w:pPr>
         <w:pStyle w:val="Heading4"/>
@@ -4052,9 +4065,9 @@
         <w:t xml:space="preserve">📋 A PROVA NUMÉRICA:</w:t>
       </w:r>
     </w:p>
-    <w:bookmarkEnd w:id="81"/>
     <w:bookmarkEnd w:id="82"/>
-    <w:bookmarkStart w:id="83" w:name="pagina2-7"/>
+    <w:bookmarkEnd w:id="83"/>
+    <w:bookmarkStart w:id="84" w:name="pagina2-7"/>
     <w:tbl>
       <w:tblPr>
         <w:tblStyle w:val="Table"/>
@@ -4444,8 +4457,8 @@
         </w:tc>
       </w:tr>
     </w:tbl>
-    <w:bookmarkEnd w:id="83"/>
-    <w:bookmarkStart w:id="86" w:name="pagina2-8"/>
+    <w:bookmarkEnd w:id="84"/>
+    <w:bookmarkStart w:id="87" w:name="pagina2-8"/>
     <w:tbl>
       <w:tblPr>
         <w:tblStyle w:val="Table"/>
@@ -4487,18 +4500,18 @@
                 <wp:inline>
                   <wp:extent cx="152400" cy="152400"/>
                   <wp:effectExtent b="0" l="0" r="0" t="0"/>
-                  <wp:docPr descr="" title="" id="84" name="Picture"/>
+                  <wp:docPr descr="" title="" id="85" name="Picture"/>
                   <a:graphic>
                     <a:graphicData uri="http://schemas.openxmlformats.org/drawingml/2006/picture">
                       <pic:pic>
                         <pic:nvPicPr>
-                          <pic:cNvPr descr="C:\Users\User\AppData\Local\Programs\Quarto\share\formats\docx\tip.png" id="85" name="Picture"/>
+                          <pic:cNvPr descr="C:\Users\User\AppData\Local\Programs\Quarto\share\formats\docx\tip.png" id="86" name="Picture"/>
                           <pic:cNvPicPr>
                             <a:picLocks noChangeArrowheads="1" noChangeAspect="1"/>
                           </pic:cNvPicPr>
                         </pic:nvPicPr>
                         <pic:blipFill>
-                          <a:blip r:embed="rId51"/>
+                          <a:blip r:embed="rId52"/>
                           <a:stretch>
                             <a:fillRect/>
                           </a:stretch>
@@ -4639,8 +4652,8 @@
         </w:tc>
       </w:tr>
     </w:tbl>
-    <w:bookmarkEnd w:id="86"/>
-    <w:bookmarkStart w:id="89" w:name="pagina2-9"/>
+    <w:bookmarkEnd w:id="87"/>
+    <w:bookmarkStart w:id="90" w:name="pagina2-9"/>
     <w:tbl>
       <w:tblPr>
         <w:tblStyle w:val="Table"/>
@@ -4682,18 +4695,18 @@
                 <wp:inline>
                   <wp:extent cx="152400" cy="152400"/>
                   <wp:effectExtent b="0" l="0" r="0" t="0"/>
-                  <wp:docPr descr="" title="" id="87" name="Picture"/>
+                  <wp:docPr descr="" title="" id="88" name="Picture"/>
                   <a:graphic>
                     <a:graphicData uri="http://schemas.openxmlformats.org/drawingml/2006/picture">
                       <pic:pic>
                         <pic:nvPicPr>
-                          <pic:cNvPr descr="C:\Users\User\AppData\Local\Programs\Quarto\share\formats\docx\note.png" id="88" name="Picture"/>
+                          <pic:cNvPr descr="C:\Users\User\AppData\Local\Programs\Quarto\share\formats\docx\note.png" id="89" name="Picture"/>
                           <pic:cNvPicPr>
                             <a:picLocks noChangeArrowheads="1" noChangeAspect="1"/>
                           </pic:cNvPicPr>
                         </pic:nvPicPr>
                         <pic:blipFill>
-                          <a:blip r:embed="rId63"/>
+                          <a:blip r:embed="rId64"/>
                           <a:stretch>
                             <a:fillRect/>
                           </a:stretch>
@@ -4802,11 +4815,11 @@
         </w:tc>
       </w:tr>
     </w:tbl>
-    <w:bookmarkEnd w:id="89"/>
-    <w:bookmarkStart w:id="90" w:name="pagina2-10"/>
     <w:bookmarkEnd w:id="90"/>
-    <w:bookmarkStart w:id="92" w:name="pagina2-11"/>
-    <w:bookmarkStart w:id="91" w:name="o-negócio-para-em-pé-saúde-unitária"/>
+    <w:bookmarkStart w:id="91" w:name="pagina2-10"/>
+    <w:bookmarkEnd w:id="91"/>
+    <w:bookmarkStart w:id="93" w:name="pagina2-11"/>
+    <w:bookmarkStart w:id="92" w:name="o-negócio-para-em-pé-saúde-unitária"/>
     <w:p>
       <w:pPr>
         <w:pStyle w:val="Heading2"/>
@@ -4815,10 +4828,10 @@
         <w:t xml:space="preserve">O negócio para em pé? (Saúde Unitária)</w:t>
       </w:r>
     </w:p>
-    <w:bookmarkEnd w:id="91"/>
     <w:bookmarkEnd w:id="92"/>
-    <w:bookmarkStart w:id="94" w:name="pagina2-12"/>
-    <w:bookmarkStart w:id="93" w:name="evolução-ltvcac-vs-zonas-de-risco"/>
+    <w:bookmarkEnd w:id="93"/>
+    <w:bookmarkStart w:id="95" w:name="pagina2-12"/>
+    <w:bookmarkStart w:id="94" w:name="evolução-ltvcac-vs-zonas-de-risco"/>
     <w:p>
       <w:pPr>
         <w:pStyle w:val="Heading3"/>
@@ -4827,30 +4840,30 @@
         <w:t xml:space="preserve">📉 Evolução LTV/CAC vs Zonas de Risco</w:t>
       </w:r>
     </w:p>
-    <w:bookmarkEnd w:id="93"/>
     <w:bookmarkEnd w:id="94"/>
+    <w:bookmarkEnd w:id="95"/>
     <w:p>
       <w:pPr>
         <w:pStyle w:val="FirstParagraph"/>
       </w:pPr>
-      <w:bookmarkStart w:id="98" w:name="pagina2-13"/>
+      <w:bookmarkStart w:id="99" w:name="pagina2-13"/>
       <w:r>
         <w:drawing>
           <wp:inline>
             <wp:extent cx="5334000" cy="2559275"/>
             <wp:effectExtent b="0" l="0" r="0" t="0"/>
-            <wp:docPr descr="" title="" id="96" name="Picture"/>
+            <wp:docPr descr="" title="" id="97" name="Picture"/>
             <a:graphic>
               <a:graphicData uri="http://schemas.openxmlformats.org/drawingml/2006/picture">
                 <pic:pic>
                   <pic:nvPicPr>
-                    <pic:cNvPr descr="relatorio_investidores_files/figure-docx/pagina2-output-13.png" id="97" name="Picture"/>
+                    <pic:cNvPr descr="relatorio_investidores_files/figure-docx/pagina2-output-13.png" id="98" name="Picture"/>
                     <pic:cNvPicPr>
                       <a:picLocks noChangeArrowheads="1" noChangeAspect="1"/>
                     </pic:cNvPicPr>
                   </pic:nvPicPr>
                   <pic:blipFill>
-                    <a:blip r:embed="rId95"/>
+                    <a:blip r:embed="rId96"/>
                     <a:stretch>
                       <a:fillRect/>
                     </a:stretch>
@@ -4876,9 +4889,9 @@
           </wp:inline>
         </w:drawing>
       </w:r>
-      <w:bookmarkEnd w:id="98"/>
+      <w:bookmarkEnd w:id="99"/>
     </w:p>
-    <w:bookmarkStart w:id="99" w:name="pagina2-14"/>
+    <w:bookmarkStart w:id="100" w:name="pagina2-14"/>
     <w:p>
       <w:r>
         <w:pict>
@@ -4886,9 +4899,9 @@
         </w:pict>
       </w:r>
     </w:p>
-    <w:bookmarkEnd w:id="99"/>
-    <w:bookmarkStart w:id="101" w:name="pagina2-15"/>
-    <w:bookmarkStart w:id="100" w:name="como-ler-este-gráfico-1"/>
+    <w:bookmarkEnd w:id="100"/>
+    <w:bookmarkStart w:id="102" w:name="pagina2-15"/>
+    <w:bookmarkStart w:id="101" w:name="como-ler-este-gráfico-1"/>
     <w:p>
       <w:pPr>
         <w:pStyle w:val="Heading4"/>
@@ -4935,10 +4948,10 @@
         <w:t xml:space="preserve">4. **Zona Vermelha (&lt;1x):** Prejuízo. Custa mais trazer o cliente do que ele rende.</w:t>
       </w:r>
     </w:p>
-    <w:bookmarkEnd w:id="100"/>
     <w:bookmarkEnd w:id="101"/>
-    <w:bookmarkStart w:id="103" w:name="pagina2-16"/>
-    <w:bookmarkStart w:id="102" w:name="a-prova-numérica-1"/>
+    <w:bookmarkEnd w:id="102"/>
+    <w:bookmarkStart w:id="104" w:name="pagina2-16"/>
+    <w:bookmarkStart w:id="103" w:name="a-prova-numérica-1"/>
     <w:p>
       <w:pPr>
         <w:pStyle w:val="Heading4"/>
@@ -4947,9 +4960,9 @@
         <w:t xml:space="preserve">📋 A PROVA NUMÉRICA:</w:t>
       </w:r>
     </w:p>
-    <w:bookmarkEnd w:id="102"/>
     <w:bookmarkEnd w:id="103"/>
-    <w:bookmarkStart w:id="104" w:name="pagina2-17"/>
+    <w:bookmarkEnd w:id="104"/>
+    <w:bookmarkStart w:id="105" w:name="pagina2-17"/>
     <w:tbl>
       <w:tblPr>
         <w:tblStyle w:val="Table"/>
@@ -5278,8 +5291,8 @@
         </w:tc>
       </w:tr>
     </w:tbl>
-    <w:bookmarkEnd w:id="104"/>
-    <w:bookmarkStart w:id="107" w:name="pagina2-18"/>
+    <w:bookmarkEnd w:id="105"/>
+    <w:bookmarkStart w:id="108" w:name="pagina2-18"/>
     <w:tbl>
       <w:tblPr>
         <w:tblStyle w:val="Table"/>
@@ -5321,18 +5334,18 @@
                 <wp:inline>
                   <wp:extent cx="152400" cy="152400"/>
                   <wp:effectExtent b="0" l="0" r="0" t="0"/>
-                  <wp:docPr descr="" title="" id="105" name="Picture"/>
+                  <wp:docPr descr="" title="" id="106" name="Picture"/>
                   <a:graphic>
                     <a:graphicData uri="http://schemas.openxmlformats.org/drawingml/2006/picture">
                       <pic:pic>
                         <pic:nvPicPr>
-                          <pic:cNvPr descr="C:\Users\User\AppData\Local\Programs\Quarto\share\formats\docx\tip.png" id="106" name="Picture"/>
+                          <pic:cNvPr descr="C:\Users\User\AppData\Local\Programs\Quarto\share\formats\docx\tip.png" id="107" name="Picture"/>
                           <pic:cNvPicPr>
                             <a:picLocks noChangeArrowheads="1" noChangeAspect="1"/>
                           </pic:cNvPicPr>
                         </pic:nvPicPr>
                         <pic:blipFill>
-                          <a:blip r:embed="rId51"/>
+                          <a:blip r:embed="rId52"/>
                           <a:stretch>
                             <a:fillRect/>
                           </a:stretch>
@@ -5473,8 +5486,8 @@
         </w:tc>
       </w:tr>
     </w:tbl>
-    <w:bookmarkEnd w:id="107"/>
-    <w:bookmarkStart w:id="110" w:name="pagina2-19"/>
+    <w:bookmarkEnd w:id="108"/>
+    <w:bookmarkStart w:id="111" w:name="pagina2-19"/>
     <w:tbl>
       <w:tblPr>
         <w:tblStyle w:val="Table"/>
@@ -5516,18 +5529,18 @@
                 <wp:inline>
                   <wp:extent cx="152400" cy="152400"/>
                   <wp:effectExtent b="0" l="0" r="0" t="0"/>
-                  <wp:docPr descr="" title="" id="108" name="Picture"/>
+                  <wp:docPr descr="" title="" id="109" name="Picture"/>
                   <a:graphic>
                     <a:graphicData uri="http://schemas.openxmlformats.org/drawingml/2006/picture">
                       <pic:pic>
                         <pic:nvPicPr>
-                          <pic:cNvPr descr="C:\Users\User\AppData\Local\Programs\Quarto\share\formats\docx\note.png" id="109" name="Picture"/>
+                          <pic:cNvPr descr="C:\Users\User\AppData\Local\Programs\Quarto\share\formats\docx\note.png" id="110" name="Picture"/>
                           <pic:cNvPicPr>
                             <a:picLocks noChangeArrowheads="1" noChangeAspect="1"/>
                           </pic:cNvPicPr>
                         </pic:nvPicPr>
                         <pic:blipFill>
-                          <a:blip r:embed="rId63"/>
+                          <a:blip r:embed="rId64"/>
                           <a:stretch>
                             <a:fillRect/>
                           </a:stretch>
@@ -5645,11 +5658,11 @@
         </w:tc>
       </w:tr>
     </w:tbl>
-    <w:bookmarkEnd w:id="110"/>
-    <w:bookmarkStart w:id="111" w:name="pagina2-20"/>
     <w:bookmarkEnd w:id="111"/>
-    <w:bookmarkStart w:id="113" w:name="pagina2-21"/>
-    <w:bookmarkStart w:id="112" w:name="existe-descontrole-tático-de-custos"/>
+    <w:bookmarkStart w:id="112" w:name="pagina2-20"/>
+    <w:bookmarkEnd w:id="112"/>
+    <w:bookmarkStart w:id="114" w:name="pagina2-21"/>
+    <w:bookmarkStart w:id="113" w:name="existe-descontrole-tático-de-custos"/>
     <w:p>
       <w:pPr>
         <w:pStyle w:val="Heading2"/>
@@ -5658,10 +5671,10 @@
         <w:t xml:space="preserve">Existe descontrole tático de custos?</w:t>
       </w:r>
     </w:p>
-    <w:bookmarkEnd w:id="112"/>
     <w:bookmarkEnd w:id="113"/>
-    <w:bookmarkStart w:id="115" w:name="pagina2-22"/>
-    <w:bookmarkStart w:id="114" w:name="X82d8f77aa129853a76d160bc6ea826ca68c3568"/>
+    <w:bookmarkEnd w:id="114"/>
+    <w:bookmarkStart w:id="116" w:name="pagina2-22"/>
+    <w:bookmarkStart w:id="115" w:name="X82d8f77aa129853a76d160bc6ea826ca68c3568"/>
     <w:p>
       <w:pPr>
         <w:pStyle w:val="Heading3"/>
@@ -5670,30 +5683,30 @@
         <w:t xml:space="preserve">📉 Statistical Process Control (SPC): Volatilidade Semanal do CAC</w:t>
       </w:r>
     </w:p>
-    <w:bookmarkEnd w:id="114"/>
     <w:bookmarkEnd w:id="115"/>
+    <w:bookmarkEnd w:id="116"/>
     <w:p>
       <w:pPr>
         <w:pStyle w:val="FirstParagraph"/>
       </w:pPr>
-      <w:bookmarkStart w:id="119" w:name="pagina2-23"/>
+      <w:bookmarkStart w:id="120" w:name="pagina2-23"/>
       <w:r>
         <w:drawing>
           <wp:inline>
             <wp:extent cx="5334000" cy="2549912"/>
             <wp:effectExtent b="0" l="0" r="0" t="0"/>
-            <wp:docPr descr="" title="" id="117" name="Picture"/>
+            <wp:docPr descr="" title="" id="118" name="Picture"/>
             <a:graphic>
               <a:graphicData uri="http://schemas.openxmlformats.org/drawingml/2006/picture">
                 <pic:pic>
                   <pic:nvPicPr>
-                    <pic:cNvPr descr="relatorio_investidores_files/figure-docx/pagina2-output-23.png" id="118" name="Picture"/>
+                    <pic:cNvPr descr="relatorio_investidores_files/figure-docx/pagina2-output-23.png" id="119" name="Picture"/>
                     <pic:cNvPicPr>
                       <a:picLocks noChangeArrowheads="1" noChangeAspect="1"/>
                     </pic:cNvPicPr>
                   </pic:nvPicPr>
                   <pic:blipFill>
-                    <a:blip r:embed="rId116"/>
+                    <a:blip r:embed="rId117"/>
                     <a:stretch>
                       <a:fillRect/>
                     </a:stretch>
@@ -5719,9 +5732,9 @@
           </wp:inline>
         </w:drawing>
       </w:r>
-      <w:bookmarkEnd w:id="119"/>
+      <w:bookmarkEnd w:id="120"/>
     </w:p>
-    <w:bookmarkStart w:id="120" w:name="pagina2-24"/>
+    <w:bookmarkStart w:id="121" w:name="pagina2-24"/>
     <w:p>
       <w:r>
         <w:pict>
@@ -5729,9 +5742,9 @@
         </w:pict>
       </w:r>
     </w:p>
-    <w:bookmarkEnd w:id="120"/>
-    <w:bookmarkStart w:id="122" w:name="pagina2-25"/>
-    <w:bookmarkStart w:id="121" w:name="como-ler-este-gráfico-2"/>
+    <w:bookmarkEnd w:id="121"/>
+    <w:bookmarkStart w:id="123" w:name="pagina2-25"/>
+    <w:bookmarkStart w:id="122" w:name="como-ler-este-gráfico-2"/>
     <w:p>
       <w:pPr>
         <w:pStyle w:val="Heading4"/>
@@ -5778,10 +5791,10 @@
         <w:t xml:space="preserve">4. **Objetivo:** Manter a linha preta dentro do túnel cinza.</w:t>
       </w:r>
     </w:p>
-    <w:bookmarkEnd w:id="121"/>
     <w:bookmarkEnd w:id="122"/>
-    <w:bookmarkStart w:id="124" w:name="pagina2-26"/>
-    <w:bookmarkStart w:id="123" w:name="a-prova-numérica-2"/>
+    <w:bookmarkEnd w:id="123"/>
+    <w:bookmarkStart w:id="125" w:name="pagina2-26"/>
+    <w:bookmarkStart w:id="124" w:name="a-prova-numérica-2"/>
     <w:p>
       <w:pPr>
         <w:pStyle w:val="Heading4"/>
@@ -5790,9 +5803,9 @@
         <w:t xml:space="preserve">📋 A PROVA NUMÉRICA:</w:t>
       </w:r>
     </w:p>
-    <w:bookmarkEnd w:id="123"/>
     <w:bookmarkEnd w:id="124"/>
-    <w:bookmarkStart w:id="125" w:name="pagina2-27"/>
+    <w:bookmarkEnd w:id="125"/>
+    <w:bookmarkStart w:id="126" w:name="pagina2-27"/>
     <w:tbl>
       <w:tblPr>
         <w:tblStyle w:val="Table"/>
@@ -6183,8 +6196,8 @@
         </w:tc>
       </w:tr>
     </w:tbl>
-    <w:bookmarkEnd w:id="125"/>
-    <w:bookmarkStart w:id="128" w:name="pagina2-28"/>
+    <w:bookmarkEnd w:id="126"/>
+    <w:bookmarkStart w:id="129" w:name="pagina2-28"/>
     <w:tbl>
       <w:tblPr>
         <w:tblStyle w:val="Table"/>
@@ -6226,18 +6239,18 @@
                 <wp:inline>
                   <wp:extent cx="152400" cy="152400"/>
                   <wp:effectExtent b="0" l="0" r="0" t="0"/>
-                  <wp:docPr descr="" title="" id="126" name="Picture"/>
+                  <wp:docPr descr="" title="" id="127" name="Picture"/>
                   <a:graphic>
                     <a:graphicData uri="http://schemas.openxmlformats.org/drawingml/2006/picture">
                       <pic:pic>
                         <pic:nvPicPr>
-                          <pic:cNvPr descr="C:\Users\User\AppData\Local\Programs\Quarto\share\formats\docx\tip.png" id="127" name="Picture"/>
+                          <pic:cNvPr descr="C:\Users\User\AppData\Local\Programs\Quarto\share\formats\docx\tip.png" id="128" name="Picture"/>
                           <pic:cNvPicPr>
                             <a:picLocks noChangeArrowheads="1" noChangeAspect="1"/>
                           </pic:cNvPicPr>
                         </pic:nvPicPr>
                         <pic:blipFill>
-                          <a:blip r:embed="rId51"/>
+                          <a:blip r:embed="rId52"/>
                           <a:stretch>
                             <a:fillRect/>
                           </a:stretch>
@@ -6378,8 +6391,8 @@
         </w:tc>
       </w:tr>
     </w:tbl>
-    <w:bookmarkEnd w:id="128"/>
-    <w:bookmarkStart w:id="131" w:name="pagina2-29"/>
+    <w:bookmarkEnd w:id="129"/>
+    <w:bookmarkStart w:id="132" w:name="pagina2-29"/>
     <w:tbl>
       <w:tblPr>
         <w:tblStyle w:val="Table"/>
@@ -6421,18 +6434,18 @@
                 <wp:inline>
                   <wp:extent cx="152400" cy="152400"/>
                   <wp:effectExtent b="0" l="0" r="0" t="0"/>
-                  <wp:docPr descr="" title="" id="129" name="Picture"/>
+                  <wp:docPr descr="" title="" id="130" name="Picture"/>
                   <a:graphic>
                     <a:graphicData uri="http://schemas.openxmlformats.org/drawingml/2006/picture">
                       <pic:pic>
                         <pic:nvPicPr>
-                          <pic:cNvPr descr="C:\Users\User\AppData\Local\Programs\Quarto\share\formats\docx\note.png" id="130" name="Picture"/>
+                          <pic:cNvPr descr="C:\Users\User\AppData\Local\Programs\Quarto\share\formats\docx\note.png" id="131" name="Picture"/>
                           <pic:cNvPicPr>
                             <a:picLocks noChangeArrowheads="1" noChangeAspect="1"/>
                           </pic:cNvPicPr>
                         </pic:nvPicPr>
                         <pic:blipFill>
-                          <a:blip r:embed="rId63"/>
+                          <a:blip r:embed="rId64"/>
                           <a:stretch>
                             <a:fillRect/>
                           </a:stretch>
@@ -6541,11 +6554,11 @@
         </w:tc>
       </w:tr>
     </w:tbl>
-    <w:bookmarkEnd w:id="131"/>
-    <w:bookmarkStart w:id="132" w:name="pagina2-30"/>
     <w:bookmarkEnd w:id="132"/>
-    <w:bookmarkStart w:id="134" w:name="pagina2-31"/>
-    <w:bookmarkStart w:id="133" w:name="se-dobrar-o-marketing-dobra-a-venda"/>
+    <w:bookmarkStart w:id="133" w:name="pagina2-30"/>
+    <w:bookmarkEnd w:id="133"/>
+    <w:bookmarkStart w:id="135" w:name="pagina2-31"/>
+    <w:bookmarkStart w:id="134" w:name="se-dobrar-o-marketing-dobra-a-venda"/>
     <w:p>
       <w:pPr>
         <w:pStyle w:val="Heading2"/>
@@ -6554,10 +6567,10 @@
         <w:t xml:space="preserve">Se dobrar o marketing, dobra a venda?</w:t>
       </w:r>
     </w:p>
-    <w:bookmarkEnd w:id="133"/>
     <w:bookmarkEnd w:id="134"/>
-    <w:bookmarkStart w:id="136" w:name="pagina2-32"/>
-    <w:bookmarkStart w:id="135" w:name="curva-de-escala-e-elasticidade-de-canal"/>
+    <w:bookmarkEnd w:id="135"/>
+    <w:bookmarkStart w:id="137" w:name="pagina2-32"/>
+    <w:bookmarkStart w:id="136" w:name="curva-de-escala-e-elasticidade-de-canal"/>
     <w:p>
       <w:pPr>
         <w:pStyle w:val="Heading3"/>
@@ -6566,30 +6579,30 @@
         <w:t xml:space="preserve">📉 Curva de Escala e Elasticidade de Canal</w:t>
       </w:r>
     </w:p>
-    <w:bookmarkEnd w:id="135"/>
     <w:bookmarkEnd w:id="136"/>
+    <w:bookmarkEnd w:id="137"/>
     <w:p>
       <w:pPr>
         <w:pStyle w:val="FirstParagraph"/>
       </w:pPr>
-      <w:bookmarkStart w:id="140" w:name="pagina2-33"/>
+      <w:bookmarkStart w:id="141" w:name="pagina2-33"/>
       <w:r>
         <w:drawing>
           <wp:inline>
             <wp:extent cx="5334000" cy="2729671"/>
             <wp:effectExtent b="0" l="0" r="0" t="0"/>
-            <wp:docPr descr="" title="" id="138" name="Picture"/>
+            <wp:docPr descr="" title="" id="139" name="Picture"/>
             <a:graphic>
               <a:graphicData uri="http://schemas.openxmlformats.org/drawingml/2006/picture">
                 <pic:pic>
                   <pic:nvPicPr>
-                    <pic:cNvPr descr="relatorio_investidores_files/figure-docx/pagina2-output-33.png" id="139" name="Picture"/>
+                    <pic:cNvPr descr="relatorio_investidores_files/figure-docx/pagina2-output-33.png" id="140" name="Picture"/>
                     <pic:cNvPicPr>
                       <a:picLocks noChangeArrowheads="1" noChangeAspect="1"/>
                     </pic:cNvPicPr>
                   </pic:nvPicPr>
                   <pic:blipFill>
-                    <a:blip r:embed="rId137"/>
+                    <a:blip r:embed="rId138"/>
                     <a:stretch>
                       <a:fillRect/>
                     </a:stretch>
@@ -6615,9 +6628,9 @@
           </wp:inline>
         </w:drawing>
       </w:r>
-      <w:bookmarkEnd w:id="140"/>
+      <w:bookmarkEnd w:id="141"/>
     </w:p>
-    <w:bookmarkStart w:id="141" w:name="pagina2-34"/>
+    <w:bookmarkStart w:id="142" w:name="pagina2-34"/>
     <w:p>
       <w:r>
         <w:pict>
@@ -6625,9 +6638,9 @@
         </w:pict>
       </w:r>
     </w:p>
-    <w:bookmarkEnd w:id="141"/>
-    <w:bookmarkStart w:id="143" w:name="pagina2-35"/>
-    <w:bookmarkStart w:id="142" w:name="como-ler-este-gráfico-3"/>
+    <w:bookmarkEnd w:id="142"/>
+    <w:bookmarkStart w:id="144" w:name="pagina2-35"/>
+    <w:bookmarkStart w:id="143" w:name="como-ler-este-gráfico-3"/>
     <w:p>
       <w:pPr>
         <w:pStyle w:val="Heading4"/>
@@ -6674,10 +6687,10 @@
         <w:t xml:space="preserve">4. **Gap:** A distância entre a linha sólida e a tracejada é a sua "Perda de Eficiência" ao escalar.</w:t>
       </w:r>
     </w:p>
-    <w:bookmarkEnd w:id="142"/>
     <w:bookmarkEnd w:id="143"/>
-    <w:bookmarkStart w:id="145" w:name="pagina2-36"/>
-    <w:bookmarkStart w:id="144" w:name="a-prova-numérica-3"/>
+    <w:bookmarkEnd w:id="144"/>
+    <w:bookmarkStart w:id="146" w:name="pagina2-36"/>
+    <w:bookmarkStart w:id="145" w:name="a-prova-numérica-3"/>
     <w:p>
       <w:pPr>
         <w:pStyle w:val="Heading4"/>
@@ -6686,9 +6699,9 @@
         <w:t xml:space="preserve">📋 A PROVA NUMÉRICA:</w:t>
       </w:r>
     </w:p>
-    <w:bookmarkEnd w:id="144"/>
     <w:bookmarkEnd w:id="145"/>
-    <w:bookmarkStart w:id="146" w:name="pagina2-37"/>
+    <w:bookmarkEnd w:id="146"/>
+    <w:bookmarkStart w:id="147" w:name="pagina2-37"/>
     <w:p>
       <w:pPr>
         <w:pStyle w:val="FirstParagraph"/>
@@ -6723,8 +6736,8 @@
         <w:t xml:space="preserve">| R$ 21.689,32 | 89 | 132 | 32.4% | RETORNOS DECRESCENTES |</w:t>
       </w:r>
     </w:p>
-    <w:bookmarkEnd w:id="146"/>
-    <w:bookmarkStart w:id="149" w:name="pagina2-38"/>
+    <w:bookmarkEnd w:id="147"/>
+    <w:bookmarkStart w:id="150" w:name="pagina2-38"/>
     <w:tbl>
       <w:tblPr>
         <w:tblStyle w:val="Table"/>
@@ -6766,18 +6779,18 @@
                 <wp:inline>
                   <wp:extent cx="152400" cy="152400"/>
                   <wp:effectExtent b="0" l="0" r="0" t="0"/>
-                  <wp:docPr descr="" title="" id="147" name="Picture"/>
+                  <wp:docPr descr="" title="" id="148" name="Picture"/>
                   <a:graphic>
                     <a:graphicData uri="http://schemas.openxmlformats.org/drawingml/2006/picture">
                       <pic:pic>
                         <pic:nvPicPr>
-                          <pic:cNvPr descr="C:\Users\User\AppData\Local\Programs\Quarto\share\formats\docx\tip.png" id="148" name="Picture"/>
+                          <pic:cNvPr descr="C:\Users\User\AppData\Local\Programs\Quarto\share\formats\docx\tip.png" id="149" name="Picture"/>
                           <pic:cNvPicPr>
                             <a:picLocks noChangeArrowheads="1" noChangeAspect="1"/>
                           </pic:cNvPicPr>
                         </pic:nvPicPr>
                         <pic:blipFill>
-                          <a:blip r:embed="rId51"/>
+                          <a:blip r:embed="rId52"/>
                           <a:stretch>
                             <a:fillRect/>
                           </a:stretch>
@@ -6930,8 +6943,8 @@
         </w:tc>
       </w:tr>
     </w:tbl>
-    <w:bookmarkEnd w:id="149"/>
-    <w:bookmarkStart w:id="152" w:name="pagina2-39"/>
+    <w:bookmarkEnd w:id="150"/>
+    <w:bookmarkStart w:id="153" w:name="pagina2-39"/>
     <w:tbl>
       <w:tblPr>
         <w:tblStyle w:val="Table"/>
@@ -6973,18 +6986,18 @@
                 <wp:inline>
                   <wp:extent cx="152400" cy="152400"/>
                   <wp:effectExtent b="0" l="0" r="0" t="0"/>
-                  <wp:docPr descr="" title="" id="150" name="Picture"/>
+                  <wp:docPr descr="" title="" id="151" name="Picture"/>
                   <a:graphic>
                     <a:graphicData uri="http://schemas.openxmlformats.org/drawingml/2006/picture">
                       <pic:pic>
                         <pic:nvPicPr>
-                          <pic:cNvPr descr="C:\Users\User\AppData\Local\Programs\Quarto\share\formats\docx\note.png" id="151" name="Picture"/>
+                          <pic:cNvPr descr="C:\Users\User\AppData\Local\Programs\Quarto\share\formats\docx\note.png" id="152" name="Picture"/>
                           <pic:cNvPicPr>
                             <a:picLocks noChangeArrowheads="1" noChangeAspect="1"/>
                           </pic:cNvPicPr>
                         </pic:nvPicPr>
                         <pic:blipFill>
-                          <a:blip r:embed="rId63"/>
+                          <a:blip r:embed="rId64"/>
                           <a:stretch>
                             <a:fillRect/>
                           </a:stretch>
@@ -7075,11 +7088,11 @@
         </w:tc>
       </w:tr>
     </w:tbl>
-    <w:bookmarkEnd w:id="152"/>
-    <w:bookmarkStart w:id="153" w:name="pagina2-40"/>
     <w:bookmarkEnd w:id="153"/>
-    <w:bookmarkStart w:id="155" w:name="pagina2-41"/>
-    <w:bookmarkStart w:id="154" w:name="X0242aa2cd5c6dadfa7d222599db7f5681a7c98c"/>
+    <w:bookmarkStart w:id="154" w:name="pagina2-40"/>
+    <w:bookmarkEnd w:id="154"/>
+    <w:bookmarkStart w:id="156" w:name="pagina2-41"/>
+    <w:bookmarkStart w:id="155" w:name="X0242aa2cd5c6dadfa7d222599db7f5681a7c98c"/>
     <w:p>
       <w:pPr>
         <w:pStyle w:val="Heading2"/>
@@ -7088,10 +7101,10 @@
         <w:t xml:space="preserve">Quanto dinheiro estamos perdendo pelo ralo?</w:t>
       </w:r>
     </w:p>
-    <w:bookmarkEnd w:id="154"/>
     <w:bookmarkEnd w:id="155"/>
-    <w:bookmarkStart w:id="157" w:name="pagina2-42"/>
-    <w:bookmarkStart w:id="156" w:name="X0f5d044a9c268cebc285f0dfb09d1528caf61f7"/>
+    <w:bookmarkEnd w:id="156"/>
+    <w:bookmarkStart w:id="158" w:name="pagina2-42"/>
+    <w:bookmarkStart w:id="157" w:name="X0f5d044a9c268cebc285f0dfb09d1528caf61f7"/>
     <w:p>
       <w:pPr>
         <w:pStyle w:val="Heading3"/>
@@ -7100,30 +7113,30 @@
         <w:t xml:space="preserve">📉 Análise de Vazamento: Net MRR Growth &amp; Churn Cost</w:t>
       </w:r>
     </w:p>
-    <w:bookmarkEnd w:id="156"/>
     <w:bookmarkEnd w:id="157"/>
+    <w:bookmarkEnd w:id="158"/>
     <w:p>
       <w:pPr>
         <w:pStyle w:val="FirstParagraph"/>
       </w:pPr>
-      <w:bookmarkStart w:id="161" w:name="pagina2-43"/>
+      <w:bookmarkStart w:id="162" w:name="pagina2-43"/>
       <w:r>
         <w:drawing>
           <wp:inline>
             <wp:extent cx="5334000" cy="2501110"/>
             <wp:effectExtent b="0" l="0" r="0" t="0"/>
-            <wp:docPr descr="" title="" id="159" name="Picture"/>
+            <wp:docPr descr="" title="" id="160" name="Picture"/>
             <a:graphic>
               <a:graphicData uri="http://schemas.openxmlformats.org/drawingml/2006/picture">
                 <pic:pic>
                   <pic:nvPicPr>
-                    <pic:cNvPr descr="relatorio_investidores_files/figure-docx/pagina2-output-43.png" id="160" name="Picture"/>
+                    <pic:cNvPr descr="relatorio_investidores_files/figure-docx/pagina2-output-43.png" id="161" name="Picture"/>
                     <pic:cNvPicPr>
                       <a:picLocks noChangeArrowheads="1" noChangeAspect="1"/>
                     </pic:cNvPicPr>
                   </pic:nvPicPr>
                   <pic:blipFill>
-                    <a:blip r:embed="rId158"/>
+                    <a:blip r:embed="rId159"/>
                     <a:stretch>
                       <a:fillRect/>
                     </a:stretch>
@@ -7149,9 +7162,9 @@
           </wp:inline>
         </w:drawing>
       </w:r>
-      <w:bookmarkEnd w:id="161"/>
+      <w:bookmarkEnd w:id="162"/>
     </w:p>
-    <w:bookmarkStart w:id="162" w:name="pagina2-44"/>
+    <w:bookmarkStart w:id="163" w:name="pagina2-44"/>
     <w:p>
       <w:r>
         <w:pict>
@@ -7159,9 +7172,9 @@
         </w:pict>
       </w:r>
     </w:p>
-    <w:bookmarkEnd w:id="162"/>
-    <w:bookmarkStart w:id="164" w:name="pagina2-45"/>
-    <w:bookmarkStart w:id="163" w:name="como-ler-este-gráfico-4"/>
+    <w:bookmarkEnd w:id="163"/>
+    <w:bookmarkStart w:id="165" w:name="pagina2-45"/>
+    <w:bookmarkStart w:id="164" w:name="como-ler-este-gráfico-4"/>
     <w:p>
       <w:pPr>
         <w:pStyle w:val="Heading4"/>
@@ -7208,10 +7221,10 @@
         <w:t xml:space="preserve">4. **Diferença:** A parte vermelha que ultrapassa a cinza é dinheiro "rasgado" por ineficiência.</w:t>
       </w:r>
     </w:p>
-    <w:bookmarkEnd w:id="163"/>
     <w:bookmarkEnd w:id="164"/>
-    <w:bookmarkStart w:id="166" w:name="pagina2-46"/>
-    <w:bookmarkStart w:id="165" w:name="a-prova-numérica-4"/>
+    <w:bookmarkEnd w:id="165"/>
+    <w:bookmarkStart w:id="167" w:name="pagina2-46"/>
+    <w:bookmarkStart w:id="166" w:name="a-prova-numérica-4"/>
     <w:p>
       <w:pPr>
         <w:pStyle w:val="Heading4"/>
@@ -7220,9 +7233,9 @@
         <w:t xml:space="preserve">📋 A PROVA NUMÉRICA:</w:t>
       </w:r>
     </w:p>
-    <w:bookmarkEnd w:id="165"/>
     <w:bookmarkEnd w:id="166"/>
-    <w:bookmarkStart w:id="167" w:name="pagina2-47"/>
+    <w:bookmarkEnd w:id="167"/>
+    <w:bookmarkStart w:id="168" w:name="pagina2-47"/>
     <w:tbl>
       <w:tblPr>
         <w:tblStyle w:val="Table"/>
@@ -7612,8 +7625,8 @@
         </w:tc>
       </w:tr>
     </w:tbl>
-    <w:bookmarkEnd w:id="167"/>
-    <w:bookmarkStart w:id="170" w:name="pagina2-48"/>
+    <w:bookmarkEnd w:id="168"/>
+    <w:bookmarkStart w:id="171" w:name="pagina2-48"/>
     <w:tbl>
       <w:tblPr>
         <w:tblStyle w:val="Table"/>
@@ -7655,18 +7668,18 @@
                 <wp:inline>
                   <wp:extent cx="152400" cy="152400"/>
                   <wp:effectExtent b="0" l="0" r="0" t="0"/>
-                  <wp:docPr descr="" title="" id="168" name="Picture"/>
+                  <wp:docPr descr="" title="" id="169" name="Picture"/>
                   <a:graphic>
                     <a:graphicData uri="http://schemas.openxmlformats.org/drawingml/2006/picture">
                       <pic:pic>
                         <pic:nvPicPr>
-                          <pic:cNvPr descr="C:\Users\User\AppData\Local\Programs\Quarto\share\formats\docx\tip.png" id="169" name="Picture"/>
+                          <pic:cNvPr descr="C:\Users\User\AppData\Local\Programs\Quarto\share\formats\docx\tip.png" id="170" name="Picture"/>
                           <pic:cNvPicPr>
                             <a:picLocks noChangeArrowheads="1" noChangeAspect="1"/>
                           </pic:cNvPicPr>
                         </pic:nvPicPr>
                         <pic:blipFill>
-                          <a:blip r:embed="rId51"/>
+                          <a:blip r:embed="rId52"/>
                           <a:stretch>
                             <a:fillRect/>
                           </a:stretch>
@@ -7807,8 +7820,8 @@
         </w:tc>
       </w:tr>
     </w:tbl>
-    <w:bookmarkEnd w:id="170"/>
-    <w:bookmarkStart w:id="173" w:name="pagina2-49"/>
+    <w:bookmarkEnd w:id="171"/>
+    <w:bookmarkStart w:id="174" w:name="pagina2-49"/>
     <w:tbl>
       <w:tblPr>
         <w:tblStyle w:val="Table"/>
@@ -7850,18 +7863,18 @@
                 <wp:inline>
                   <wp:extent cx="152400" cy="152400"/>
                   <wp:effectExtent b="0" l="0" r="0" t="0"/>
-                  <wp:docPr descr="" title="" id="171" name="Picture"/>
+                  <wp:docPr descr="" title="" id="172" name="Picture"/>
                   <a:graphic>
                     <a:graphicData uri="http://schemas.openxmlformats.org/drawingml/2006/picture">
                       <pic:pic>
                         <pic:nvPicPr>
-                          <pic:cNvPr descr="C:\Users\User\AppData\Local\Programs\Quarto\share\formats\docx\note.png" id="172" name="Picture"/>
+                          <pic:cNvPr descr="C:\Users\User\AppData\Local\Programs\Quarto\share\formats\docx\note.png" id="173" name="Picture"/>
                           <pic:cNvPicPr>
                             <a:picLocks noChangeArrowheads="1" noChangeAspect="1"/>
                           </pic:cNvPicPr>
                         </pic:nvPicPr>
                         <pic:blipFill>
-                          <a:blip r:embed="rId63"/>
+                          <a:blip r:embed="rId64"/>
                           <a:stretch>
                             <a:fillRect/>
                           </a:stretch>
@@ -7961,10 +7974,10 @@
         </w:tc>
       </w:tr>
     </w:tbl>
-    <w:bookmarkEnd w:id="173"/>
-    <w:bookmarkStart w:id="174" w:name="pagina2-50"/>
     <w:bookmarkEnd w:id="174"/>
-    <w:bookmarkStart w:id="177" w:name="pagina2-51"/>
+    <w:bookmarkStart w:id="175" w:name="pagina2-50"/>
+    <w:bookmarkEnd w:id="175"/>
+    <w:bookmarkStart w:id="178" w:name="pagina2-51"/>
     <w:tbl>
       <w:tblPr>
         <w:tblStyle w:val="Table"/>
@@ -8006,18 +8019,18 @@
                 <wp:inline>
                   <wp:extent cx="152400" cy="152400"/>
                   <wp:effectExtent b="0" l="0" r="0" t="0"/>
-                  <wp:docPr descr="" title="" id="175" name="Picture"/>
+                  <wp:docPr descr="" title="" id="176" name="Picture"/>
                   <a:graphic>
                     <a:graphicData uri="http://schemas.openxmlformats.org/drawingml/2006/picture">
                       <pic:pic>
                         <pic:nvPicPr>
-                          <pic:cNvPr descr="C:\Users\User\AppData\Local\Programs\Quarto\share\formats\docx\important.png" id="176" name="Picture"/>
+                          <pic:cNvPr descr="C:\Users\User\AppData\Local\Programs\Quarto\share\formats\docx\important.png" id="177" name="Picture"/>
                           <pic:cNvPicPr>
                             <a:picLocks noChangeArrowheads="1" noChangeAspect="1"/>
                           </pic:cNvPicPr>
                         </pic:nvPicPr>
                         <pic:blipFill>
-                          <a:blip r:embed="rId59"/>
+                          <a:blip r:embed="rId60"/>
                           <a:stretch>
                             <a:fillRect/>
                           </a:stretch>
@@ -8186,10 +8199,10 @@
         </w:tc>
       </w:tr>
     </w:tbl>
-    <w:bookmarkEnd w:id="177"/>
     <w:bookmarkEnd w:id="178"/>
     <w:bookmarkEnd w:id="179"/>
-    <w:bookmarkStart w:id="180" w:name="página-3-análise-financeira"/>
+    <w:bookmarkEnd w:id="180"/>
+    <w:bookmarkStart w:id="181" w:name="página-3-análise-financeira"/>
     <w:p>
       <w:pPr>
         <w:pStyle w:val="Heading1"/>
@@ -8224,10 +8237,10 @@
         <w:t xml:space="preserve">Analisamos aqui a estrutura de custos (DRE), o fluxo de caixa, a alavancagem operacional e a evolução das margens ao longo de 36 meses.</w:t>
       </w:r>
     </w:p>
-    <w:bookmarkEnd w:id="180"/>
-    <w:bookmarkStart w:id="270" w:name="pagina3"/>
-    <w:bookmarkStart w:id="182" w:name="pagina3-1"/>
-    <w:bookmarkStart w:id="181" w:name="página-3-análise-financeira-1"/>
+    <w:bookmarkEnd w:id="181"/>
+    <w:bookmarkStart w:id="291" w:name="pagina3"/>
+    <w:bookmarkStart w:id="183" w:name="pagina3-1"/>
+    <w:bookmarkStart w:id="182" w:name="página-3-análise-financeira-1"/>
     <w:p>
       <w:pPr>
         <w:pStyle w:val="Heading1"/>
@@ -8236,9 +8249,9 @@
         <w:t xml:space="preserve">💰 PÁGINA 3: ANÁLISE FINANCEIRA</w:t>
       </w:r>
     </w:p>
-    <w:bookmarkEnd w:id="181"/>
     <w:bookmarkEnd w:id="182"/>
-    <w:bookmarkStart w:id="183" w:name="pagina3-2"/>
+    <w:bookmarkEnd w:id="183"/>
+    <w:bookmarkStart w:id="184" w:name="pagina3-2"/>
     <w:p>
       <w:pPr>
         <w:pStyle w:val="FirstParagraph"/>
@@ -8257,8 +8270,8 @@
         <w:t xml:space="preserve">Provar que a conta fecha no cenário conservador vs benchmark.</w:t>
       </w:r>
     </w:p>
-    <w:bookmarkEnd w:id="183"/>
-    <w:bookmarkStart w:id="184" w:name="pagina3-3"/>
+    <w:bookmarkEnd w:id="184"/>
+    <w:bookmarkStart w:id="185" w:name="pagina3-3"/>
     <w:p>
       <w:r>
         <w:pict>
@@ -8266,9 +8279,50 @@
         </w:pict>
       </w:r>
     </w:p>
-    <w:bookmarkEnd w:id="184"/>
+    <w:bookmarkEnd w:id="185"/>
     <w:bookmarkStart w:id="186" w:name="pagina3-4"/>
-    <w:bookmarkStart w:id="185" w:name="X956f84e40a9d956acab6cfa28d3784cb24056b8"/>
+    <w:p>
+      <w:r>
+        <w:pict>
+          <v:rect style="width:0;height:1.5pt" o:hralign="center" o:hrstd="t" o:hr="t"/>
+        </w:pict>
+      </w:r>
+    </w:p>
+    <w:bookmarkEnd w:id="186"/>
+    <w:bookmarkStart w:id="188" w:name="pagina3-5"/>
+    <w:bookmarkStart w:id="187" w:name="viz-3.1-evolucao-financeira"/>
+    <w:p>
+      <w:pPr>
+        <w:pStyle w:val="Heading2"/>
+      </w:pPr>
+      <w:r>
+        <w:t xml:space="preserve">VIZ 3.1: Evolucao Financeira</w:t>
+      </w:r>
+    </w:p>
+    <w:bookmarkEnd w:id="187"/>
+    <w:bookmarkEnd w:id="188"/>
+    <w:bookmarkStart w:id="189" w:name="pagina3-6"/>
+    <w:p>
+      <w:pPr>
+        <w:pStyle w:val="FirstParagraph"/>
+      </w:pPr>
+      <w:r>
+        <w:rPr>
+          <w:b/>
+          <w:bCs/>
+        </w:rPr>
+        <w:t xml:space="preserve">Pergunta:</w:t>
+      </w:r>
+      <w:r>
+        <w:t xml:space="preserve"> </w:t>
+      </w:r>
+      <w:r>
+        <w:t xml:space="preserve">A empresa caminha para o break-even? Quando o caixa fica positivo?</w:t>
+      </w:r>
+    </w:p>
+    <w:bookmarkEnd w:id="189"/>
+    <w:bookmarkStart w:id="191" w:name="pagina3-7"/>
+    <w:bookmarkStart w:id="190" w:name="X956f84e40a9d956acab6cfa28d3784cb24056b8"/>
     <w:p>
       <w:pPr>
         <w:pStyle w:val="Heading3"/>
@@ -8277,9 +8331,9 @@
         <w:t xml:space="preserve">📊 DRE - Demonstração de Resultado (Marcos Principais)</w:t>
       </w:r>
     </w:p>
-    <w:bookmarkEnd w:id="185"/>
-    <w:bookmarkEnd w:id="186"/>
-    <w:bookmarkStart w:id="187" w:name="pagina3-5"/>
+    <w:bookmarkEnd w:id="190"/>
+    <w:bookmarkEnd w:id="191"/>
+    <w:bookmarkStart w:id="192" w:name="pagina3-8"/>
     <w:p>
       <w:pPr>
         <w:pStyle w:val="FirstParagraph"/>
@@ -8292,8 +8346,8 @@
         <w:t xml:space="preserve">Esta é a primeira tabela que mostra o LUCRO REAL da operação.</w:t>
       </w:r>
     </w:p>
-    <w:bookmarkEnd w:id="187"/>
-    <w:bookmarkStart w:id="188" w:name="pagina3-6"/>
+    <w:bookmarkEnd w:id="192"/>
+    <w:bookmarkStart w:id="193" w:name="pagina3-9"/>
     <w:tbl>
       <w:tblPr>
         <w:tblStyle w:val="Table"/>
@@ -9293,31 +9347,31 @@
         </w:tc>
       </w:tr>
     </w:tbl>
-    <w:bookmarkEnd w:id="188"/>
-    <w:bookmarkStart w:id="189" w:name="pagina3-7"/>
-    <w:bookmarkEnd w:id="189"/>
+    <w:bookmarkEnd w:id="193"/>
+    <w:bookmarkStart w:id="194" w:name="pagina3-10"/>
+    <w:bookmarkEnd w:id="194"/>
     <w:p>
       <w:pPr>
         <w:pStyle w:val="BodyText"/>
       </w:pPr>
-      <w:bookmarkStart w:id="193" w:name="pagina3-8"/>
+      <w:bookmarkStart w:id="198" w:name="pagina3-11"/>
       <w:r>
         <w:drawing>
           <wp:inline>
             <wp:extent cx="5334000" cy="2751410"/>
             <wp:effectExtent b="0" l="0" r="0" t="0"/>
-            <wp:docPr descr="" title="" id="191" name="Picture"/>
+            <wp:docPr descr="" title="" id="196" name="Picture"/>
             <a:graphic>
               <a:graphicData uri="http://schemas.openxmlformats.org/drawingml/2006/picture">
                 <pic:pic>
                   <pic:nvPicPr>
-                    <pic:cNvPr descr="relatorio_investidores_files/figure-docx/pagina3-output-8.png" id="192" name="Picture"/>
+                    <pic:cNvPr descr="relatorio_investidores_files/figure-docx/pagina3-output-11.png" id="197" name="Picture"/>
                     <pic:cNvPicPr>
                       <a:picLocks noChangeArrowheads="1" noChangeAspect="1"/>
                     </pic:cNvPicPr>
                   </pic:nvPicPr>
                   <pic:blipFill>
-                    <a:blip r:embed="rId190"/>
+                    <a:blip r:embed="rId195"/>
                     <a:stretch>
                       <a:fillRect/>
                     </a:stretch>
@@ -9343,9 +9397,9 @@
           </wp:inline>
         </w:drawing>
       </w:r>
-      <w:bookmarkEnd w:id="193"/>
+      <w:bookmarkEnd w:id="198"/>
     </w:p>
-    <w:bookmarkStart w:id="194" w:name="pagina3-9"/>
+    <w:bookmarkStart w:id="199" w:name="pagina3-12"/>
     <w:p>
       <w:pPr>
         <w:pStyle w:val="BodyText"/>
@@ -9624,10 +9678,10 @@
         <w:t xml:space="preserve">Ponto onde receita = despesas, sem lucro nem prejuizo</w:t>
       </w:r>
     </w:p>
-    <w:bookmarkEnd w:id="194"/>
-    <w:bookmarkStart w:id="195" w:name="pagina3-10"/>
-    <w:bookmarkEnd w:id="195"/>
-    <w:bookmarkStart w:id="198" w:name="pagina3-11"/>
+    <w:bookmarkEnd w:id="199"/>
+    <w:bookmarkStart w:id="200" w:name="pagina3-13"/>
+    <w:bookmarkEnd w:id="200"/>
+    <w:bookmarkStart w:id="203" w:name="pagina3-14"/>
     <w:tbl>
       <w:tblPr>
         <w:tblStyle w:val="Table"/>
@@ -9669,18 +9723,18 @@
                 <wp:inline>
                   <wp:extent cx="152400" cy="152400"/>
                   <wp:effectExtent b="0" l="0" r="0" t="0"/>
-                  <wp:docPr descr="" title="" id="196" name="Picture"/>
+                  <wp:docPr descr="" title="" id="201" name="Picture"/>
                   <a:graphic>
                     <a:graphicData uri="http://schemas.openxmlformats.org/drawingml/2006/picture">
                       <pic:pic>
                         <pic:nvPicPr>
-                          <pic:cNvPr descr="C:\Users\User\AppData\Local\Programs\Quarto\share\formats\docx\tip.png" id="197" name="Picture"/>
+                          <pic:cNvPr descr="C:\Users\User\AppData\Local\Programs\Quarto\share\formats\docx\tip.png" id="202" name="Picture"/>
                           <pic:cNvPicPr>
                             <a:picLocks noChangeArrowheads="1" noChangeAspect="1"/>
                           </pic:cNvPicPr>
                         </pic:nvPicPr>
                         <pic:blipFill>
-                          <a:blip r:embed="rId51"/>
+                          <a:blip r:embed="rId52"/>
                           <a:stretch>
                             <a:fillRect/>
                           </a:stretch>
@@ -9821,8 +9875,8 @@
         </w:tc>
       </w:tr>
     </w:tbl>
-    <w:bookmarkEnd w:id="198"/>
-    <w:bookmarkStart w:id="201" w:name="pagina3-12"/>
+    <w:bookmarkEnd w:id="203"/>
+    <w:bookmarkStart w:id="206" w:name="pagina3-15"/>
     <w:tbl>
       <w:tblPr>
         <w:tblStyle w:val="Table"/>
@@ -9864,18 +9918,18 @@
                 <wp:inline>
                   <wp:extent cx="152400" cy="152400"/>
                   <wp:effectExtent b="0" l="0" r="0" t="0"/>
-                  <wp:docPr descr="" title="" id="199" name="Picture"/>
+                  <wp:docPr descr="" title="" id="204" name="Picture"/>
                   <a:graphic>
                     <a:graphicData uri="http://schemas.openxmlformats.org/drawingml/2006/picture">
                       <pic:pic>
                         <pic:nvPicPr>
-                          <pic:cNvPr descr="C:\Users\User\AppData\Local\Programs\Quarto\share\formats\docx\note.png" id="200" name="Picture"/>
+                          <pic:cNvPr descr="C:\Users\User\AppData\Local\Programs\Quarto\share\formats\docx\note.png" id="205" name="Picture"/>
                           <pic:cNvPicPr>
                             <a:picLocks noChangeArrowheads="1" noChangeAspect="1"/>
                           </pic:cNvPicPr>
                         </pic:nvPicPr>
                         <pic:blipFill>
-                          <a:blip r:embed="rId63"/>
+                          <a:blip r:embed="rId64"/>
                           <a:stretch>
                             <a:fillRect/>
                           </a:stretch>
@@ -9982,9 +10036,50 @@
         </w:tc>
       </w:tr>
     </w:tbl>
-    <w:bookmarkEnd w:id="201"/>
-    <w:bookmarkStart w:id="203" w:name="pagina3-13"/>
-    <w:bookmarkStart w:id="202" w:name="decomposição-da-dre-m36"/>
+    <w:bookmarkEnd w:id="206"/>
+    <w:bookmarkStart w:id="207" w:name="pagina3-16"/>
+    <w:p>
+      <w:r>
+        <w:pict>
+          <v:rect style="width:0;height:1.5pt" o:hralign="center" o:hrstd="t" o:hr="t"/>
+        </w:pict>
+      </w:r>
+    </w:p>
+    <w:bookmarkEnd w:id="207"/>
+    <w:bookmarkStart w:id="209" w:name="pagina3-17"/>
+    <w:bookmarkStart w:id="208" w:name="viz-3.2-estrutura-de-custos"/>
+    <w:p>
+      <w:pPr>
+        <w:pStyle w:val="Heading2"/>
+      </w:pPr>
+      <w:r>
+        <w:t xml:space="preserve">VIZ 3.2: Estrutura de Custos</w:t>
+      </w:r>
+    </w:p>
+    <w:bookmarkEnd w:id="208"/>
+    <w:bookmarkEnd w:id="209"/>
+    <w:bookmarkStart w:id="210" w:name="pagina3-18"/>
+    <w:p>
+      <w:pPr>
+        <w:pStyle w:val="FirstParagraph"/>
+      </w:pPr>
+      <w:r>
+        <w:rPr>
+          <w:b/>
+          <w:bCs/>
+        </w:rPr>
+        <w:t xml:space="preserve">Pergunta:</w:t>
+      </w:r>
+      <w:r>
+        <w:t xml:space="preserve"> </w:t>
+      </w:r>
+      <w:r>
+        <w:t xml:space="preserve">Onde esta o dinheiro? A estrutura de custos e saudavel?</w:t>
+      </w:r>
+    </w:p>
+    <w:bookmarkEnd w:id="210"/>
+    <w:bookmarkStart w:id="212" w:name="pagina3-19"/>
+    <w:bookmarkStart w:id="211" w:name="decomposição-da-dre-m36"/>
     <w:p>
       <w:pPr>
         <w:pStyle w:val="Heading3"/>
@@ -9993,9 +10088,9 @@
         <w:t xml:space="preserve">📊 DECOMPOSIÇÃO DA DRE (M36)</w:t>
       </w:r>
     </w:p>
-    <w:bookmarkEnd w:id="202"/>
-    <w:bookmarkEnd w:id="203"/>
-    <w:bookmarkStart w:id="204" w:name="pagina3-14"/>
+    <w:bookmarkEnd w:id="211"/>
+    <w:bookmarkEnd w:id="212"/>
+    <w:bookmarkStart w:id="213" w:name="pagina3-20"/>
     <w:tbl>
       <w:tblPr>
         <w:tblStyle w:val="Table"/>
@@ -10412,31 +10507,31 @@
         </w:tc>
       </w:tr>
     </w:tbl>
-    <w:bookmarkEnd w:id="204"/>
-    <w:bookmarkStart w:id="205" w:name="pagina3-15"/>
-    <w:bookmarkEnd w:id="205"/>
+    <w:bookmarkEnd w:id="213"/>
+    <w:bookmarkStart w:id="214" w:name="pagina3-21"/>
+    <w:bookmarkEnd w:id="214"/>
     <w:p>
       <w:pPr>
         <w:pStyle w:val="BodyText"/>
       </w:pPr>
-      <w:bookmarkStart w:id="209" w:name="pagina3-16"/>
+      <w:bookmarkStart w:id="218" w:name="pagina3-22"/>
       <w:r>
         <w:drawing>
           <wp:inline>
             <wp:extent cx="5334000" cy="2755002"/>
             <wp:effectExtent b="0" l="0" r="0" t="0"/>
-            <wp:docPr descr="" title="" id="207" name="Picture"/>
+            <wp:docPr descr="" title="" id="216" name="Picture"/>
             <a:graphic>
               <a:graphicData uri="http://schemas.openxmlformats.org/drawingml/2006/picture">
                 <pic:pic>
                   <pic:nvPicPr>
-                    <pic:cNvPr descr="relatorio_investidores_files/figure-docx/pagina3-output-16.png" id="208" name="Picture"/>
+                    <pic:cNvPr descr="relatorio_investidores_files/figure-docx/pagina3-output-22.png" id="217" name="Picture"/>
                     <pic:cNvPicPr>
                       <a:picLocks noChangeArrowheads="1" noChangeAspect="1"/>
                     </pic:cNvPicPr>
                   </pic:nvPicPr>
                   <pic:blipFill>
-                    <a:blip r:embed="rId206"/>
+                    <a:blip r:embed="rId215"/>
                     <a:stretch>
                       <a:fillRect/>
                     </a:stretch>
@@ -10462,9 +10557,9 @@
           </wp:inline>
         </w:drawing>
       </w:r>
-      <w:bookmarkEnd w:id="209"/>
+      <w:bookmarkEnd w:id="218"/>
     </w:p>
-    <w:bookmarkStart w:id="210" w:name="pagina3-17"/>
+    <w:bookmarkStart w:id="219" w:name="pagina3-23"/>
     <w:p>
       <w:pPr>
         <w:pStyle w:val="BodyText"/>
@@ -10565,9 +10660,9 @@
         <w:t xml:space="preserve">Barra final deve ser verde e representar &gt;20% da receita</w:t>
       </w:r>
     </w:p>
-    <w:bookmarkEnd w:id="210"/>
-    <w:bookmarkStart w:id="212" w:name="pagina3-18"/>
-    <w:bookmarkStart w:id="211" w:name="breakdown-detalhado-de-custos-m36"/>
+    <w:bookmarkEnd w:id="219"/>
+    <w:bookmarkStart w:id="221" w:name="pagina3-24"/>
+    <w:bookmarkStart w:id="220" w:name="breakdown-detalhado-de-custos-m36"/>
     <w:p>
       <w:pPr>
         <w:pStyle w:val="Heading3"/>
@@ -10576,9 +10671,9 @@
         <w:t xml:space="preserve">💰 BREAKDOWN DETALHADO DE CUSTOS (M36)</w:t>
       </w:r>
     </w:p>
-    <w:bookmarkEnd w:id="211"/>
-    <w:bookmarkEnd w:id="212"/>
-    <w:bookmarkStart w:id="213" w:name="pagina3-19"/>
+    <w:bookmarkEnd w:id="220"/>
+    <w:bookmarkEnd w:id="221"/>
+    <w:bookmarkStart w:id="222" w:name="pagina3-25"/>
     <w:p>
       <w:pPr>
         <w:pStyle w:val="FirstParagraph"/>
@@ -10591,8 +10686,8 @@
         <w:t xml:space="preserve">Decomposição completa de COGS e OPEX por canal/categoria.</w:t>
       </w:r>
     </w:p>
-    <w:bookmarkEnd w:id="213"/>
-    <w:bookmarkStart w:id="214" w:name="pagina3-20"/>
+    <w:bookmarkEnd w:id="222"/>
+    <w:bookmarkStart w:id="223" w:name="pagina3-26"/>
     <w:tbl>
       <w:tblPr>
         <w:tblStyle w:val="Table"/>
@@ -11407,31 +11502,31 @@
         </w:tc>
       </w:tr>
     </w:tbl>
-    <w:bookmarkEnd w:id="214"/>
-    <w:bookmarkStart w:id="215" w:name="pagina3-21"/>
-    <w:bookmarkEnd w:id="215"/>
+    <w:bookmarkEnd w:id="223"/>
+    <w:bookmarkStart w:id="224" w:name="pagina3-27"/>
+    <w:bookmarkEnd w:id="224"/>
     <w:p>
       <w:pPr>
         <w:pStyle w:val="BodyText"/>
       </w:pPr>
-      <w:bookmarkStart w:id="219" w:name="pagina3-22"/>
+      <w:bookmarkStart w:id="228" w:name="pagina3-28"/>
       <w:r>
         <w:drawing>
           <wp:inline>
             <wp:extent cx="5334000" cy="2845295"/>
             <wp:effectExtent b="0" l="0" r="0" t="0"/>
-            <wp:docPr descr="" title="" id="217" name="Picture"/>
+            <wp:docPr descr="" title="" id="226" name="Picture"/>
             <a:graphic>
               <a:graphicData uri="http://schemas.openxmlformats.org/drawingml/2006/picture">
                 <pic:pic>
                   <pic:nvPicPr>
-                    <pic:cNvPr descr="relatorio_investidores_files/figure-docx/pagina3-output-22.png" id="218" name="Picture"/>
+                    <pic:cNvPr descr="relatorio_investidores_files/figure-docx/pagina3-output-28.png" id="227" name="Picture"/>
                     <pic:cNvPicPr>
                       <a:picLocks noChangeArrowheads="1" noChangeAspect="1"/>
                     </pic:cNvPicPr>
                   </pic:nvPicPr>
                   <pic:blipFill>
-                    <a:blip r:embed="rId216"/>
+                    <a:blip r:embed="rId225"/>
                     <a:stretch>
                       <a:fillRect/>
                     </a:stretch>
@@ -11457,11 +11552,11 @@
           </wp:inline>
         </w:drawing>
       </w:r>
-      <w:bookmarkEnd w:id="219"/>
+      <w:bookmarkEnd w:id="228"/>
     </w:p>
-    <w:bookmarkStart w:id="220" w:name="pagina3-23"/>
-    <w:bookmarkEnd w:id="220"/>
-    <w:bookmarkStart w:id="223" w:name="pagina3-24"/>
+    <w:bookmarkStart w:id="229" w:name="pagina3-29"/>
+    <w:bookmarkEnd w:id="229"/>
+    <w:bookmarkStart w:id="232" w:name="pagina3-30"/>
     <w:tbl>
       <w:tblPr>
         <w:tblStyle w:val="Table"/>
@@ -11503,18 +11598,18 @@
                 <wp:inline>
                   <wp:extent cx="152400" cy="152400"/>
                   <wp:effectExtent b="0" l="0" r="0" t="0"/>
-                  <wp:docPr descr="" title="" id="221" name="Picture"/>
+                  <wp:docPr descr="" title="" id="230" name="Picture"/>
                   <a:graphic>
                     <a:graphicData uri="http://schemas.openxmlformats.org/drawingml/2006/picture">
                       <pic:pic>
                         <pic:nvPicPr>
-                          <pic:cNvPr descr="C:\Users\User\AppData\Local\Programs\Quarto\share\formats\docx\tip.png" id="222" name="Picture"/>
+                          <pic:cNvPr descr="C:\Users\User\AppData\Local\Programs\Quarto\share\formats\docx\tip.png" id="231" name="Picture"/>
                           <pic:cNvPicPr>
                             <a:picLocks noChangeArrowheads="1" noChangeAspect="1"/>
                           </pic:cNvPicPr>
                         </pic:nvPicPr>
                         <pic:blipFill>
-                          <a:blip r:embed="rId51"/>
+                          <a:blip r:embed="rId52"/>
                           <a:stretch>
                             <a:fillRect/>
                           </a:stretch>
@@ -11655,8 +11750,8 @@
         </w:tc>
       </w:tr>
     </w:tbl>
-    <w:bookmarkEnd w:id="223"/>
-    <w:bookmarkStart w:id="226" w:name="pagina3-25"/>
+    <w:bookmarkEnd w:id="232"/>
+    <w:bookmarkStart w:id="235" w:name="pagina3-31"/>
     <w:tbl>
       <w:tblPr>
         <w:tblStyle w:val="Table"/>
@@ -11698,18 +11793,18 @@
                 <wp:inline>
                   <wp:extent cx="152400" cy="152400"/>
                   <wp:effectExtent b="0" l="0" r="0" t="0"/>
-                  <wp:docPr descr="" title="" id="224" name="Picture"/>
+                  <wp:docPr descr="" title="" id="233" name="Picture"/>
                   <a:graphic>
                     <a:graphicData uri="http://schemas.openxmlformats.org/drawingml/2006/picture">
                       <pic:pic>
                         <pic:nvPicPr>
-                          <pic:cNvPr descr="C:\Users\User\AppData\Local\Programs\Quarto\share\formats\docx\note.png" id="225" name="Picture"/>
+                          <pic:cNvPr descr="C:\Users\User\AppData\Local\Programs\Quarto\share\formats\docx\note.png" id="234" name="Picture"/>
                           <pic:cNvPicPr>
                             <a:picLocks noChangeArrowheads="1" noChangeAspect="1"/>
                           </pic:cNvPicPr>
                         </pic:nvPicPr>
                         <pic:blipFill>
-                          <a:blip r:embed="rId63"/>
+                          <a:blip r:embed="rId64"/>
                           <a:stretch>
                             <a:fillRect/>
                           </a:stretch>
@@ -11816,29 +11911,70 @@
         </w:tc>
       </w:tr>
     </w:tbl>
-    <w:bookmarkEnd w:id="226"/>
+    <w:bookmarkEnd w:id="235"/>
+    <w:bookmarkStart w:id="236" w:name="pagina3-32"/>
+    <w:p>
+      <w:r>
+        <w:pict>
+          <v:rect style="width:0;height:1.5pt" o:hralign="center" o:hrstd="t" o:hr="t"/>
+        </w:pict>
+      </w:r>
+    </w:p>
+    <w:bookmarkEnd w:id="236"/>
+    <w:bookmarkStart w:id="238" w:name="pagina3-33"/>
+    <w:bookmarkStart w:id="237" w:name="viz-3.3-fluxo-de-caixa-semanal"/>
+    <w:p>
+      <w:pPr>
+        <w:pStyle w:val="Heading2"/>
+      </w:pPr>
+      <w:r>
+        <w:t xml:space="preserve">VIZ 3.3: Fluxo de Caixa Semanal</w:t>
+      </w:r>
+    </w:p>
+    <w:bookmarkEnd w:id="237"/>
+    <w:bookmarkEnd w:id="238"/>
+    <w:bookmarkStart w:id="239" w:name="pagina3-34"/>
+    <w:p>
+      <w:pPr>
+        <w:pStyle w:val="FirstParagraph"/>
+      </w:pPr>
+      <w:r>
+        <w:rPr>
+          <w:b/>
+          <w:bCs/>
+        </w:rPr>
+        <w:t xml:space="preserve">Pergunta:</w:t>
+      </w:r>
+      <w:r>
+        <w:t xml:space="preserve"> </w:t>
+      </w:r>
+      <w:r>
+        <w:t xml:space="preserve">O caixa sobrevive ao ramp-up? Qual o momento mais critico?</w:t>
+      </w:r>
+    </w:p>
+    <w:bookmarkEnd w:id="239"/>
     <w:p>
       <w:pPr>
         <w:pStyle w:val="BodyText"/>
       </w:pPr>
-      <w:bookmarkStart w:id="230" w:name="pagina3-26"/>
+      <w:bookmarkStart w:id="243" w:name="pagina3-35"/>
       <w:r>
         <w:drawing>
           <wp:inline>
             <wp:extent cx="5334000" cy="2755002"/>
             <wp:effectExtent b="0" l="0" r="0" t="0"/>
-            <wp:docPr descr="" title="" id="228" name="Picture"/>
+            <wp:docPr descr="" title="" id="241" name="Picture"/>
             <a:graphic>
               <a:graphicData uri="http://schemas.openxmlformats.org/drawingml/2006/picture">
                 <pic:pic>
                   <pic:nvPicPr>
-                    <pic:cNvPr descr="relatorio_investidores_files/figure-docx/pagina3-output-26.png" id="229" name="Picture"/>
+                    <pic:cNvPr descr="relatorio_investidores_files/figure-docx/pagina3-output-35.png" id="242" name="Picture"/>
                     <pic:cNvPicPr>
                       <a:picLocks noChangeArrowheads="1" noChangeAspect="1"/>
                     </pic:cNvPicPr>
                   </pic:nvPicPr>
                   <pic:blipFill>
-                    <a:blip r:embed="rId227"/>
+                    <a:blip r:embed="rId240"/>
                     <a:stretch>
                       <a:fillRect/>
                     </a:stretch>
@@ -11864,9 +12000,9 @@
           </wp:inline>
         </w:drawing>
       </w:r>
-      <w:bookmarkEnd w:id="230"/>
+      <w:bookmarkEnd w:id="243"/>
     </w:p>
-    <w:bookmarkStart w:id="231" w:name="pagina3-27"/>
+    <w:bookmarkStart w:id="244" w:name="pagina3-36"/>
     <w:p>
       <w:pPr>
         <w:pStyle w:val="BodyText"/>
@@ -12011,8 +12147,8 @@
         <w:t xml:space="preserve">Manter caixa sempre acima da linha vermelha</w:t>
       </w:r>
     </w:p>
-    <w:bookmarkEnd w:id="231"/>
-    <w:bookmarkStart w:id="232" w:name="pagina3-28"/>
+    <w:bookmarkEnd w:id="244"/>
+    <w:bookmarkStart w:id="245" w:name="pagina3-37"/>
     <w:tbl>
       <w:tblPr>
         <w:tblStyle w:val="Table"/>
@@ -12549,8 +12685,8 @@
         </w:tc>
       </w:tr>
     </w:tbl>
-    <w:bookmarkEnd w:id="232"/>
-    <w:bookmarkStart w:id="233" w:name="pagina3-29"/>
+    <w:bookmarkEnd w:id="245"/>
+    <w:bookmarkStart w:id="246" w:name="pagina3-38"/>
     <w:p>
       <w:pPr>
         <w:pStyle w:val="BodyText"/>
@@ -12563,8 +12699,8 @@
         <w:t xml:space="preserve">Fonte: Celulas 5A/5B | df_real_m interpolado para granularidade semanal</w:t>
       </w:r>
     </w:p>
-    <w:bookmarkEnd w:id="233"/>
-    <w:bookmarkStart w:id="234" w:name="pagina3-30"/>
+    <w:bookmarkEnd w:id="246"/>
+    <w:bookmarkStart w:id="247" w:name="pagina3-39"/>
     <w:p>
       <w:pPr>
         <w:pStyle w:val="BodyText"/>
@@ -12857,12 +12993,12 @@
         <w:t xml:space="preserve">Reserva minima para emergencias (2 semanas de despesas)</w:t>
       </w:r>
     </w:p>
-    <w:bookmarkEnd w:id="234"/>
-    <w:bookmarkStart w:id="235" w:name="pagina3-31"/>
-    <w:bookmarkEnd w:id="235"/>
-    <w:bookmarkStart w:id="236" w:name="pagina3-32"/>
-    <w:bookmarkEnd w:id="236"/>
-    <w:bookmarkStart w:id="239" w:name="pagina3-33"/>
+    <w:bookmarkEnd w:id="247"/>
+    <w:bookmarkStart w:id="248" w:name="pagina3-40"/>
+    <w:bookmarkEnd w:id="248"/>
+    <w:bookmarkStart w:id="249" w:name="pagina3-41"/>
+    <w:bookmarkEnd w:id="249"/>
+    <w:bookmarkStart w:id="252" w:name="pagina3-42"/>
     <w:tbl>
       <w:tblPr>
         <w:tblStyle w:val="Table"/>
@@ -12904,18 +13040,18 @@
                 <wp:inline>
                   <wp:extent cx="152400" cy="152400"/>
                   <wp:effectExtent b="0" l="0" r="0" t="0"/>
-                  <wp:docPr descr="" title="" id="237" name="Picture"/>
+                  <wp:docPr descr="" title="" id="250" name="Picture"/>
                   <a:graphic>
                     <a:graphicData uri="http://schemas.openxmlformats.org/drawingml/2006/picture">
                       <pic:pic>
                         <pic:nvPicPr>
-                          <pic:cNvPr descr="C:\Users\User\AppData\Local\Programs\Quarto\share\formats\docx\warning.png" id="238" name="Picture"/>
+                          <pic:cNvPr descr="C:\Users\User\AppData\Local\Programs\Quarto\share\formats\docx\warning.png" id="251" name="Picture"/>
                           <pic:cNvPicPr>
                             <a:picLocks noChangeArrowheads="1" noChangeAspect="1"/>
                           </pic:cNvPicPr>
                         </pic:nvPicPr>
                         <pic:blipFill>
-                          <a:blip r:embed="rId55"/>
+                          <a:blip r:embed="rId56"/>
                           <a:stretch>
                             <a:fillRect/>
                           </a:stretch>
@@ -13056,8 +13192,8 @@
         </w:tc>
       </w:tr>
     </w:tbl>
-    <w:bookmarkEnd w:id="239"/>
-    <w:bookmarkStart w:id="242" w:name="pagina3-34"/>
+    <w:bookmarkEnd w:id="252"/>
+    <w:bookmarkStart w:id="255" w:name="pagina3-43"/>
     <w:tbl>
       <w:tblPr>
         <w:tblStyle w:val="Table"/>
@@ -13099,18 +13235,18 @@
                 <wp:inline>
                   <wp:extent cx="152400" cy="152400"/>
                   <wp:effectExtent b="0" l="0" r="0" t="0"/>
-                  <wp:docPr descr="" title="" id="240" name="Picture"/>
+                  <wp:docPr descr="" title="" id="253" name="Picture"/>
                   <a:graphic>
                     <a:graphicData uri="http://schemas.openxmlformats.org/drawingml/2006/picture">
                       <pic:pic>
                         <pic:nvPicPr>
-                          <pic:cNvPr descr="C:\Users\User\AppData\Local\Programs\Quarto\share\formats\docx\note.png" id="241" name="Picture"/>
+                          <pic:cNvPr descr="C:\Users\User\AppData\Local\Programs\Quarto\share\formats\docx\note.png" id="254" name="Picture"/>
                           <pic:cNvPicPr>
                             <a:picLocks noChangeArrowheads="1" noChangeAspect="1"/>
                           </pic:cNvPicPr>
                         </pic:nvPicPr>
                         <pic:blipFill>
-                          <a:blip r:embed="rId63"/>
+                          <a:blip r:embed="rId64"/>
                           <a:stretch>
                             <a:fillRect/>
                           </a:stretch>
@@ -13217,29 +13353,70 @@
         </w:tc>
       </w:tr>
     </w:tbl>
-    <w:bookmarkEnd w:id="242"/>
+    <w:bookmarkEnd w:id="255"/>
+    <w:bookmarkStart w:id="256" w:name="pagina3-44"/>
+    <w:p>
+      <w:r>
+        <w:pict>
+          <v:rect style="width:0;height:1.5pt" o:hralign="center" o:hrstd="t" o:hr="t"/>
+        </w:pict>
+      </w:r>
+    </w:p>
+    <w:bookmarkEnd w:id="256"/>
+    <w:bookmarkStart w:id="258" w:name="pagina3-45"/>
+    <w:bookmarkStart w:id="257" w:name="viz-3.4-alavancagem-operacional"/>
+    <w:p>
+      <w:pPr>
+        <w:pStyle w:val="Heading2"/>
+      </w:pPr>
+      <w:r>
+        <w:t xml:space="preserve">VIZ 3.4: Alavancagem Operacional</w:t>
+      </w:r>
+    </w:p>
+    <w:bookmarkEnd w:id="257"/>
+    <w:bookmarkEnd w:id="258"/>
+    <w:bookmarkStart w:id="259" w:name="pagina3-46"/>
+    <w:p>
+      <w:pPr>
+        <w:pStyle w:val="FirstParagraph"/>
+      </w:pPr>
+      <w:r>
+        <w:rPr>
+          <w:b/>
+          <w:bCs/>
+        </w:rPr>
+        <w:t xml:space="preserve">Pergunta:</w:t>
+      </w:r>
+      <w:r>
+        <w:t xml:space="preserve"> </w:t>
+      </w:r>
+      <w:r>
+        <w:t xml:space="preserve">A empresa escala de forma eficiente?</w:t>
+      </w:r>
+    </w:p>
+    <w:bookmarkEnd w:id="259"/>
     <w:p>
       <w:pPr>
         <w:pStyle w:val="BodyText"/>
       </w:pPr>
-      <w:bookmarkStart w:id="246" w:name="pagina3-35"/>
+      <w:bookmarkStart w:id="263" w:name="pagina3-47"/>
       <w:r>
         <w:drawing>
           <wp:inline>
             <wp:extent cx="5334000" cy="2968924"/>
             <wp:effectExtent b="0" l="0" r="0" t="0"/>
-            <wp:docPr descr="" title="" id="244" name="Picture"/>
+            <wp:docPr descr="" title="" id="261" name="Picture"/>
             <a:graphic>
               <a:graphicData uri="http://schemas.openxmlformats.org/drawingml/2006/picture">
                 <pic:pic>
                   <pic:nvPicPr>
-                    <pic:cNvPr descr="relatorio_investidores_files/figure-docx/pagina3-output-35.png" id="245" name="Picture"/>
+                    <pic:cNvPr descr="relatorio_investidores_files/figure-docx/pagina3-output-47.png" id="262" name="Picture"/>
                     <pic:cNvPicPr>
                       <a:picLocks noChangeArrowheads="1" noChangeAspect="1"/>
                     </pic:cNvPicPr>
                   </pic:nvPicPr>
                   <pic:blipFill>
-                    <a:blip r:embed="rId243"/>
+                    <a:blip r:embed="rId260"/>
                     <a:stretch>
                       <a:fillRect/>
                     </a:stretch>
@@ -13265,9 +13442,9 @@
           </wp:inline>
         </w:drawing>
       </w:r>
-      <w:bookmarkEnd w:id="246"/>
+      <w:bookmarkEnd w:id="263"/>
     </w:p>
-    <w:bookmarkStart w:id="247" w:name="pagina3-36"/>
+    <w:bookmarkStart w:id="264" w:name="pagina3-48"/>
     <w:p>
       <w:pPr>
         <w:pStyle w:val="BodyText"/>
@@ -13638,10 +13815,10 @@
         <w:t xml:space="preserve">Lucro operacional dividido pela receita, em percentual</w:t>
       </w:r>
     </w:p>
-    <w:bookmarkEnd w:id="247"/>
-    <w:bookmarkStart w:id="248" w:name="pagina3-37"/>
-    <w:bookmarkEnd w:id="248"/>
-    <w:bookmarkStart w:id="251" w:name="pagina3-38"/>
+    <w:bookmarkEnd w:id="264"/>
+    <w:bookmarkStart w:id="265" w:name="pagina3-49"/>
+    <w:bookmarkEnd w:id="265"/>
+    <w:bookmarkStart w:id="268" w:name="pagina3-50"/>
     <w:tbl>
       <w:tblPr>
         <w:tblStyle w:val="Table"/>
@@ -13683,18 +13860,18 @@
                 <wp:inline>
                   <wp:extent cx="152400" cy="152400"/>
                   <wp:effectExtent b="0" l="0" r="0" t="0"/>
-                  <wp:docPr descr="" title="" id="249" name="Picture"/>
+                  <wp:docPr descr="" title="" id="266" name="Picture"/>
                   <a:graphic>
                     <a:graphicData uri="http://schemas.openxmlformats.org/drawingml/2006/picture">
                       <pic:pic>
                         <pic:nvPicPr>
-                          <pic:cNvPr descr="C:\Users\User\AppData\Local\Programs\Quarto\share\formats\docx\tip.png" id="250" name="Picture"/>
+                          <pic:cNvPr descr="C:\Users\User\AppData\Local\Programs\Quarto\share\formats\docx\tip.png" id="267" name="Picture"/>
                           <pic:cNvPicPr>
                             <a:picLocks noChangeArrowheads="1" noChangeAspect="1"/>
                           </pic:cNvPicPr>
                         </pic:nvPicPr>
                         <pic:blipFill>
-                          <a:blip r:embed="rId51"/>
+                          <a:blip r:embed="rId52"/>
                           <a:stretch>
                             <a:fillRect/>
                           </a:stretch>
@@ -13835,8 +14012,8 @@
         </w:tc>
       </w:tr>
     </w:tbl>
-    <w:bookmarkEnd w:id="251"/>
-    <w:bookmarkStart w:id="254" w:name="pagina3-39"/>
+    <w:bookmarkEnd w:id="268"/>
+    <w:bookmarkStart w:id="271" w:name="pagina3-51"/>
     <w:tbl>
       <w:tblPr>
         <w:tblStyle w:val="Table"/>
@@ -13878,18 +14055,18 @@
                 <wp:inline>
                   <wp:extent cx="152400" cy="152400"/>
                   <wp:effectExtent b="0" l="0" r="0" t="0"/>
-                  <wp:docPr descr="" title="" id="252" name="Picture"/>
+                  <wp:docPr descr="" title="" id="269" name="Picture"/>
                   <a:graphic>
                     <a:graphicData uri="http://schemas.openxmlformats.org/drawingml/2006/picture">
                       <pic:pic>
                         <pic:nvPicPr>
-                          <pic:cNvPr descr="C:\Users\User\AppData\Local\Programs\Quarto\share\formats\docx\note.png" id="253" name="Picture"/>
+                          <pic:cNvPr descr="C:\Users\User\AppData\Local\Programs\Quarto\share\formats\docx\note.png" id="270" name="Picture"/>
                           <pic:cNvPicPr>
                             <a:picLocks noChangeArrowheads="1" noChangeAspect="1"/>
                           </pic:cNvPicPr>
                         </pic:nvPicPr>
                         <pic:blipFill>
-                          <a:blip r:embed="rId63"/>
+                          <a:blip r:embed="rId64"/>
                           <a:stretch>
                             <a:fillRect/>
                           </a:stretch>
@@ -13996,29 +14173,70 @@
         </w:tc>
       </w:tr>
     </w:tbl>
-    <w:bookmarkEnd w:id="254"/>
+    <w:bookmarkEnd w:id="271"/>
+    <w:bookmarkStart w:id="272" w:name="pagina3-52"/>
+    <w:p>
+      <w:r>
+        <w:pict>
+          <v:rect style="width:0;height:1.5pt" o:hralign="center" o:hrstd="t" o:hr="t"/>
+        </w:pict>
+      </w:r>
+    </w:p>
+    <w:bookmarkEnd w:id="272"/>
+    <w:bookmarkStart w:id="274" w:name="pagina3-53"/>
+    <w:bookmarkStart w:id="273" w:name="viz-3.5-evolucao-dre---real-vs-ideal"/>
+    <w:p>
+      <w:pPr>
+        <w:pStyle w:val="Heading2"/>
+      </w:pPr>
+      <w:r>
+        <w:t xml:space="preserve">VIZ 3.5: Evolucao DRE - Real vs Ideal</w:t>
+      </w:r>
+    </w:p>
+    <w:bookmarkEnd w:id="273"/>
+    <w:bookmarkEnd w:id="274"/>
+    <w:bookmarkStart w:id="275" w:name="pagina3-54"/>
+    <w:p>
+      <w:pPr>
+        <w:pStyle w:val="FirstParagraph"/>
+      </w:pPr>
+      <w:r>
+        <w:rPr>
+          <w:b/>
+          <w:bCs/>
+        </w:rPr>
+        <w:t xml:space="preserve">Pergunta:</w:t>
+      </w:r>
+      <w:r>
+        <w:t xml:space="preserve"> </w:t>
+      </w:r>
+      <w:r>
+        <w:t xml:space="preserve">Estamos convergindo para o cenario ideal?</w:t>
+      </w:r>
+    </w:p>
+    <w:bookmarkEnd w:id="275"/>
     <w:p>
       <w:pPr>
         <w:pStyle w:val="BodyText"/>
       </w:pPr>
-      <w:bookmarkStart w:id="258" w:name="pagina3-40"/>
+      <w:bookmarkStart w:id="279" w:name="pagina3-55"/>
       <w:r>
         <w:drawing>
           <wp:inline>
             <wp:extent cx="5334000" cy="2282594"/>
             <wp:effectExtent b="0" l="0" r="0" t="0"/>
-            <wp:docPr descr="" title="" id="256" name="Picture"/>
+            <wp:docPr descr="" title="" id="277" name="Picture"/>
             <a:graphic>
               <a:graphicData uri="http://schemas.openxmlformats.org/drawingml/2006/picture">
                 <pic:pic>
                   <pic:nvPicPr>
-                    <pic:cNvPr descr="relatorio_investidores_files/figure-docx/pagina3-output-40.png" id="257" name="Picture"/>
+                    <pic:cNvPr descr="relatorio_investidores_files/figure-docx/pagina3-output-55.png" id="278" name="Picture"/>
                     <pic:cNvPicPr>
                       <a:picLocks noChangeArrowheads="1" noChangeAspect="1"/>
                     </pic:cNvPicPr>
                   </pic:nvPicPr>
                   <pic:blipFill>
-                    <a:blip r:embed="rId255"/>
+                    <a:blip r:embed="rId276"/>
                     <a:stretch>
                       <a:fillRect/>
                     </a:stretch>
@@ -14044,9 +14262,9 @@
           </wp:inline>
         </w:drawing>
       </w:r>
-      <w:bookmarkEnd w:id="258"/>
+      <w:bookmarkEnd w:id="279"/>
     </w:p>
-    <w:bookmarkStart w:id="259" w:name="pagina3-41"/>
+    <w:bookmarkStart w:id="280" w:name="pagina3-56"/>
     <w:p>
       <w:pPr>
         <w:pStyle w:val="BodyText"/>
@@ -14247,10 +14465,10 @@
         <w:t xml:space="preserve">.</w:t>
       </w:r>
     </w:p>
-    <w:bookmarkEnd w:id="259"/>
-    <w:bookmarkStart w:id="260" w:name="pagina3-42"/>
-    <w:bookmarkEnd w:id="260"/>
-    <w:bookmarkStart w:id="263" w:name="pagina3-43"/>
+    <w:bookmarkEnd w:id="280"/>
+    <w:bookmarkStart w:id="281" w:name="pagina3-57"/>
+    <w:bookmarkEnd w:id="281"/>
+    <w:bookmarkStart w:id="284" w:name="pagina3-58"/>
     <w:tbl>
       <w:tblPr>
         <w:tblStyle w:val="Table"/>
@@ -14292,18 +14510,18 @@
                 <wp:inline>
                   <wp:extent cx="152400" cy="152400"/>
                   <wp:effectExtent b="0" l="0" r="0" t="0"/>
-                  <wp:docPr descr="" title="" id="261" name="Picture"/>
+                  <wp:docPr descr="" title="" id="282" name="Picture"/>
                   <a:graphic>
                     <a:graphicData uri="http://schemas.openxmlformats.org/drawingml/2006/picture">
                       <pic:pic>
                         <pic:nvPicPr>
-                          <pic:cNvPr descr="C:\Users\User\AppData\Local\Programs\Quarto\share\formats\docx\note.png" id="262" name="Picture"/>
+                          <pic:cNvPr descr="C:\Users\User\AppData\Local\Programs\Quarto\share\formats\docx\note.png" id="283" name="Picture"/>
                           <pic:cNvPicPr>
                             <a:picLocks noChangeArrowheads="1" noChangeAspect="1"/>
                           </pic:cNvPicPr>
                         </pic:nvPicPr>
                         <pic:blipFill>
-                          <a:blip r:embed="rId63"/>
+                          <a:blip r:embed="rId64"/>
                           <a:stretch>
                             <a:fillRect/>
                           </a:stretch>
@@ -14444,8 +14662,8 @@
         </w:tc>
       </w:tr>
     </w:tbl>
-    <w:bookmarkEnd w:id="263"/>
-    <w:bookmarkStart w:id="266" w:name="pagina3-44"/>
+    <w:bookmarkEnd w:id="284"/>
+    <w:bookmarkStart w:id="287" w:name="pagina3-59"/>
     <w:tbl>
       <w:tblPr>
         <w:tblStyle w:val="Table"/>
@@ -14487,18 +14705,18 @@
                 <wp:inline>
                   <wp:extent cx="152400" cy="152400"/>
                   <wp:effectExtent b="0" l="0" r="0" t="0"/>
-                  <wp:docPr descr="" title="" id="264" name="Picture"/>
+                  <wp:docPr descr="" title="" id="285" name="Picture"/>
                   <a:graphic>
                     <a:graphicData uri="http://schemas.openxmlformats.org/drawingml/2006/picture">
                       <pic:pic>
                         <pic:nvPicPr>
-                          <pic:cNvPr descr="C:\Users\User\AppData\Local\Programs\Quarto\share\formats\docx\note.png" id="265" name="Picture"/>
+                          <pic:cNvPr descr="C:\Users\User\AppData\Local\Programs\Quarto\share\formats\docx\note.png" id="286" name="Picture"/>
                           <pic:cNvPicPr>
                             <a:picLocks noChangeArrowheads="1" noChangeAspect="1"/>
                           </pic:cNvPicPr>
                         </pic:nvPicPr>
                         <pic:blipFill>
-                          <a:blip r:embed="rId63"/>
+                          <a:blip r:embed="rId64"/>
                           <a:stretch>
                             <a:fillRect/>
                           </a:stretch>
@@ -14605,8 +14823,8 @@
         </w:tc>
       </w:tr>
     </w:tbl>
-    <w:bookmarkEnd w:id="266"/>
-    <w:bookmarkStart w:id="269" w:name="pagina3-45"/>
+    <w:bookmarkEnd w:id="287"/>
+    <w:bookmarkStart w:id="290" w:name="pagina3-60"/>
     <w:tbl>
       <w:tblPr>
         <w:tblStyle w:val="Table"/>
@@ -14648,18 +14866,18 @@
                 <wp:inline>
                   <wp:extent cx="152400" cy="152400"/>
                   <wp:effectExtent b="0" l="0" r="0" t="0"/>
-                  <wp:docPr descr="" title="" id="267" name="Picture"/>
+                  <wp:docPr descr="" title="" id="288" name="Picture"/>
                   <a:graphic>
                     <a:graphicData uri="http://schemas.openxmlformats.org/drawingml/2006/picture">
                       <pic:pic>
                         <pic:nvPicPr>
-                          <pic:cNvPr descr="C:\Users\User\AppData\Local\Programs\Quarto\share\formats\docx\important.png" id="268" name="Picture"/>
+                          <pic:cNvPr descr="C:\Users\User\AppData\Local\Programs\Quarto\share\formats\docx\important.png" id="289" name="Picture"/>
                           <pic:cNvPicPr>
                             <a:picLocks noChangeArrowheads="1" noChangeAspect="1"/>
                           </pic:cNvPicPr>
                         </pic:nvPicPr>
                         <pic:blipFill>
-                          <a:blip r:embed="rId59"/>
+                          <a:blip r:embed="rId60"/>
                           <a:stretch>
                             <a:fillRect/>
                           </a:stretch>
@@ -14874,8 +15092,8 @@
         </w:tc>
       </w:tr>
     </w:tbl>
-    <w:bookmarkEnd w:id="269"/>
-    <w:bookmarkEnd w:id="270"/>
+    <w:bookmarkEnd w:id="290"/>
+    <w:bookmarkEnd w:id="291"/>
     <w:sectPr>
       <w:footnotePr>
         <w:numRestart w:val="eachSect"/>

</xml_diff>